<commit_message>
Revisa documento de ferramentas: remove sumário e referências ao estudo anterior
O documento passa a ser autocontido, sem citar o estudo comparativo de
assinatura digital como fonte externa (o conteúdo já foi incorporado
diretamente). A tabela de custo geral mantém apenas os itens que
efetivamente geram despesa recorrente (hospedagem e WhatsApp
automático); os itens sem custo adicional (assinatura própria,
identificadores, Dental Office, Eduq) passam a ser mencionados em texto
corrido. Um valor final estimado (R$ 80 a R$ 200/mês) é destacado ao
final da seção.

Co-Authored-By: Claude Sonnet 5 <noreply@anthropic.com>
Claude-Session: https://claude.ai/code/session_01LKpPt4V7vznxtyPAXk2bEe
</commit_message>
<xml_diff>
--- a/docs/Ferramentas-Painel-ABO-Goias.docx
+++ b/docs/Ferramentas-Painel-ABO-Goias.docx
@@ -117,284 +117,31 @@
           <w:sz w:val="30"/>
           <w:szCs w:val="30"/>
         </w:rPr>
-        <w:t xml:space="preserve">Sumário</w:t>
-      </w:r>
-    </w:p>
-    <w:p>
-      <w:pPr>
-        <w:pStyle w:val="ListParagraph"/>
-        <w:numPr>
-          <w:ilvl w:val="0"/>
-          <w:numId w:val="2"/>
-        </w:numPr>
-        <w:spacing w:after="80" w:line="290"/>
-      </w:pPr>
-      <w:r>
-        <w:rPr>
-          <w:sz w:val="21"/>
-          <w:szCs w:val="21"/>
-        </w:rPr>
         <w:t xml:space="preserve">1. Visão geral do Painel</w:t>
       </w:r>
     </w:p>
     <w:p>
       <w:pPr>
-        <w:pStyle w:val="ListParagraph"/>
-        <w:numPr>
-          <w:ilvl w:val="0"/>
-          <w:numId w:val="2"/>
-        </w:numPr>
-        <w:spacing w:after="80" w:line="290"/>
-      </w:pPr>
-      <w:r>
-        <w:rPr>
-          <w:sz w:val="21"/>
-          <w:szCs w:val="21"/>
-        </w:rPr>
-        <w:t xml:space="preserve">2. Ferramentas implementadas</w:t>
-      </w:r>
-    </w:p>
-    <w:p>
-      <w:pPr>
-        <w:pStyle w:val="ListParagraph"/>
-        <w:numPr>
-          <w:ilvl w:val="0"/>
-          <w:numId w:val="2"/>
-        </w:numPr>
-        <w:spacing w:after="80" w:line="290"/>
-      </w:pPr>
-      <w:r>
-        <w:rPr>
-          <w:sz w:val="21"/>
-          <w:szCs w:val="21"/>
-        </w:rPr>
-        <w:t xml:space="preserve">     2.1. Portal e Acesso</w:t>
-      </w:r>
-    </w:p>
-    <w:p>
-      <w:pPr>
-        <w:pStyle w:val="ListParagraph"/>
-        <w:numPr>
-          <w:ilvl w:val="0"/>
-          <w:numId w:val="2"/>
-        </w:numPr>
-        <w:spacing w:after="80" w:line="290"/>
-      </w:pPr>
-      <w:r>
-        <w:rPr>
-          <w:sz w:val="21"/>
-          <w:szCs w:val="21"/>
-        </w:rPr>
-        <w:t xml:space="preserve">     2.2. Gestão de CME (Central de Materiais e Esterilização)</w:t>
-      </w:r>
-    </w:p>
-    <w:p>
-      <w:pPr>
-        <w:pStyle w:val="ListParagraph"/>
-        <w:numPr>
-          <w:ilvl w:val="0"/>
-          <w:numId w:val="2"/>
-        </w:numPr>
-        <w:spacing w:after="80" w:line="290"/>
-      </w:pPr>
-      <w:r>
-        <w:rPr>
-          <w:sz w:val="21"/>
-          <w:szCs w:val="21"/>
-        </w:rPr>
-        <w:t xml:space="preserve">     2.3. Gestão de Laboratório</w:t>
-      </w:r>
-    </w:p>
-    <w:p>
-      <w:pPr>
-        <w:pStyle w:val="ListParagraph"/>
-        <w:numPr>
-          <w:ilvl w:val="0"/>
-          <w:numId w:val="2"/>
-        </w:numPr>
-        <w:spacing w:after="80" w:line="290"/>
-      </w:pPr>
-      <w:r>
-        <w:rPr>
-          <w:sz w:val="21"/>
-          <w:szCs w:val="21"/>
-        </w:rPr>
-        <w:t xml:space="preserve">     2.4. Gerador de Identificadores de Bancada</w:t>
-      </w:r>
-    </w:p>
-    <w:p>
-      <w:pPr>
-        <w:pStyle w:val="ListParagraph"/>
-        <w:numPr>
-          <w:ilvl w:val="0"/>
-          <w:numId w:val="2"/>
-        </w:numPr>
-        <w:spacing w:after="80" w:line="290"/>
-      </w:pPr>
-      <w:r>
-        <w:rPr>
-          <w:sz w:val="21"/>
-          <w:szCs w:val="21"/>
-        </w:rPr>
-        <w:t xml:space="preserve">     2.5. Gerador de Contratos e Termos de Consentimento</w:t>
-      </w:r>
-    </w:p>
-    <w:p>
-      <w:pPr>
-        <w:pStyle w:val="ListParagraph"/>
-        <w:numPr>
-          <w:ilvl w:val="0"/>
-          <w:numId w:val="2"/>
-        </w:numPr>
-        <w:spacing w:after="80" w:line="290"/>
-      </w:pPr>
-      <w:r>
-        <w:rPr>
-          <w:sz w:val="21"/>
-          <w:szCs w:val="21"/>
-        </w:rPr>
-        <w:t xml:space="preserve">3. Assinatura digital no Gerador de Contratos</w:t>
-      </w:r>
-    </w:p>
-    <w:p>
-      <w:pPr>
-        <w:pStyle w:val="ListParagraph"/>
-        <w:numPr>
-          <w:ilvl w:val="0"/>
-          <w:numId w:val="2"/>
-        </w:numPr>
-        <w:spacing w:after="80" w:line="290"/>
-      </w:pPr>
-      <w:r>
-        <w:rPr>
-          <w:sz w:val="21"/>
-          <w:szCs w:val="21"/>
-        </w:rPr>
-        <w:t xml:space="preserve">     3.1. Diagnóstico da solução atual</w:t>
-      </w:r>
-    </w:p>
-    <w:p>
-      <w:pPr>
-        <w:pStyle w:val="ListParagraph"/>
-        <w:numPr>
-          <w:ilvl w:val="0"/>
-          <w:numId w:val="2"/>
-        </w:numPr>
-        <w:spacing w:after="80" w:line="290"/>
-      </w:pPr>
-      <w:r>
-        <w:rPr>
-          <w:sz w:val="21"/>
-          <w:szCs w:val="21"/>
-        </w:rPr>
-        <w:t xml:space="preserve">     3.2. Como o sistema valida um documento</w:t>
-      </w:r>
-    </w:p>
-    <w:p>
-      <w:pPr>
-        <w:pStyle w:val="ListParagraph"/>
-        <w:numPr>
-          <w:ilvl w:val="0"/>
-          <w:numId w:val="2"/>
-        </w:numPr>
-        <w:spacing w:after="80" w:line="290"/>
-      </w:pPr>
-      <w:r>
-        <w:rPr>
-          <w:sz w:val="21"/>
-          <w:szCs w:val="21"/>
-        </w:rPr>
-        <w:t xml:space="preserve">     3.3. Tipos de assinatura eletrônica no Brasil</w:t>
-      </w:r>
-    </w:p>
-    <w:p>
-      <w:pPr>
-        <w:pStyle w:val="ListParagraph"/>
-        <w:numPr>
-          <w:ilvl w:val="0"/>
-          <w:numId w:val="2"/>
-        </w:numPr>
-        <w:spacing w:after="80" w:line="290"/>
-      </w:pPr>
-      <w:r>
-        <w:rPr>
-          <w:sz w:val="21"/>
-          <w:szCs w:val="21"/>
-        </w:rPr>
-        <w:t xml:space="preserve">     3.4. Comparação com plataformas do mercado</w:t>
-      </w:r>
-    </w:p>
-    <w:p>
-      <w:pPr>
-        <w:pStyle w:val="ListParagraph"/>
-        <w:numPr>
-          <w:ilvl w:val="0"/>
-          <w:numId w:val="2"/>
-        </w:numPr>
-        <w:spacing w:after="80" w:line="290"/>
-      </w:pPr>
-      <w:r>
-        <w:rPr>
-          <w:sz w:val="21"/>
-          <w:szCs w:val="21"/>
-        </w:rPr>
-        <w:t xml:space="preserve">     3.5. Por que a solução atual não usa uma dessas plataformas</w:t>
-      </w:r>
-    </w:p>
-    <w:p>
-      <w:pPr>
-        <w:pStyle w:val="ListParagraph"/>
-        <w:numPr>
-          <w:ilvl w:val="0"/>
-          <w:numId w:val="2"/>
-        </w:numPr>
-        <w:spacing w:after="80" w:line="290"/>
-      </w:pPr>
-      <w:r>
-        <w:rPr>
-          <w:sz w:val="21"/>
-          <w:szCs w:val="21"/>
-        </w:rPr>
-        <w:t xml:space="preserve">     3.6. Recomendação: qual plataforma adotar, se um dia for necessário</w:t>
-      </w:r>
-    </w:p>
-    <w:p>
-      <w:pPr>
-        <w:pStyle w:val="ListParagraph"/>
-        <w:numPr>
-          <w:ilvl w:val="0"/>
-          <w:numId w:val="2"/>
-        </w:numPr>
-        <w:spacing w:after="80" w:line="290"/>
-      </w:pPr>
-      <w:r>
-        <w:rPr>
-          <w:sz w:val="21"/>
-          <w:szCs w:val="21"/>
-        </w:rPr>
-        <w:t xml:space="preserve">4. Custo geral de todas as ferramentas</w:t>
-      </w:r>
-    </w:p>
-    <w:p>
-      <w:pPr>
-        <w:pStyle w:val="ListParagraph"/>
-        <w:numPr>
-          <w:ilvl w:val="0"/>
-          <w:numId w:val="2"/>
-        </w:numPr>
-        <w:spacing w:after="80" w:line="290"/>
-      </w:pPr>
-      <w:r>
-        <w:rPr>
-          <w:sz w:val="21"/>
-          <w:szCs w:val="21"/>
-        </w:rPr>
-        <w:t xml:space="preserve">Fontes</w:t>
-      </w:r>
-    </w:p>
-    <w:p>
-      <w:r>
-        <w:br w:type="page"/>
+        <w:spacing w:after="160" w:line="300"/>
+      </w:pPr>
+      <w:r>
+        <w:rPr>
+          <w:sz w:val="21"/>
+          <w:szCs w:val="21"/>
+        </w:rPr>
+        <w:t xml:space="preserve">O Painel ABO Goiás é um sistema único, acessado com um só login, que reúne as ferramentas usadas no dia a dia da clínica-escola da Associação Brasileira de Odontologia — Regional Goiás. Cada ferramenta cuida de uma parte diferente da rotina — do controle de materiais esterilizados à geração e assinatura de contratos com os pacientes — mas todas compartilham a mesma identidade visual, o mesmo cadastro de usuários e a mesma tela inicial (Portal).</w:t>
+      </w:r>
+    </w:p>
+    <w:p>
+      <w:pPr>
+        <w:spacing w:after="160" w:line="300"/>
+      </w:pPr>
+      <w:r>
+        <w:rPr>
+          <w:sz w:val="21"/>
+          <w:szCs w:val="21"/>
+        </w:rPr>
+        <w:t xml:space="preserve">Todas as ferramentas descritas neste documento foram desenvolvidas internamente (sob medida para a rotina da clínica), o que significa que não há mensalidade de licença para o sistema em si — o Painel roda em um servidor próprio e só recorre a serviços externos pagos em pontos pontuais e claramente identificados (seção 4).</w:t>
       </w:r>
     </w:p>
     <w:p>
@@ -413,7 +160,23 @@
           <w:sz w:val="30"/>
           <w:szCs w:val="30"/>
         </w:rPr>
-        <w:t xml:space="preserve">1. Visão geral do Painel</w:t>
+        <w:t xml:space="preserve">2. Ferramentas implementadas</w:t>
+      </w:r>
+    </w:p>
+    <w:p>
+      <w:pPr>
+        <w:pStyle w:val="Heading2"/>
+        <w:spacing w:after="120" w:before="260"/>
+      </w:pPr>
+      <w:r>
+        <w:rPr>
+          <w:b/>
+          <w:bCs/>
+          <w:color w:val="0B2A57"/>
+          <w:sz w:val="25"/>
+          <w:szCs w:val="25"/>
+        </w:rPr>
+        <w:t xml:space="preserve">2.1. Portal e Acesso</w:t>
       </w:r>
     </w:p>
     <w:p>
@@ -425,7 +188,7 @@
           <w:sz w:val="21"/>
           <w:szCs w:val="21"/>
         </w:rPr>
-        <w:t xml:space="preserve">O Painel ABO Goiás é um sistema único, acessado com um só login, que reúne as ferramentas usadas no dia a dia da clínica-escola da Associação Brasileira de Odontologia — Regional Goiás. Cada ferramenta cuida de uma parte diferente da rotina — do controle de materiais esterilizados à geração e assinatura de contratos com os pacientes — mas todas compartilham a mesma identidade visual, o mesmo cadastro de usuários e a mesma tela inicial (Portal).</w:t>
+        <w:t xml:space="preserve">O que é: a porta de entrada do sistema. É onde qualquer colaborador faz login e vê, em uma única tela, um resumo em números e o acesso às demais ferramentas.</w:t>
       </w:r>
     </w:p>
     <w:p>
@@ -437,7 +200,172 @@
           <w:sz w:val="21"/>
           <w:szCs w:val="21"/>
         </w:rPr>
-        <w:t xml:space="preserve">Todas as ferramentas descritas neste documento foram desenvolvidas internamente (sob medida para a rotina da clínica), o que significa que não há mensalidade de licença para o sistema em si — o Painel roda em um servidor próprio e só recorre a serviços externos pagos em pontos pontuais e claramente identificados (seção 4).</w:t>
+        <w:t xml:space="preserve">Contexto de uso: usado por todos os colaboradores, todos os dias, como primeira tela ao entrar no sistema. É também onde um novo colaborador solicita acesso — pedido que é aprovado ou recusado por um administrador antes de a conta ser liberada.</w:t>
+      </w:r>
+    </w:p>
+    <w:p>
+      <w:pPr>
+        <w:pStyle w:val="Heading2"/>
+        <w:spacing w:after="120" w:before="260"/>
+      </w:pPr>
+      <w:r>
+        <w:rPr>
+          <w:b/>
+          <w:bCs/>
+          <w:color w:val="0B2A57"/>
+          <w:sz w:val="25"/>
+          <w:szCs w:val="25"/>
+        </w:rPr>
+        <w:t xml:space="preserve">2.2. Gestão de CME (Central de Materiais e Esterilização)</w:t>
+      </w:r>
+    </w:p>
+    <w:p>
+      <w:pPr>
+        <w:spacing w:after="160" w:line="300"/>
+      </w:pPr>
+      <w:r>
+        <w:rPr>
+          <w:sz w:val="21"/>
+          <w:szCs w:val="21"/>
+        </w:rPr>
+        <w:t xml:space="preserve">O que é: controla o ciclo de vida dos pacotes de instrumentais odontológicos que os alunos de pós-graduação entregam para esterilização — da entrada até a devolução — além do empréstimo avulso de kits de materiais e do cadastro de turmas e alunos (sincronizado automaticamente do sistema acadêmico Eduq).</w:t>
+      </w:r>
+    </w:p>
+    <w:p>
+      <w:pPr>
+        <w:spacing w:after="160" w:line="300"/>
+      </w:pPr>
+      <w:r>
+        <w:rPr>
+          <w:sz w:val="21"/>
+          <w:szCs w:val="21"/>
+        </w:rPr>
+        <w:t xml:space="preserve">Contexto de uso: usado pela equipe da CME e pelos alunos de pós-graduação. O aluno entrega um pacote de instrumentais para esterilizar; a equipe registra a entrada, acompanha o processo e registra a retirada quando o aluno busca o material de volta. O mesmo aluno também pode retirar kits de material emprestado, que precisam ser devolvidos depois.</w:t>
+      </w:r>
+    </w:p>
+    <w:p>
+      <w:pPr>
+        <w:pStyle w:val="Heading2"/>
+        <w:spacing w:after="120" w:before="260"/>
+      </w:pPr>
+      <w:r>
+        <w:rPr>
+          <w:b/>
+          <w:bCs/>
+          <w:color w:val="0B2A57"/>
+          <w:sz w:val="25"/>
+          <w:szCs w:val="25"/>
+        </w:rPr>
+        <w:t xml:space="preserve">2.3. Gestão de Laboratório</w:t>
+      </w:r>
+    </w:p>
+    <w:p>
+      <w:pPr>
+        <w:spacing w:after="160" w:line="300"/>
+      </w:pPr>
+      <w:r>
+        <w:rPr>
+          <w:sz w:val="21"/>
+          <w:szCs w:val="21"/>
+        </w:rPr>
+        <w:t xml:space="preserve">O que é: controla os pedidos de material odontológico (próteses, aparelhos etc.) enviados a laboratórios parceiros externos — do registro do pedido até a entrega da peça pronta e o fechamento financeiro com o paciente e o laboratório.</w:t>
+      </w:r>
+    </w:p>
+    <w:p>
+      <w:pPr>
+        <w:spacing w:after="160" w:line="300"/>
+      </w:pPr>
+      <w:r>
+        <w:rPr>
+          <w:sz w:val="21"/>
+          <w:szCs w:val="21"/>
+        </w:rPr>
+        <w:t xml:space="preserve">Contexto de uso: usado pelos coordenadores dos laboratórios da clínica-escola. Um aluno faz a moldagem do paciente; o coordenador registra o pedido ao laboratório parceiro, acompanha o prazo de entrega e, quando a peça chega, controla o faturamento — quem já pagou, o paciente e/ou o laboratório.</w:t>
+      </w:r>
+    </w:p>
+    <w:p>
+      <w:pPr>
+        <w:pStyle w:val="Heading2"/>
+        <w:spacing w:after="120" w:before="260"/>
+      </w:pPr>
+      <w:r>
+        <w:rPr>
+          <w:b/>
+          <w:bCs/>
+          <w:color w:val="0B2A57"/>
+          <w:sz w:val="25"/>
+          <w:szCs w:val="25"/>
+        </w:rPr>
+        <w:t xml:space="preserve">2.4. Gerador de Identificadores de Bancada</w:t>
+      </w:r>
+    </w:p>
+    <w:p>
+      <w:pPr>
+        <w:spacing w:after="160" w:line="300"/>
+      </w:pPr>
+      <w:r>
+        <w:rPr>
+          <w:sz w:val="21"/>
+          <w:szCs w:val="21"/>
+        </w:rPr>
+        <w:t xml:space="preserve">O que é: gera, em poucos cliques, um arquivo de apresentação (PowerPoint) pronto para impressão com os identificadores (crachás) de bancada de uma turma inteira de alunos — nome, matrícula e demais dados, no modelo visual escolhido.</w:t>
+      </w:r>
+    </w:p>
+    <w:p>
+      <w:pPr>
+        <w:spacing w:after="160" w:line="300"/>
+      </w:pPr>
+      <w:r>
+        <w:rPr>
+          <w:sz w:val="21"/>
+          <w:szCs w:val="21"/>
+        </w:rPr>
+        <w:t xml:space="preserve">Contexto de uso: usado pela coordenação acadêmica no início de cada período letivo, ou quando entra um aluno novo. Basta escolher a turma — os dados dos alunos vêm automaticamente do sistema acadêmico Eduq — e o modelo de identificador entre os disponíveis, e o arquivo já sai pronto para impressão.</w:t>
+      </w:r>
+    </w:p>
+    <w:p>
+      <w:pPr>
+        <w:pStyle w:val="Heading2"/>
+        <w:spacing w:after="120" w:before="260"/>
+      </w:pPr>
+      <w:r>
+        <w:rPr>
+          <w:b/>
+          <w:bCs/>
+          <w:color w:val="0B2A57"/>
+          <w:sz w:val="25"/>
+          <w:szCs w:val="25"/>
+        </w:rPr>
+        <w:t xml:space="preserve">2.5. Gerador de Contratos e Termos de Consentimento</w:t>
+      </w:r>
+    </w:p>
+    <w:p>
+      <w:pPr>
+        <w:spacing w:after="160" w:line="300"/>
+      </w:pPr>
+      <w:r>
+        <w:rPr>
+          <w:sz w:val="21"/>
+          <w:szCs w:val="21"/>
+        </w:rPr>
+        <w:t xml:space="preserve">O que é: gera contratos e termos de consentimento odontológico personalizados para cada paciente e conduz a assinatura digital do documento, sem precisar de papel nem de outro programa.</w:t>
+      </w:r>
+    </w:p>
+    <w:p>
+      <w:pPr>
+        <w:spacing w:after="160" w:line="300"/>
+      </w:pPr>
+      <w:r>
+        <w:rPr>
+          <w:sz w:val="21"/>
+          <w:szCs w:val="21"/>
+        </w:rPr>
+        <w:t xml:space="preserve">Contexto de uso: usado pelos colaboradores da recepção/clínica no momento do atendimento. O sistema monta o documento com os dados do paciente e do procedimento, e o paciente assina na hora — pelo próprio celular, lendo um QR Code, ou num totem dedicado da clínica —, com o arquivo assinado sendo enviado automaticamente ao Dental Office e por WhatsApp. Por ser a ferramenta mais recente e a que envolve validade jurídica, ela é detalhada em profundidade na próxima seção.</w:t>
+      </w:r>
+    </w:p>
+    <w:p>
+      <w:r>
+        <w:br w:type="page"/>
       </w:r>
     </w:p>
     <w:p>
@@ -456,23 +384,7 @@
           <w:sz w:val="30"/>
           <w:szCs w:val="30"/>
         </w:rPr>
-        <w:t xml:space="preserve">2. Ferramentas implementadas</w:t>
-      </w:r>
-    </w:p>
-    <w:p>
-      <w:pPr>
-        <w:pStyle w:val="Heading2"/>
-        <w:spacing w:after="120" w:before="260"/>
-      </w:pPr>
-      <w:r>
-        <w:rPr>
-          <w:b/>
-          <w:bCs/>
-          <w:color w:val="0B2A57"/>
-          <w:sz w:val="25"/>
-          <w:szCs w:val="25"/>
-        </w:rPr>
-        <w:t xml:space="preserve">2.1. Portal e Acesso</w:t>
+        <w:t xml:space="preserve">3. Assinatura digital no Gerador de Contratos</w:t>
       </w:r>
     </w:p>
     <w:p>
@@ -484,215 +396,7 @@
           <w:sz w:val="21"/>
           <w:szCs w:val="21"/>
         </w:rPr>
-        <w:t xml:space="preserve">O que é: a porta de entrada do sistema. É onde qualquer colaborador faz login e vê, em uma única tela, um resumo em números e o acesso às demais ferramentas.</w:t>
-      </w:r>
-    </w:p>
-    <w:p>
-      <w:pPr>
-        <w:spacing w:after="160" w:line="300"/>
-      </w:pPr>
-      <w:r>
-        <w:rPr>
-          <w:sz w:val="21"/>
-          <w:szCs w:val="21"/>
-        </w:rPr>
-        <w:t xml:space="preserve">Contexto de uso: usado por todos os colaboradores, todos os dias, como primeira tela ao entrar no sistema. É também onde um novo colaborador solicita acesso — pedido que é aprovado ou recusado por um administrador antes de a conta ser liberada.</w:t>
-      </w:r>
-    </w:p>
-    <w:p>
-      <w:pPr>
-        <w:pStyle w:val="Heading2"/>
-        <w:spacing w:after="120" w:before="260"/>
-      </w:pPr>
-      <w:r>
-        <w:rPr>
-          <w:b/>
-          <w:bCs/>
-          <w:color w:val="0B2A57"/>
-          <w:sz w:val="25"/>
-          <w:szCs w:val="25"/>
-        </w:rPr>
-        <w:t xml:space="preserve">2.2. Gestão de CME (Central de Materiais e Esterilização)</w:t>
-      </w:r>
-    </w:p>
-    <w:p>
-      <w:pPr>
-        <w:spacing w:after="160" w:line="300"/>
-      </w:pPr>
-      <w:r>
-        <w:rPr>
-          <w:sz w:val="21"/>
-          <w:szCs w:val="21"/>
-        </w:rPr>
-        <w:t xml:space="preserve">O que é: controla o ciclo de vida dos pacotes de instrumentais odontológicos que os alunos de pós-graduação entregam para esterilização — da entrada até a devolução — além do empréstimo avulso de kits de materiais e do cadastro de turmas e alunos (sincronizado automaticamente do sistema acadêmico Eduq).</w:t>
-      </w:r>
-    </w:p>
-    <w:p>
-      <w:pPr>
-        <w:spacing w:after="160" w:line="300"/>
-      </w:pPr>
-      <w:r>
-        <w:rPr>
-          <w:sz w:val="21"/>
-          <w:szCs w:val="21"/>
-        </w:rPr>
-        <w:t xml:space="preserve">Contexto de uso: usado pela equipe da CME e pelos alunos de pós-graduação. O aluno entrega um pacote de instrumentais para esterilizar; a equipe registra a entrada, acompanha o processo e registra a retirada quando o aluno busca o material de volta. O mesmo aluno também pode retirar kits de material emprestado, que precisam ser devolvidos depois.</w:t>
-      </w:r>
-    </w:p>
-    <w:p>
-      <w:pPr>
-        <w:pStyle w:val="Heading2"/>
-        <w:spacing w:after="120" w:before="260"/>
-      </w:pPr>
-      <w:r>
-        <w:rPr>
-          <w:b/>
-          <w:bCs/>
-          <w:color w:val="0B2A57"/>
-          <w:sz w:val="25"/>
-          <w:szCs w:val="25"/>
-        </w:rPr>
-        <w:t xml:space="preserve">2.3. Gestão de Laboratório</w:t>
-      </w:r>
-    </w:p>
-    <w:p>
-      <w:pPr>
-        <w:spacing w:after="160" w:line="300"/>
-      </w:pPr>
-      <w:r>
-        <w:rPr>
-          <w:sz w:val="21"/>
-          <w:szCs w:val="21"/>
-        </w:rPr>
-        <w:t xml:space="preserve">O que é: controla os pedidos de material odontológico (próteses, aparelhos etc.) enviados a laboratórios parceiros externos — do registro do pedido até a entrega da peça pronta e o fechamento financeiro com o paciente e o laboratório.</w:t>
-      </w:r>
-    </w:p>
-    <w:p>
-      <w:pPr>
-        <w:spacing w:after="160" w:line="300"/>
-      </w:pPr>
-      <w:r>
-        <w:rPr>
-          <w:sz w:val="21"/>
-          <w:szCs w:val="21"/>
-        </w:rPr>
-        <w:t xml:space="preserve">Contexto de uso: usado pelos coordenadores dos laboratórios da clínica-escola. Um aluno faz a moldagem do paciente; o coordenador registra o pedido ao laboratório parceiro, acompanha o prazo de entrega e, quando a peça chega, controla o faturamento — quem já pagou, o paciente e/ou o laboratório.</w:t>
-      </w:r>
-    </w:p>
-    <w:p>
-      <w:pPr>
-        <w:pStyle w:val="Heading2"/>
-        <w:spacing w:after="120" w:before="260"/>
-      </w:pPr>
-      <w:r>
-        <w:rPr>
-          <w:b/>
-          <w:bCs/>
-          <w:color w:val="0B2A57"/>
-          <w:sz w:val="25"/>
-          <w:szCs w:val="25"/>
-        </w:rPr>
-        <w:t xml:space="preserve">2.4. Gerador de Identificadores de Bancada</w:t>
-      </w:r>
-    </w:p>
-    <w:p>
-      <w:pPr>
-        <w:spacing w:after="160" w:line="300"/>
-      </w:pPr>
-      <w:r>
-        <w:rPr>
-          <w:sz w:val="21"/>
-          <w:szCs w:val="21"/>
-        </w:rPr>
-        <w:t xml:space="preserve">O que é: gera, em poucos cliques, um arquivo de apresentação (PowerPoint) pronto para impressão com os identificadores (crachás) de bancada de uma turma inteira de alunos — nome, matrícula e demais dados, no modelo visual escolhido.</w:t>
-      </w:r>
-    </w:p>
-    <w:p>
-      <w:pPr>
-        <w:spacing w:after="160" w:line="300"/>
-      </w:pPr>
-      <w:r>
-        <w:rPr>
-          <w:sz w:val="21"/>
-          <w:szCs w:val="21"/>
-        </w:rPr>
-        <w:t xml:space="preserve">Contexto de uso: usado pela coordenação acadêmica no início de cada período letivo, ou quando entra um aluno novo. Basta escolher a turma — os dados dos alunos vêm automaticamente do sistema acadêmico Eduq — e o modelo de identificador entre os disponíveis, e o arquivo já sai pronto para impressão.</w:t>
-      </w:r>
-    </w:p>
-    <w:p>
-      <w:pPr>
-        <w:pStyle w:val="Heading2"/>
-        <w:spacing w:after="120" w:before="260"/>
-      </w:pPr>
-      <w:r>
-        <w:rPr>
-          <w:b/>
-          <w:bCs/>
-          <w:color w:val="0B2A57"/>
-          <w:sz w:val="25"/>
-          <w:szCs w:val="25"/>
-        </w:rPr>
-        <w:t xml:space="preserve">2.5. Gerador de Contratos e Termos de Consentimento</w:t>
-      </w:r>
-    </w:p>
-    <w:p>
-      <w:pPr>
-        <w:spacing w:after="160" w:line="300"/>
-      </w:pPr>
-      <w:r>
-        <w:rPr>
-          <w:sz w:val="21"/>
-          <w:szCs w:val="21"/>
-        </w:rPr>
-        <w:t xml:space="preserve">O que é: gera contratos e termos de consentimento odontológico personalizados para cada paciente e conduz a assinatura digital do documento, sem precisar de papel nem de outro programa.</w:t>
-      </w:r>
-    </w:p>
-    <w:p>
-      <w:pPr>
-        <w:spacing w:after="160" w:line="300"/>
-      </w:pPr>
-      <w:r>
-        <w:rPr>
-          <w:sz w:val="21"/>
-          <w:szCs w:val="21"/>
-        </w:rPr>
-        <w:t xml:space="preserve">Contexto de uso: usado pelos colaboradores da recepção/clínica no momento do atendimento. O sistema monta o documento com os dados do paciente e do procedimento, e o paciente assina na hora — pelo próprio celular, lendo um QR Code, ou num totem dedicado da clínica —, com o arquivo assinado sendo enviado automaticamente ao Dental Office e por WhatsApp. Por ser a ferramenta mais recente e a que envolve validade jurídica, ela é detalhada em profundidade na próxima seção.</w:t>
-      </w:r>
-    </w:p>
-    <w:p>
-      <w:r>
-        <w:br w:type="page"/>
-      </w:r>
-    </w:p>
-    <w:p>
-      <w:pPr>
-        <w:pStyle w:val="Heading1"/>
-        <w:pBdr>
-          <w:bottom w:val="single" w:color="1D6EEE" w:sz="6" w:space="4"/>
-        </w:pBdr>
-        <w:spacing w:after="160" w:before="360"/>
-      </w:pPr>
-      <w:r>
-        <w:rPr>
-          <w:b/>
-          <w:bCs/>
-          <w:color w:val="0B2A57"/>
-          <w:sz w:val="30"/>
-          <w:szCs w:val="30"/>
-        </w:rPr>
-        <w:t xml:space="preserve">3. Assinatura digital no Gerador de Contratos</w:t>
-      </w:r>
-    </w:p>
-    <w:p>
-      <w:pPr>
-        <w:spacing w:after="160" w:line="300"/>
-      </w:pPr>
-      <w:r>
-        <w:rPr>
-          <w:sz w:val="21"/>
-          <w:szCs w:val="21"/>
-        </w:rPr>
-        <w:t xml:space="preserve">Esta seção reúne os pontos mais relevantes do estudo interno “Assinatura Digital de Documentos — Diagnóstico e Estudo Comparativo” (13/07/2026), para quem precisa entender — ou decidir sobre o futuro — dessa parte do sistema, sem precisar ler o levantamento completo.</w:t>
+        <w:t xml:space="preserve">Esta seção detalha o funcionamento e a base jurídica da assinatura digital usada no Gerador de Contratos — para quem precisa entender, ou decidir sobre o futuro, dessa parte do sistema.</w:t>
       </w:r>
     </w:p>
     <w:p>
@@ -1550,7 +1254,7 @@
           <w:sz w:val="21"/>
           <w:szCs w:val="21"/>
         </w:rPr>
-        <w:t xml:space="preserve">Existem diversas plataformas brasileiras especializadas em assinatura eletrônica. O quadro abaixo resume as sete avaliadas no estudo original (preços de referência coletados em julho de 2026):</w:t>
+        <w:t xml:space="preserve">Existem diversas plataformas brasileiras especializadas em assinatura eletrônica. O quadro abaixo resume sete das principais do mercado (preços de referência coletados em julho de 2026):</w:t>
       </w:r>
     </w:p>
     <w:tbl>
@@ -2464,7 +2168,7 @@
           <w:sz w:val="21"/>
           <w:szCs w:val="21"/>
         </w:rPr>
-        <w:t xml:space="preserve">Diferente da seção anterior — focada só na assinatura de contratos —, este levantamento cobre o custo de manter em funcionamento todas as ferramentas do Painel. Valores de referência pesquisados em julho de 2026, sujeitos a alteração pelos próprios fornecedores.</w:t>
+        <w:t xml:space="preserve">Diferente da seção anterior — focada só na assinatura de contratos —, este levantamento cobre o custo de manter em funcionamento todas as ferramentas do Painel. A maior parte foi desenvolvida internamente e não gera mensalidade própria (assinatura eletrônica dos contratos, geração de identificadores de bancada, carimbo de tempo — hoje gratuito via autoridade pública FreeTSA — e as integrações com o Dental Office e o Eduq, sistemas já contratados pela ABO Goiás independentemente deste Painel). A tabela abaixo lista apenas os itens que efetivamente geram custo recorrente hoje. Valores de referência pesquisados em julho de 2026, sujeitos a alteração pelos próprios fornecedores.</w:t>
       </w:r>
     </w:p>
     <w:tbl>
@@ -2685,374 +2389,72 @@
           </w:p>
         </w:tc>
       </w:tr>
+    </w:tbl>
+    <w:p>
+      <w:pPr>
+        <w:spacing w:after="200"/>
+      </w:pPr>
+    </w:p>
+    <w:tbl>
+      <w:tblPr>
+        <w:tblW w:type="dxa" w:w="9400"/>
+        <w:tblBorders>
+          <w:top w:val="single" w:color="1D6EEE" w:sz="8"/>
+          <w:left w:val="single" w:color="1D6EEE" w:sz="8"/>
+          <w:bottom w:val="single" w:color="1D6EEE" w:sz="8"/>
+          <w:right w:val="single" w:color="1D6EEE" w:sz="8"/>
+          <w:insideH w:val="single" w:color="auto" w:sz="4"/>
+          <w:insideV w:val="single" w:color="auto" w:sz="4"/>
+        </w:tblBorders>
+      </w:tblPr>
+      <w:tblGrid>
+        <w:gridCol w:w="9400"/>
+      </w:tblGrid>
       <w:tr>
         <w:tc>
           <w:tcPr>
-            <w:tcW w:type="dxa" w:w="2600"/>
-            <w:tcMar>
-              <w:top w:type="dxa" w:w="80"/>
-              <w:left w:type="dxa" w:w="100"/>
-              <w:bottom w:type="dxa" w:w="80"/>
-              <w:right w:type="dxa" w:w="100"/>
-            </w:tcMar>
-          </w:tcPr>
-          <w:p>
-            <w:r>
-              <w:rPr>
-                <w:sz w:val="19"/>
-                <w:szCs w:val="19"/>
-              </w:rPr>
-              <w:t xml:space="preserve">Carimbo de tempo da assinatura (RFC 3161)</w:t>
-            </w:r>
-          </w:p>
-        </w:tc>
-        <w:tc>
-          <w:tcPr>
-            <w:tcW w:type="dxa" w:w="3800"/>
-            <w:tcMar>
-              <w:top w:type="dxa" w:w="80"/>
-              <w:left w:type="dxa" w:w="100"/>
-              <w:bottom w:type="dxa" w:w="80"/>
-              <w:right w:type="dxa" w:w="100"/>
-            </w:tcMar>
-          </w:tcPr>
-          <w:p>
-            <w:r>
-              <w:rPr>
-                <w:sz w:val="19"/>
-                <w:szCs w:val="19"/>
-              </w:rPr>
-              <w:t xml:space="preserve">Comprovante externo de data/hora do documento assinado, usado pelo Gerador de Contratos.</w:t>
-            </w:r>
-          </w:p>
-        </w:tc>
-        <w:tc>
-          <w:tcPr>
-            <w:tcW w:type="dxa" w:w="3000"/>
-            <w:tcMar>
-              <w:top w:type="dxa" w:w="80"/>
-              <w:left w:type="dxa" w:w="100"/>
-              <w:bottom w:type="dxa" w:w="80"/>
-              <w:right w:type="dxa" w:w="100"/>
-            </w:tcMar>
-          </w:tcPr>
-          <w:p>
-            <w:r>
-              <w:rPr>
-                <w:sz w:val="19"/>
-                <w:szCs w:val="19"/>
-              </w:rPr>
-              <w:t xml:space="preserve">Gratuito hoje (autoridade pública FreeTSA). Uma troca futura por uma autoridade credenciada ICP-Brasil teria custo por carimbo, mas não está contratada.</w:t>
-            </w:r>
-          </w:p>
-        </w:tc>
-      </w:tr>
-      <w:tr>
-        <w:tc>
-          <w:tcPr>
-            <w:tcW w:type="dxa" w:w="2600"/>
-            <w:tcMar>
-              <w:top w:type="dxa" w:w="80"/>
-              <w:left w:type="dxa" w:w="100"/>
-              <w:bottom w:type="dxa" w:w="80"/>
-              <w:right w:type="dxa" w:w="100"/>
-            </w:tcMar>
-          </w:tcPr>
-          <w:p>
-            <w:r>
-              <w:rPr>
-                <w:sz w:val="19"/>
-                <w:szCs w:val="19"/>
-              </w:rPr>
-              <w:t xml:space="preserve">Assinatura eletrônica dos contratos</w:t>
-            </w:r>
-          </w:p>
-        </w:tc>
-        <w:tc>
-          <w:tcPr>
-            <w:tcW w:type="dxa" w:w="3800"/>
-            <w:tcMar>
-              <w:top w:type="dxa" w:w="80"/>
-              <w:left w:type="dxa" w:w="100"/>
-              <w:bottom w:type="dxa" w:w="80"/>
-              <w:right w:type="dxa" w:w="100"/>
-            </w:tcMar>
-          </w:tcPr>
-          <w:p>
-            <w:r>
-              <w:rPr>
-                <w:sz w:val="19"/>
-                <w:szCs w:val="19"/>
-              </w:rPr>
-              <w:t xml:space="preserve">Lógica de assinatura, validação por hash e trilha de auditoria do Gerador de Contratos.</w:t>
-            </w:r>
-          </w:p>
-        </w:tc>
-        <w:tc>
-          <w:tcPr>
-            <w:tcW w:type="dxa" w:w="3000"/>
-            <w:tcMar>
-              <w:top w:type="dxa" w:w="80"/>
-              <w:left w:type="dxa" w:w="100"/>
-              <w:bottom w:type="dxa" w:w="80"/>
-              <w:right w:type="dxa" w:w="100"/>
-            </w:tcMar>
-          </w:tcPr>
-          <w:p>
-            <w:r>
-              <w:rPr>
-                <w:sz w:val="19"/>
-                <w:szCs w:val="19"/>
-              </w:rPr>
-              <w:t xml:space="preserve">Sem custo adicional — desenvolvida internamente; custo marginal por assinatura praticamente zero (ver seção 3.5).</w:t>
-            </w:r>
-          </w:p>
-        </w:tc>
-      </w:tr>
-      <w:tr>
-        <w:tc>
-          <w:tcPr>
-            <w:tcW w:type="dxa" w:w="2600"/>
-            <w:tcMar>
-              <w:top w:type="dxa" w:w="80"/>
-              <w:left w:type="dxa" w:w="100"/>
-              <w:bottom w:type="dxa" w:w="80"/>
-              <w:right w:type="dxa" w:w="100"/>
-            </w:tcMar>
-          </w:tcPr>
-          <w:p>
-            <w:r>
-              <w:rPr>
-                <w:sz w:val="19"/>
-                <w:szCs w:val="19"/>
-              </w:rPr>
-              <w:t xml:space="preserve">Identificadores de bancada (PPTX)</w:t>
-            </w:r>
-          </w:p>
-        </w:tc>
-        <w:tc>
-          <w:tcPr>
-            <w:tcW w:type="dxa" w:w="3800"/>
-            <w:tcMar>
-              <w:top w:type="dxa" w:w="80"/>
-              <w:left w:type="dxa" w:w="100"/>
-              <w:bottom w:type="dxa" w:w="80"/>
-              <w:right w:type="dxa" w:w="100"/>
-            </w:tcMar>
-          </w:tcPr>
-          <w:p>
-            <w:r>
-              <w:rPr>
-                <w:sz w:val="19"/>
-                <w:szCs w:val="19"/>
-              </w:rPr>
-              <w:t xml:space="preserve">Geração do arquivo de apresentação com os crachás de cada turma.</w:t>
-            </w:r>
-          </w:p>
-        </w:tc>
-        <w:tc>
-          <w:tcPr>
-            <w:tcW w:type="dxa" w:w="3000"/>
-            <w:tcMar>
-              <w:top w:type="dxa" w:w="80"/>
-              <w:left w:type="dxa" w:w="100"/>
-              <w:bottom w:type="dxa" w:w="80"/>
-              <w:right w:type="dxa" w:w="100"/>
-            </w:tcMar>
-          </w:tcPr>
-          <w:p>
-            <w:r>
-              <w:rPr>
-                <w:sz w:val="19"/>
-                <w:szCs w:val="19"/>
-              </w:rPr>
-              <w:t xml:space="preserve">Sem custo adicional — gerado por bibliotecas de código aberto, no mesmo servidor do Painel.</w:t>
-            </w:r>
-          </w:p>
-        </w:tc>
-      </w:tr>
-      <w:tr>
-        <w:tc>
-          <w:tcPr>
-            <w:tcW w:type="dxa" w:w="2600"/>
-            <w:tcMar>
-              <w:top w:type="dxa" w:w="80"/>
-              <w:left w:type="dxa" w:w="100"/>
-              <w:bottom w:type="dxa" w:w="80"/>
-              <w:right w:type="dxa" w:w="100"/>
-            </w:tcMar>
-          </w:tcPr>
-          <w:p>
-            <w:r>
-              <w:rPr>
-                <w:sz w:val="19"/>
-                <w:szCs w:val="19"/>
-              </w:rPr>
-              <w:t xml:space="preserve">Integração com o Dental Office</w:t>
-            </w:r>
-          </w:p>
-        </w:tc>
-        <w:tc>
-          <w:tcPr>
-            <w:tcW w:type="dxa" w:w="3800"/>
-            <w:tcMar>
-              <w:top w:type="dxa" w:w="80"/>
-              <w:left w:type="dxa" w:w="100"/>
-              <w:bottom w:type="dxa" w:w="80"/>
-              <w:right w:type="dxa" w:w="100"/>
-            </w:tcMar>
-          </w:tcPr>
-          <w:p>
-            <w:r>
-              <w:rPr>
-                <w:sz w:val="19"/>
-                <w:szCs w:val="19"/>
-              </w:rPr>
-              <w:t xml:space="preserve">Usada pela Gestão de Laboratório (pacientes) e pelo Gerador de Contratos (envio do contrato assinado).</w:t>
-            </w:r>
-          </w:p>
-        </w:tc>
-        <w:tc>
-          <w:tcPr>
-            <w:tcW w:type="dxa" w:w="3000"/>
-            <w:tcMar>
-              <w:top w:type="dxa" w:w="80"/>
-              <w:left w:type="dxa" w:w="100"/>
-              <w:bottom w:type="dxa" w:w="80"/>
-              <w:right w:type="dxa" w:w="100"/>
-            </w:tcMar>
-          </w:tcPr>
-          <w:p>
-            <w:r>
-              <w:rPr>
-                <w:sz w:val="19"/>
-                <w:szCs w:val="19"/>
-              </w:rPr>
-              <w:t xml:space="preserve">Sistema de gestão clínica já contratado pela ABO Goiás, independente do Painel — este apenas consome uma API já paga para outra finalidade; não é um custo adicional introduzido por esta aplicação.</w:t>
-            </w:r>
-          </w:p>
-        </w:tc>
-      </w:tr>
-      <w:tr>
-        <w:tc>
-          <w:tcPr>
-            <w:tcW w:type="dxa" w:w="2600"/>
-            <w:tcMar>
-              <w:top w:type="dxa" w:w="80"/>
-              <w:left w:type="dxa" w:w="100"/>
-              <w:bottom w:type="dxa" w:w="80"/>
-              <w:right w:type="dxa" w:w="100"/>
-            </w:tcMar>
-          </w:tcPr>
-          <w:p>
-            <w:r>
-              <w:rPr>
-                <w:sz w:val="19"/>
-                <w:szCs w:val="19"/>
-              </w:rPr>
-              <w:t xml:space="preserve">Integração com o Eduq</w:t>
-            </w:r>
-          </w:p>
-        </w:tc>
-        <w:tc>
-          <w:tcPr>
-            <w:tcW w:type="dxa" w:w="3800"/>
-            <w:tcMar>
-              <w:top w:type="dxa" w:w="80"/>
-              <w:left w:type="dxa" w:w="100"/>
-              <w:bottom w:type="dxa" w:w="80"/>
-              <w:right w:type="dxa" w:w="100"/>
-            </w:tcMar>
-          </w:tcPr>
-          <w:p>
-            <w:r>
-              <w:rPr>
-                <w:sz w:val="19"/>
-                <w:szCs w:val="19"/>
-              </w:rPr>
-              <w:t xml:space="preserve">Usada pela Gestão de CME e pelo Gerador de Identificadores (dados de turmas e alunos).</w:t>
-            </w:r>
-          </w:p>
-        </w:tc>
-        <w:tc>
-          <w:tcPr>
-            <w:tcW w:type="dxa" w:w="3000"/>
-            <w:tcMar>
-              <w:top w:type="dxa" w:w="80"/>
-              <w:left w:type="dxa" w:w="100"/>
-              <w:bottom w:type="dxa" w:w="80"/>
-              <w:right w:type="dxa" w:w="100"/>
-            </w:tcMar>
-          </w:tcPr>
-          <w:p>
-            <w:r>
-              <w:rPr>
-                <w:sz w:val="19"/>
-                <w:szCs w:val="19"/>
-              </w:rPr>
-              <w:t xml:space="preserve">Sistema acadêmico já utilizado pela instituição — mesma observação do item anterior.</w:t>
-            </w:r>
-          </w:p>
-        </w:tc>
-      </w:tr>
-      <w:tr>
-        <w:tc>
-          <w:tcPr>
-            <w:tcW w:type="dxa" w:w="2600"/>
-            <w:tcMar>
-              <w:top w:type="dxa" w:w="80"/>
-              <w:left w:type="dxa" w:w="100"/>
-              <w:bottom w:type="dxa" w:w="80"/>
-              <w:right w:type="dxa" w:w="100"/>
-            </w:tcMar>
-          </w:tcPr>
-          <w:p>
-            <w:r>
-              <w:rPr>
-                <w:sz w:val="19"/>
-                <w:szCs w:val="19"/>
-              </w:rPr>
-              <w:t xml:space="preserve">E-mail (SMTP)</w:t>
-            </w:r>
-          </w:p>
-        </w:tc>
-        <w:tc>
-          <w:tcPr>
-            <w:tcW w:type="dxa" w:w="3800"/>
-            <w:tcMar>
-              <w:top w:type="dxa" w:w="80"/>
-              <w:left w:type="dxa" w:w="100"/>
-              <w:bottom w:type="dxa" w:w="80"/>
-              <w:right w:type="dxa" w:w="100"/>
-            </w:tcMar>
-          </w:tcPr>
-          <w:p>
-            <w:r>
-              <w:rPr>
-                <w:sz w:val="19"/>
-                <w:szCs w:val="19"/>
-              </w:rPr>
-              <w:t xml:space="preserve">Recuperação de senha e notificações de solicitação de acesso (Portal).</w:t>
-            </w:r>
-          </w:p>
-        </w:tc>
-        <w:tc>
-          <w:tcPr>
-            <w:tcW w:type="dxa" w:w="3000"/>
-            <w:tcMar>
-              <w:top w:type="dxa" w:w="80"/>
-              <w:left w:type="dxa" w:w="100"/>
-              <w:bottom w:type="dxa" w:w="80"/>
-              <w:right w:type="dxa" w:w="100"/>
-            </w:tcMar>
-          </w:tcPr>
-          <w:p>
-            <w:r>
-              <w:rPr>
-                <w:sz w:val="19"/>
-                <w:szCs w:val="19"/>
-              </w:rPr>
-              <w:t xml:space="preserve">Depende do provedor contratado (ex.: SendGrid, Amazon SES) — varia por volume de envio; sem valor de referência fixado neste levantamento.</w:t>
+            <w:tcW w:type="dxa" w:w="9400"/>
+            <w:shd w:fill="EAF1FE" w:val="clear"/>
+            <w:tcMar>
+              <w:top w:type="dxa" w:w="160"/>
+              <w:left w:type="dxa" w:w="200"/>
+              <w:bottom w:type="dxa" w:w="160"/>
+              <w:right w:type="dxa" w:w="200"/>
+            </w:tcMar>
+          </w:tcPr>
+          <w:p>
+            <w:r>
+              <w:rPr>
+                <w:b/>
+                <w:bCs/>
+                <w:color w:val="0B2A57"/>
+                <w:sz w:val="24"/>
+                <w:szCs w:val="24"/>
+              </w:rPr>
+              <w:t xml:space="preserve">Valor final estimado: </w:t>
+            </w:r>
+            <w:r>
+              <w:rPr>
+                <w:b/>
+                <w:bCs/>
+                <w:color w:val="1D6EEE"/>
+                <w:sz w:val="24"/>
+                <w:szCs w:val="24"/>
+              </w:rPr>
+              <w:t xml:space="preserve">cerca de R$ 80 a R$ 200 por mês</w:t>
+            </w:r>
+          </w:p>
+          <w:p>
+            <w:pPr>
+              <w:spacing w:before="100"/>
+            </w:pPr>
+            <w:r>
+              <w:rPr>
+                <w:color w:val="0B2A57"/>
+                <w:sz w:val="21"/>
+                <w:szCs w:val="21"/>
+              </w:rPr>
+              <w:t xml:space="preserve">(Hospedagem + WhatsApp automático, convertendo o intervalo do Railway pela cotação de referência de US$ 1 = R$ 5,08). Esse valor não inclui consumo de processamento acima do incluído no plano da Railway, nem eventuais variações cambiais ou reajustes dos fornecedores.</w:t>
             </w:r>
           </w:p>
         </w:tc>
@@ -3080,23 +2482,6 @@
           <w:szCs w:val="30"/>
         </w:rPr>
         <w:t xml:space="preserve">Fontes</w:t>
-      </w:r>
-    </w:p>
-    <w:p>
-      <w:pPr>
-        <w:pStyle w:val="ListParagraph"/>
-        <w:numPr>
-          <w:ilvl w:val="0"/>
-          <w:numId w:val="2"/>
-        </w:numPr>
-        <w:spacing w:after="80" w:line="290"/>
-      </w:pPr>
-      <w:r>
-        <w:rPr>
-          <w:sz w:val="21"/>
-          <w:szCs w:val="21"/>
-        </w:rPr>
-        <w:t xml:space="preserve">Assinatura Digital de Documentos — Diagnóstico e Estudo Comparativo. Equipe de Desenvolvimento, 13 de julho de 2026 (docs/Assinatura-Digital-Estudo-Comparativo.docx).</w:t>
       </w:r>
     </w:p>
     <w:p>

</xml_diff>

<commit_message>
Reestrutura custos do documento de ferramentas por aplicação
Cada ferramenta agora traz seu próprio custo mensal (itens pagos e
total), e a seção de custo geral passa a ter uma relação por aplicação
seguida do valor final da plataforma, sem contar a hospedagem
compartilhada mais de uma vez.
</commit_message>
<xml_diff>
--- a/docs/Ferramentas-Painel-ABO-Goias.docx
+++ b/docs/Ferramentas-Painel-ABO-Goias.docx
@@ -165,6 +165,18 @@
     </w:p>
     <w:p>
       <w:pPr>
+        <w:spacing w:after="160" w:line="300"/>
+      </w:pPr>
+      <w:r>
+        <w:rPr>
+          <w:sz w:val="21"/>
+          <w:szCs w:val="21"/>
+        </w:rPr>
+        <w:t xml:space="preserve">Além da funcionalidade, cada ferramenta abaixo traz o custo mensal para manter todas as suas funções em pleno funcionamento. A hospedagem (Railway) é uma única assinatura, compartilhada por todo o Painel — por isso ela aparece no custo de todas as ferramentas, mas é paga uma única vez; o valor final real, sem repetição, está na seção 4.</w:t>
+      </w:r>
+    </w:p>
+    <w:p>
+      <w:pPr>
         <w:pStyle w:val="Heading2"/>
         <w:spacing w:after="120" w:before="260"/>
       </w:pPr>
@@ -205,6 +217,63 @@
     </w:p>
     <w:p>
       <w:pPr>
+        <w:pStyle w:val="Heading3"/>
+        <w:spacing w:after="100" w:before="200"/>
+      </w:pPr>
+      <w:r>
+        <w:rPr>
+          <w:b/>
+          <w:bCs/>
+          <w:color w:val="1D6EEE"/>
+          <w:sz w:val="22"/>
+          <w:szCs w:val="22"/>
+        </w:rPr>
+        <w:t xml:space="preserve">Custo mensal para funcionar</w:t>
+      </w:r>
+    </w:p>
+    <w:p>
+      <w:pPr>
+        <w:pStyle w:val="ListParagraph"/>
+        <w:numPr>
+          <w:ilvl w:val="0"/>
+          <w:numId w:val="2"/>
+        </w:numPr>
+        <w:spacing w:after="80" w:line="290"/>
+      </w:pPr>
+      <w:r>
+        <w:rPr>
+          <w:b/>
+          <w:bCs/>
+          <w:sz w:val="21"/>
+          <w:szCs w:val="21"/>
+        </w:rPr>
+        <w:t xml:space="preserve">Hospedagem (Railway)</w:t>
+      </w:r>
+      <w:r>
+        <w:rPr>
+          <w:sz w:val="21"/>
+          <w:szCs w:val="21"/>
+        </w:rPr>
+        <w:t xml:space="preserve"> — R$ 100/mês. Servidor onde o Painel roda, compartilhado por todas as ferramentas.</w:t>
+      </w:r>
+    </w:p>
+    <w:p>
+      <w:pPr>
+        <w:spacing w:after="160" w:line="300"/>
+      </w:pPr>
+      <w:r>
+        <w:rPr>
+          <w:b/>
+          <w:bCs/>
+          <w:color w:val="0B2A57"/>
+          <w:sz w:val="21"/>
+          <w:szCs w:val="21"/>
+        </w:rPr>
+        <w:t xml:space="preserve">Total: R$ 100/mês.</w:t>
+      </w:r>
+    </w:p>
+    <w:p>
+      <w:pPr>
         <w:pStyle w:val="Heading2"/>
         <w:spacing w:after="120" w:before="260"/>
       </w:pPr>
@@ -245,6 +314,63 @@
     </w:p>
     <w:p>
       <w:pPr>
+        <w:pStyle w:val="Heading3"/>
+        <w:spacing w:after="100" w:before="200"/>
+      </w:pPr>
+      <w:r>
+        <w:rPr>
+          <w:b/>
+          <w:bCs/>
+          <w:color w:val="1D6EEE"/>
+          <w:sz w:val="22"/>
+          <w:szCs w:val="22"/>
+        </w:rPr>
+        <w:t xml:space="preserve">Custo mensal para funcionar</w:t>
+      </w:r>
+    </w:p>
+    <w:p>
+      <w:pPr>
+        <w:pStyle w:val="ListParagraph"/>
+        <w:numPr>
+          <w:ilvl w:val="0"/>
+          <w:numId w:val="2"/>
+        </w:numPr>
+        <w:spacing w:after="80" w:line="290"/>
+      </w:pPr>
+      <w:r>
+        <w:rPr>
+          <w:b/>
+          <w:bCs/>
+          <w:sz w:val="21"/>
+          <w:szCs w:val="21"/>
+        </w:rPr>
+        <w:t xml:space="preserve">Hospedagem (Railway)</w:t>
+      </w:r>
+      <w:r>
+        <w:rPr>
+          <w:sz w:val="21"/>
+          <w:szCs w:val="21"/>
+        </w:rPr>
+        <w:t xml:space="preserve"> — R$ 100/mês. Mesma assinatura citada no Portal — não é um custo adicional, é a mesma hospedagem compartilhada por todo o Painel.</w:t>
+      </w:r>
+    </w:p>
+    <w:p>
+      <w:pPr>
+        <w:spacing w:after="160" w:line="300"/>
+      </w:pPr>
+      <w:r>
+        <w:rPr>
+          <w:b/>
+          <w:bCs/>
+          <w:color w:val="0B2A57"/>
+          <w:sz w:val="21"/>
+          <w:szCs w:val="21"/>
+        </w:rPr>
+        <w:t xml:space="preserve">Total: R$ 100/mês. Nenhuma outra função da Gestão de CME gera custo — não há envio de WhatsApp nem outro serviço externo pago.</w:t>
+      </w:r>
+    </w:p>
+    <w:p>
+      <w:pPr>
         <w:pStyle w:val="Heading2"/>
         <w:spacing w:after="120" w:before="260"/>
       </w:pPr>
@@ -285,6 +411,89 @@
     </w:p>
     <w:p>
       <w:pPr>
+        <w:pStyle w:val="Heading3"/>
+        <w:spacing w:after="100" w:before="200"/>
+      </w:pPr>
+      <w:r>
+        <w:rPr>
+          <w:b/>
+          <w:bCs/>
+          <w:color w:val="1D6EEE"/>
+          <w:sz w:val="22"/>
+          <w:szCs w:val="22"/>
+        </w:rPr>
+        <w:t xml:space="preserve">Custo mensal para funcionar</w:t>
+      </w:r>
+    </w:p>
+    <w:p>
+      <w:pPr>
+        <w:pStyle w:val="ListParagraph"/>
+        <w:numPr>
+          <w:ilvl w:val="0"/>
+          <w:numId w:val="2"/>
+        </w:numPr>
+        <w:spacing w:after="80" w:line="290"/>
+      </w:pPr>
+      <w:r>
+        <w:rPr>
+          <w:b/>
+          <w:bCs/>
+          <w:sz w:val="21"/>
+          <w:szCs w:val="21"/>
+        </w:rPr>
+        <w:t xml:space="preserve">Hospedagem (Railway)</w:t>
+      </w:r>
+      <w:r>
+        <w:rPr>
+          <w:sz w:val="21"/>
+          <w:szCs w:val="21"/>
+        </w:rPr>
+        <w:t xml:space="preserve"> — R$ 100/mês (mesma assinatura compartilhada por todo o Painel).</w:t>
+      </w:r>
+    </w:p>
+    <w:p>
+      <w:pPr>
+        <w:pStyle w:val="ListParagraph"/>
+        <w:numPr>
+          <w:ilvl w:val="0"/>
+          <w:numId w:val="2"/>
+        </w:numPr>
+        <w:spacing w:after="80" w:line="290"/>
+      </w:pPr>
+      <w:r>
+        <w:rPr>
+          <w:b/>
+          <w:bCs/>
+          <w:sz w:val="21"/>
+          <w:szCs w:val="21"/>
+        </w:rPr>
+        <w:t xml:space="preserve">WhatsApp automático (Z-API)</w:t>
+      </w:r>
+      <w:r>
+        <w:rPr>
+          <w:sz w:val="21"/>
+          <w:szCs w:val="21"/>
+        </w:rPr>
+        <w:t xml:space="preserve"> — R$ 100/mês. Usado para cobrar automaticamente, uma vez por dia, os laboratórios parceiros com pedidos atrasados.</w:t>
+      </w:r>
+    </w:p>
+    <w:p>
+      <w:pPr>
+        <w:spacing w:after="160" w:line="300"/>
+      </w:pPr>
+      <w:r>
+        <w:rPr>
+          <w:b/>
+          <w:bCs/>
+          <w:color w:val="0B2A57"/>
+          <w:sz w:val="21"/>
+          <w:szCs w:val="21"/>
+        </w:rPr>
+        <w:t xml:space="preserve">Total: R$ 200/mês.</w:t>
+      </w:r>
+    </w:p>
+    <w:p>
+      <w:pPr>
         <w:pStyle w:val="Heading2"/>
         <w:spacing w:after="120" w:before="260"/>
       </w:pPr>
@@ -325,6 +534,63 @@
     </w:p>
     <w:p>
       <w:pPr>
+        <w:pStyle w:val="Heading3"/>
+        <w:spacing w:after="100" w:before="200"/>
+      </w:pPr>
+      <w:r>
+        <w:rPr>
+          <w:b/>
+          <w:bCs/>
+          <w:color w:val="1D6EEE"/>
+          <w:sz w:val="22"/>
+          <w:szCs w:val="22"/>
+        </w:rPr>
+        <w:t xml:space="preserve">Custo mensal para funcionar</w:t>
+      </w:r>
+    </w:p>
+    <w:p>
+      <w:pPr>
+        <w:pStyle w:val="ListParagraph"/>
+        <w:numPr>
+          <w:ilvl w:val="0"/>
+          <w:numId w:val="2"/>
+        </w:numPr>
+        <w:spacing w:after="80" w:line="290"/>
+      </w:pPr>
+      <w:r>
+        <w:rPr>
+          <w:b/>
+          <w:bCs/>
+          <w:sz w:val="21"/>
+          <w:szCs w:val="21"/>
+        </w:rPr>
+        <w:t xml:space="preserve">Hospedagem (Railway)</w:t>
+      </w:r>
+      <w:r>
+        <w:rPr>
+          <w:sz w:val="21"/>
+          <w:szCs w:val="21"/>
+        </w:rPr>
+        <w:t xml:space="preserve"> — R$ 100/mês (mesma assinatura compartilhada por todo o Painel).</w:t>
+      </w:r>
+    </w:p>
+    <w:p>
+      <w:pPr>
+        <w:spacing w:after="160" w:line="300"/>
+      </w:pPr>
+      <w:r>
+        <w:rPr>
+          <w:b/>
+          <w:bCs/>
+          <w:color w:val="0B2A57"/>
+          <w:sz w:val="21"/>
+          <w:szCs w:val="21"/>
+        </w:rPr>
+        <w:t xml:space="preserve">Total: R$ 100/mês. A geração do arquivo em si não usa nenhum serviço externo pago.</w:t>
+      </w:r>
+    </w:p>
+    <w:p>
+      <w:pPr>
         <w:pStyle w:val="Heading2"/>
         <w:spacing w:after="120" w:before="260"/>
       </w:pPr>
@@ -361,6 +627,89 @@
           <w:szCs w:val="21"/>
         </w:rPr>
         <w:t xml:space="preserve">Contexto de uso: usado pelos colaboradores da recepção/clínica no momento do atendimento. O sistema monta o documento com os dados do paciente e do procedimento, e o paciente assina na hora — pelo próprio celular, lendo um QR Code, ou num totem dedicado da clínica —, com o arquivo assinado sendo enviado automaticamente ao Dental Office e por WhatsApp. Por ser a ferramenta mais recente e a que envolve validade jurídica, ela é detalhada em profundidade na próxima seção.</w:t>
+      </w:r>
+    </w:p>
+    <w:p>
+      <w:pPr>
+        <w:pStyle w:val="Heading3"/>
+        <w:spacing w:after="100" w:before="200"/>
+      </w:pPr>
+      <w:r>
+        <w:rPr>
+          <w:b/>
+          <w:bCs/>
+          <w:color w:val="1D6EEE"/>
+          <w:sz w:val="22"/>
+          <w:szCs w:val="22"/>
+        </w:rPr>
+        <w:t xml:space="preserve">Custo mensal para funcionar</w:t>
+      </w:r>
+    </w:p>
+    <w:p>
+      <w:pPr>
+        <w:pStyle w:val="ListParagraph"/>
+        <w:numPr>
+          <w:ilvl w:val="0"/>
+          <w:numId w:val="2"/>
+        </w:numPr>
+        <w:spacing w:after="80" w:line="290"/>
+      </w:pPr>
+      <w:r>
+        <w:rPr>
+          <w:b/>
+          <w:bCs/>
+          <w:sz w:val="21"/>
+          <w:szCs w:val="21"/>
+        </w:rPr>
+        <w:t xml:space="preserve">Hospedagem (Railway)</w:t>
+      </w:r>
+      <w:r>
+        <w:rPr>
+          <w:sz w:val="21"/>
+          <w:szCs w:val="21"/>
+        </w:rPr>
+        <w:t xml:space="preserve"> — R$ 100/mês (mesma assinatura compartilhada por todo o Painel).</w:t>
+      </w:r>
+    </w:p>
+    <w:p>
+      <w:pPr>
+        <w:pStyle w:val="ListParagraph"/>
+        <w:numPr>
+          <w:ilvl w:val="0"/>
+          <w:numId w:val="2"/>
+        </w:numPr>
+        <w:spacing w:after="80" w:line="290"/>
+      </w:pPr>
+      <w:r>
+        <w:rPr>
+          <w:b/>
+          <w:bCs/>
+          <w:sz w:val="21"/>
+          <w:szCs w:val="21"/>
+        </w:rPr>
+        <w:t xml:space="preserve">WhatsApp automático (Z-API)</w:t>
+      </w:r>
+      <w:r>
+        <w:rPr>
+          <w:sz w:val="21"/>
+          <w:szCs w:val="21"/>
+        </w:rPr>
+        <w:t xml:space="preserve"> — R$ 100/mês. Usado para enviar automaticamente o contrato assinado ao paciente.</w:t>
+      </w:r>
+    </w:p>
+    <w:p>
+      <w:pPr>
+        <w:spacing w:after="160" w:line="300"/>
+      </w:pPr>
+      <w:r>
+        <w:rPr>
+          <w:b/>
+          <w:bCs/>
+          <w:color w:val="0B2A57"/>
+          <w:sz w:val="21"/>
+          <w:szCs w:val="21"/>
+        </w:rPr>
+        <w:t xml:space="preserve">Total: R$ 200/mês. O envio por e-mail (alternativa ao WhatsApp) e a assinatura digital e o carimbo de tempo não têm custo adicional hoje.</w:t>
       </w:r>
     </w:p>
     <w:p>
@@ -2168,7 +2517,35 @@
           <w:sz w:val="21"/>
           <w:szCs w:val="21"/>
         </w:rPr>
-        <w:t xml:space="preserve">Diferente da seção anterior — focada só na assinatura de contratos —, este levantamento cobre o custo de manter em funcionamento todas as ferramentas do Painel. A maior parte foi desenvolvida internamente e não gera mensalidade própria (assinatura eletrônica dos contratos, geração de identificadores de bancada, carimbo de tempo — hoje gratuito via autoridade pública FreeTSA — e as integrações com o Dental Office e o Eduq, sistemas já contratados pela ABO Goiás independentemente deste Painel). A tabela abaixo lista apenas os itens que efetivamente geram custo recorrente hoje. Valores de referência pesquisados em julho de 2026, sujeitos a alteração pelos próprios fornecedores.</w:t>
+        <w:t xml:space="preserve">A maior parte das ferramentas foi desenvolvida internamente e não gera mensalidade própria (assinatura eletrônica dos contratos, geração de identificadores de bancada, carimbo de tempo — hoje gratuito via autoridade pública FreeTSA — e as integrações com o Dental Office e o Eduq, sistemas já contratados pela ABO Goiás independentemente deste Painel). Apenas dois itens geram custo recorrente hoje — a hospedagem do servidor e o envio automático de WhatsApp —, detalhados junto de cada ferramenta na seção 2. Valores de referência pesquisados em julho de 2026, sujeitos a alteração pelos próprios fornecedores.</w:t>
+      </w:r>
+    </w:p>
+    <w:p>
+      <w:pPr>
+        <w:pStyle w:val="Heading2"/>
+        <w:spacing w:after="120" w:before="260"/>
+      </w:pPr>
+      <w:r>
+        <w:rPr>
+          <w:b/>
+          <w:bCs/>
+          <w:color w:val="0B2A57"/>
+          <w:sz w:val="25"/>
+          <w:szCs w:val="25"/>
+        </w:rPr>
+        <w:t xml:space="preserve">4.1. Relação de custo por aplicação</w:t>
+      </w:r>
+    </w:p>
+    <w:p>
+      <w:pPr>
+        <w:spacing w:after="160" w:line="300"/>
+      </w:pPr>
+      <w:r>
+        <w:rPr>
+          <w:sz w:val="21"/>
+          <w:szCs w:val="21"/>
+        </w:rPr>
+        <w:t xml:space="preserve">Cada linha soma o custo de todas as funções pagas daquela aplicação — o detalhamento de cada item está na seção 2, junto da ferramenta correspondente:</w:t>
       </w:r>
     </w:p>
     <w:tbl>
@@ -2184,9 +2561,9 @@
         </w:tblBorders>
       </w:tblPr>
       <w:tblGrid>
+        <w:gridCol w:w="4400"/>
         <w:gridCol w:w="2600"/>
-        <w:gridCol w:w="3800"/>
-        <w:gridCol w:w="3000"/>
+        <w:gridCol w:w="2400"/>
       </w:tblGrid>
       <w:tr>
         <w:trPr>
@@ -2194,7 +2571,7 @@
         </w:trPr>
         <w:tc>
           <w:tcPr>
-            <w:tcW w:type="dxa" w:w="2600"/>
+            <w:tcW w:type="dxa" w:w="4400"/>
             <w:shd w:fill="0B2A57" w:val="clear"/>
             <w:tcMar>
               <w:top w:type="dxa" w:w="80"/>
@@ -2212,13 +2589,13 @@
                 <w:sz w:val="19"/>
                 <w:szCs w:val="19"/>
               </w:rPr>
-              <w:t xml:space="preserve">Item</w:t>
-            </w:r>
-          </w:p>
-        </w:tc>
-        <w:tc>
-          <w:tcPr>
-            <w:tcW w:type="dxa" w:w="3800"/>
+              <w:t xml:space="preserve">Aplicação</w:t>
+            </w:r>
+          </w:p>
+        </w:tc>
+        <w:tc>
+          <w:tcPr>
+            <w:tcW w:type="dxa" w:w="2600"/>
             <w:shd w:fill="0B2A57" w:val="clear"/>
             <w:tcMar>
               <w:top w:type="dxa" w:w="80"/>
@@ -2236,13 +2613,13 @@
                 <w:sz w:val="19"/>
                 <w:szCs w:val="19"/>
               </w:rPr>
-              <w:t xml:space="preserve">O que é</w:t>
-            </w:r>
-          </w:p>
-        </w:tc>
-        <w:tc>
-          <w:tcPr>
-            <w:tcW w:type="dxa" w:w="3000"/>
+              <w:t xml:space="preserve">Itens pagos</w:t>
+            </w:r>
+          </w:p>
+        </w:tc>
+        <w:tc>
+          <w:tcPr>
+            <w:tcW w:type="dxa" w:w="2400"/>
             <w:shd w:fill="0B2A57" w:val="clear"/>
             <w:tcMar>
               <w:top w:type="dxa" w:w="80"/>
@@ -2260,7 +2637,7 @@
                 <w:sz w:val="19"/>
                 <w:szCs w:val="19"/>
               </w:rPr>
-              <w:t xml:space="preserve">Custo aproximado</w:t>
+              <w:t xml:space="preserve">Custo mensal</w:t>
             </w:r>
           </w:p>
         </w:tc>
@@ -2268,6 +2645,26 @@
       <w:tr>
         <w:tc>
           <w:tcPr>
+            <w:tcW w:type="dxa" w:w="4400"/>
+            <w:tcMar>
+              <w:top w:type="dxa" w:w="80"/>
+              <w:left w:type="dxa" w:w="100"/>
+              <w:bottom w:type="dxa" w:w="80"/>
+              <w:right w:type="dxa" w:w="100"/>
+            </w:tcMar>
+          </w:tcPr>
+          <w:p>
+            <w:r>
+              <w:rPr>
+                <w:sz w:val="19"/>
+                <w:szCs w:val="19"/>
+              </w:rPr>
+              <w:t xml:space="preserve">Portal e Acesso</w:t>
+            </w:r>
+          </w:p>
+        </w:tc>
+        <w:tc>
+          <w:tcPr>
             <w:tcW w:type="dxa" w:w="2600"/>
             <w:tcMar>
               <w:top w:type="dxa" w:w="80"/>
@@ -2282,47 +2679,27 @@
                 <w:sz w:val="19"/>
                 <w:szCs w:val="19"/>
               </w:rPr>
-              <w:t xml:space="preserve">Hospedagem (Railway)</w:t>
-            </w:r>
-          </w:p>
-        </w:tc>
-        <w:tc>
-          <w:tcPr>
-            <w:tcW w:type="dxa" w:w="3800"/>
-            <w:tcMar>
-              <w:top w:type="dxa" w:w="80"/>
-              <w:left w:type="dxa" w:w="100"/>
-              <w:bottom w:type="dxa" w:w="80"/>
-              <w:right w:type="dxa" w:w="100"/>
-            </w:tcMar>
-          </w:tcPr>
-          <w:p>
-            <w:r>
-              <w:rPr>
-                <w:sz w:val="19"/>
-                <w:szCs w:val="19"/>
-              </w:rPr>
-              <w:t xml:space="preserve">Servidor onde o Painel roda: processo web, mais os serviços de fila (worker e agendador) usados pela Gestão de Contratos e de Laboratório, banco de dados e Redis.</w:t>
-            </w:r>
-          </w:p>
-        </w:tc>
-        <w:tc>
-          <w:tcPr>
-            <w:tcW w:type="dxa" w:w="3000"/>
-            <w:tcMar>
-              <w:top w:type="dxa" w:w="80"/>
-              <w:left w:type="dxa" w:w="100"/>
-              <w:bottom w:type="dxa" w:w="80"/>
-              <w:right w:type="dxa" w:w="100"/>
-            </w:tcMar>
-          </w:tcPr>
-          <w:p>
-            <w:r>
-              <w:rPr>
-                <w:sz w:val="19"/>
-                <w:szCs w:val="19"/>
-              </w:rPr>
-              <w:t xml:space="preserve">A partir de US$ 5/mês (plano Hobby) ou US$ 20/mês (plano Pro), mais consumo de processamento/memória — o total varia com o uso.</w:t>
+              <w:t xml:space="preserve">Hospedagem</w:t>
+            </w:r>
+          </w:p>
+        </w:tc>
+        <w:tc>
+          <w:tcPr>
+            <w:tcW w:type="dxa" w:w="2400"/>
+            <w:tcMar>
+              <w:top w:type="dxa" w:w="80"/>
+              <w:left w:type="dxa" w:w="100"/>
+              <w:bottom w:type="dxa" w:w="80"/>
+              <w:right w:type="dxa" w:w="100"/>
+            </w:tcMar>
+          </w:tcPr>
+          <w:p>
+            <w:r>
+              <w:rPr>
+                <w:sz w:val="19"/>
+                <w:szCs w:val="19"/>
+              </w:rPr>
+              <w:t xml:space="preserve">R$ 100</w:t>
             </w:r>
           </w:p>
         </w:tc>
@@ -2330,6 +2707,26 @@
       <w:tr>
         <w:tc>
           <w:tcPr>
+            <w:tcW w:type="dxa" w:w="4400"/>
+            <w:tcMar>
+              <w:top w:type="dxa" w:w="80"/>
+              <w:left w:type="dxa" w:w="100"/>
+              <w:bottom w:type="dxa" w:w="80"/>
+              <w:right w:type="dxa" w:w="100"/>
+            </w:tcMar>
+          </w:tcPr>
+          <w:p>
+            <w:r>
+              <w:rPr>
+                <w:sz w:val="19"/>
+                <w:szCs w:val="19"/>
+              </w:rPr>
+              <w:t xml:space="preserve">Gestão de CME</w:t>
+            </w:r>
+          </w:p>
+        </w:tc>
+        <w:tc>
+          <w:tcPr>
             <w:tcW w:type="dxa" w:w="2600"/>
             <w:tcMar>
               <w:top w:type="dxa" w:w="80"/>
@@ -2344,47 +2741,412 @@
                 <w:sz w:val="19"/>
                 <w:szCs w:val="19"/>
               </w:rPr>
-              <w:t xml:space="preserve">WhatsApp automático (Z-API)</w:t>
-            </w:r>
-          </w:p>
-        </w:tc>
-        <w:tc>
-          <w:tcPr>
-            <w:tcW w:type="dxa" w:w="3800"/>
-            <w:tcMar>
-              <w:top w:type="dxa" w:w="80"/>
-              <w:left w:type="dxa" w:w="100"/>
-              <w:bottom w:type="dxa" w:w="80"/>
-              <w:right w:type="dxa" w:w="100"/>
-            </w:tcMar>
-          </w:tcPr>
-          <w:p>
-            <w:r>
-              <w:rPr>
-                <w:sz w:val="19"/>
-                <w:szCs w:val="19"/>
-              </w:rPr>
-              <w:t xml:space="preserve">Envio automático de mensagens pela Gestão de Laboratório (cobrança de laboratórios atrasados) e pelo Gerador de Contratos (envio do contrato assinado). Opcional — sem ele, o envio manual por link continua funcionando.</w:t>
-            </w:r>
-          </w:p>
-        </w:tc>
-        <w:tc>
-          <w:tcPr>
-            <w:tcW w:type="dxa" w:w="3000"/>
-            <w:tcMar>
-              <w:top w:type="dxa" w:w="80"/>
-              <w:left w:type="dxa" w:w="100"/>
-              <w:bottom w:type="dxa" w:w="80"/>
-              <w:right w:type="dxa" w:w="100"/>
-            </w:tcMar>
-          </w:tcPr>
-          <w:p>
-            <w:r>
-              <w:rPr>
-                <w:sz w:val="19"/>
-                <w:szCs w:val="19"/>
-              </w:rPr>
-              <w:t xml:space="preserve">Aproximadamente R$ 55 a R$ 99 por mês (mensalidade fixa, sem cobrança por mensagem).</w:t>
+              <w:t xml:space="preserve">Hospedagem</w:t>
+            </w:r>
+          </w:p>
+        </w:tc>
+        <w:tc>
+          <w:tcPr>
+            <w:tcW w:type="dxa" w:w="2400"/>
+            <w:tcMar>
+              <w:top w:type="dxa" w:w="80"/>
+              <w:left w:type="dxa" w:w="100"/>
+              <w:bottom w:type="dxa" w:w="80"/>
+              <w:right w:type="dxa" w:w="100"/>
+            </w:tcMar>
+          </w:tcPr>
+          <w:p>
+            <w:r>
+              <w:rPr>
+                <w:sz w:val="19"/>
+                <w:szCs w:val="19"/>
+              </w:rPr>
+              <w:t xml:space="preserve">R$ 100</w:t>
+            </w:r>
+          </w:p>
+        </w:tc>
+      </w:tr>
+      <w:tr>
+        <w:tc>
+          <w:tcPr>
+            <w:tcW w:type="dxa" w:w="4400"/>
+            <w:tcMar>
+              <w:top w:type="dxa" w:w="80"/>
+              <w:left w:type="dxa" w:w="100"/>
+              <w:bottom w:type="dxa" w:w="80"/>
+              <w:right w:type="dxa" w:w="100"/>
+            </w:tcMar>
+          </w:tcPr>
+          <w:p>
+            <w:r>
+              <w:rPr>
+                <w:sz w:val="19"/>
+                <w:szCs w:val="19"/>
+              </w:rPr>
+              <w:t xml:space="preserve">Gestão de Laboratório</w:t>
+            </w:r>
+          </w:p>
+        </w:tc>
+        <w:tc>
+          <w:tcPr>
+            <w:tcW w:type="dxa" w:w="2600"/>
+            <w:tcMar>
+              <w:top w:type="dxa" w:w="80"/>
+              <w:left w:type="dxa" w:w="100"/>
+              <w:bottom w:type="dxa" w:w="80"/>
+              <w:right w:type="dxa" w:w="100"/>
+            </w:tcMar>
+          </w:tcPr>
+          <w:p>
+            <w:r>
+              <w:rPr>
+                <w:sz w:val="19"/>
+                <w:szCs w:val="19"/>
+              </w:rPr>
+              <w:t xml:space="preserve">Hospedagem + WhatsApp</w:t>
+            </w:r>
+          </w:p>
+        </w:tc>
+        <w:tc>
+          <w:tcPr>
+            <w:tcW w:type="dxa" w:w="2400"/>
+            <w:tcMar>
+              <w:top w:type="dxa" w:w="80"/>
+              <w:left w:type="dxa" w:w="100"/>
+              <w:bottom w:type="dxa" w:w="80"/>
+              <w:right w:type="dxa" w:w="100"/>
+            </w:tcMar>
+          </w:tcPr>
+          <w:p>
+            <w:r>
+              <w:rPr>
+                <w:sz w:val="19"/>
+                <w:szCs w:val="19"/>
+              </w:rPr>
+              <w:t xml:space="preserve">R$ 200</w:t>
+            </w:r>
+          </w:p>
+        </w:tc>
+      </w:tr>
+      <w:tr>
+        <w:tc>
+          <w:tcPr>
+            <w:tcW w:type="dxa" w:w="4400"/>
+            <w:tcMar>
+              <w:top w:type="dxa" w:w="80"/>
+              <w:left w:type="dxa" w:w="100"/>
+              <w:bottom w:type="dxa" w:w="80"/>
+              <w:right w:type="dxa" w:w="100"/>
+            </w:tcMar>
+          </w:tcPr>
+          <w:p>
+            <w:r>
+              <w:rPr>
+                <w:sz w:val="19"/>
+                <w:szCs w:val="19"/>
+              </w:rPr>
+              <w:t xml:space="preserve">Gerador de Identificadores de Bancada</w:t>
+            </w:r>
+          </w:p>
+        </w:tc>
+        <w:tc>
+          <w:tcPr>
+            <w:tcW w:type="dxa" w:w="2600"/>
+            <w:tcMar>
+              <w:top w:type="dxa" w:w="80"/>
+              <w:left w:type="dxa" w:w="100"/>
+              <w:bottom w:type="dxa" w:w="80"/>
+              <w:right w:type="dxa" w:w="100"/>
+            </w:tcMar>
+          </w:tcPr>
+          <w:p>
+            <w:r>
+              <w:rPr>
+                <w:sz w:val="19"/>
+                <w:szCs w:val="19"/>
+              </w:rPr>
+              <w:t xml:space="preserve">Hospedagem</w:t>
+            </w:r>
+          </w:p>
+        </w:tc>
+        <w:tc>
+          <w:tcPr>
+            <w:tcW w:type="dxa" w:w="2400"/>
+            <w:tcMar>
+              <w:top w:type="dxa" w:w="80"/>
+              <w:left w:type="dxa" w:w="100"/>
+              <w:bottom w:type="dxa" w:w="80"/>
+              <w:right w:type="dxa" w:w="100"/>
+            </w:tcMar>
+          </w:tcPr>
+          <w:p>
+            <w:r>
+              <w:rPr>
+                <w:sz w:val="19"/>
+                <w:szCs w:val="19"/>
+              </w:rPr>
+              <w:t xml:space="preserve">R$ 100</w:t>
+            </w:r>
+          </w:p>
+        </w:tc>
+      </w:tr>
+      <w:tr>
+        <w:tc>
+          <w:tcPr>
+            <w:tcW w:type="dxa" w:w="4400"/>
+            <w:tcMar>
+              <w:top w:type="dxa" w:w="80"/>
+              <w:left w:type="dxa" w:w="100"/>
+              <w:bottom w:type="dxa" w:w="80"/>
+              <w:right w:type="dxa" w:w="100"/>
+            </w:tcMar>
+          </w:tcPr>
+          <w:p>
+            <w:r>
+              <w:rPr>
+                <w:sz w:val="19"/>
+                <w:szCs w:val="19"/>
+              </w:rPr>
+              <w:t xml:space="preserve">Gerador de Contratos</w:t>
+            </w:r>
+          </w:p>
+        </w:tc>
+        <w:tc>
+          <w:tcPr>
+            <w:tcW w:type="dxa" w:w="2600"/>
+            <w:tcMar>
+              <w:top w:type="dxa" w:w="80"/>
+              <w:left w:type="dxa" w:w="100"/>
+              <w:bottom w:type="dxa" w:w="80"/>
+              <w:right w:type="dxa" w:w="100"/>
+            </w:tcMar>
+          </w:tcPr>
+          <w:p>
+            <w:r>
+              <w:rPr>
+                <w:sz w:val="19"/>
+                <w:szCs w:val="19"/>
+              </w:rPr>
+              <w:t xml:space="preserve">Hospedagem + WhatsApp</w:t>
+            </w:r>
+          </w:p>
+        </w:tc>
+        <w:tc>
+          <w:tcPr>
+            <w:tcW w:type="dxa" w:w="2400"/>
+            <w:tcMar>
+              <w:top w:type="dxa" w:w="80"/>
+              <w:left w:type="dxa" w:w="100"/>
+              <w:bottom w:type="dxa" w:w="80"/>
+              <w:right w:type="dxa" w:w="100"/>
+            </w:tcMar>
+          </w:tcPr>
+          <w:p>
+            <w:r>
+              <w:rPr>
+                <w:sz w:val="19"/>
+                <w:szCs w:val="19"/>
+              </w:rPr>
+              <w:t xml:space="preserve">R$ 200</w:t>
+            </w:r>
+          </w:p>
+        </w:tc>
+      </w:tr>
+    </w:tbl>
+    <w:p>
+      <w:pPr>
+        <w:spacing w:after="160"/>
+      </w:pPr>
+    </w:p>
+    <w:p>
+      <w:pPr>
+        <w:spacing w:after="160" w:line="300"/>
+      </w:pPr>
+      <w:r>
+        <w:rPr>
+          <w:sz w:val="21"/>
+          <w:szCs w:val="21"/>
+        </w:rPr>
+        <w:t xml:space="preserve">Importante: a hospedagem é uma única assinatura, compartilhada por todas as ferramentas — por isso ela se repete nas cinco linhas acima, mas é paga uma única vez, não cinco. Da mesma forma, o WhatsApp automático (Z-API) é uma única assinatura, usada tanto pela Gestão de Laboratório quanto pelo Gerador de Contratos — também paga uma única vez. Por isso, somar a coluna "Custo mensal" diretamente resultaria em um valor bem maior do que o gasto real da plataforma, calculado a seguir.</w:t>
+      </w:r>
+    </w:p>
+    <w:p>
+      <w:pPr>
+        <w:pStyle w:val="Heading2"/>
+        <w:spacing w:after="120" w:before="260"/>
+      </w:pPr>
+      <w:r>
+        <w:rPr>
+          <w:b/>
+          <w:bCs/>
+          <w:color w:val="0B2A57"/>
+          <w:sz w:val="25"/>
+          <w:szCs w:val="25"/>
+        </w:rPr>
+        <w:t xml:space="preserve">4.2. Custo final da plataforma</w:t>
+      </w:r>
+    </w:p>
+    <w:p>
+      <w:pPr>
+        <w:spacing w:after="160" w:line="300"/>
+      </w:pPr>
+      <w:r>
+        <w:rPr>
+          <w:sz w:val="21"/>
+          <w:szCs w:val="21"/>
+        </w:rPr>
+        <w:t xml:space="preserve">Contando cada assinatura uma única vez — independentemente de quantas ferramentas dependem dela —, o gasto real do Painel é:</w:t>
+      </w:r>
+    </w:p>
+    <w:tbl>
+      <w:tblPr>
+        <w:tblW w:type="dxa" w:w="9400"/>
+        <w:tblBorders>
+          <w:top w:val="single" w:color="D9E2EC" w:sz="4"/>
+          <w:left w:val="single" w:color="D9E2EC" w:sz="4"/>
+          <w:bottom w:val="single" w:color="D9E2EC" w:sz="4"/>
+          <w:right w:val="single" w:color="D9E2EC" w:sz="4"/>
+          <w:insideH w:val="single" w:color="D9E2EC" w:sz="4"/>
+          <w:insideV w:val="single" w:color="D9E2EC" w:sz="4"/>
+        </w:tblBorders>
+      </w:tblPr>
+      <w:tblGrid>
+        <w:gridCol w:w="5800"/>
+        <w:gridCol w:w="3600"/>
+      </w:tblGrid>
+      <w:tr>
+        <w:trPr>
+          <w:tblHeader/>
+        </w:trPr>
+        <w:tc>
+          <w:tcPr>
+            <w:tcW w:type="dxa" w:w="5800"/>
+            <w:shd w:fill="0B2A57" w:val="clear"/>
+            <w:tcMar>
+              <w:top w:type="dxa" w:w="80"/>
+              <w:left w:type="dxa" w:w="100"/>
+              <w:bottom w:type="dxa" w:w="80"/>
+              <w:right w:type="dxa" w:w="100"/>
+            </w:tcMar>
+          </w:tcPr>
+          <w:p>
+            <w:r>
+              <w:rPr>
+                <w:b/>
+                <w:bCs/>
+                <w:color w:val="FFFFFF"/>
+                <w:sz w:val="19"/>
+                <w:szCs w:val="19"/>
+              </w:rPr>
+              <w:t xml:space="preserve">Item (assinatura única)</w:t>
+            </w:r>
+          </w:p>
+        </w:tc>
+        <w:tc>
+          <w:tcPr>
+            <w:tcW w:type="dxa" w:w="3600"/>
+            <w:shd w:fill="0B2A57" w:val="clear"/>
+            <w:tcMar>
+              <w:top w:type="dxa" w:w="80"/>
+              <w:left w:type="dxa" w:w="100"/>
+              <w:bottom w:type="dxa" w:w="80"/>
+              <w:right w:type="dxa" w:w="100"/>
+            </w:tcMar>
+          </w:tcPr>
+          <w:p>
+            <w:r>
+              <w:rPr>
+                <w:b/>
+                <w:bCs/>
+                <w:color w:val="FFFFFF"/>
+                <w:sz w:val="19"/>
+                <w:szCs w:val="19"/>
+              </w:rPr>
+              <w:t xml:space="preserve">Custo mensal</w:t>
+            </w:r>
+          </w:p>
+        </w:tc>
+      </w:tr>
+      <w:tr>
+        <w:tc>
+          <w:tcPr>
+            <w:tcW w:type="dxa" w:w="5800"/>
+            <w:tcMar>
+              <w:top w:type="dxa" w:w="80"/>
+              <w:left w:type="dxa" w:w="100"/>
+              <w:bottom w:type="dxa" w:w="80"/>
+              <w:right w:type="dxa" w:w="100"/>
+            </w:tcMar>
+          </w:tcPr>
+          <w:p>
+            <w:r>
+              <w:rPr>
+                <w:sz w:val="19"/>
+                <w:szCs w:val="19"/>
+              </w:rPr>
+              <w:t xml:space="preserve">Hospedagem (Railway) — usada por todas as ferramentas</w:t>
+            </w:r>
+          </w:p>
+        </w:tc>
+        <w:tc>
+          <w:tcPr>
+            <w:tcW w:type="dxa" w:w="3600"/>
+            <w:tcMar>
+              <w:top w:type="dxa" w:w="80"/>
+              <w:left w:type="dxa" w:w="100"/>
+              <w:bottom w:type="dxa" w:w="80"/>
+              <w:right w:type="dxa" w:w="100"/>
+            </w:tcMar>
+          </w:tcPr>
+          <w:p>
+            <w:r>
+              <w:rPr>
+                <w:sz w:val="19"/>
+                <w:szCs w:val="19"/>
+              </w:rPr>
+              <w:t xml:space="preserve">R$ 100</w:t>
+            </w:r>
+          </w:p>
+        </w:tc>
+      </w:tr>
+      <w:tr>
+        <w:tc>
+          <w:tcPr>
+            <w:tcW w:type="dxa" w:w="5800"/>
+            <w:tcMar>
+              <w:top w:type="dxa" w:w="80"/>
+              <w:left w:type="dxa" w:w="100"/>
+              <w:bottom w:type="dxa" w:w="80"/>
+              <w:right w:type="dxa" w:w="100"/>
+            </w:tcMar>
+          </w:tcPr>
+          <w:p>
+            <w:r>
+              <w:rPr>
+                <w:sz w:val="19"/>
+                <w:szCs w:val="19"/>
+              </w:rPr>
+              <w:t xml:space="preserve">WhatsApp automático (Z-API) — usado pela Gestão de Laboratório e pelo Gerador de Contratos</w:t>
+            </w:r>
+          </w:p>
+        </w:tc>
+        <w:tc>
+          <w:tcPr>
+            <w:tcW w:type="dxa" w:w="3600"/>
+            <w:tcMar>
+              <w:top w:type="dxa" w:w="80"/>
+              <w:left w:type="dxa" w:w="100"/>
+              <w:bottom w:type="dxa" w:w="80"/>
+              <w:right w:type="dxa" w:w="100"/>
+            </w:tcMar>
+          </w:tcPr>
+          <w:p>
+            <w:r>
+              <w:rPr>
+                <w:sz w:val="19"/>
+                <w:szCs w:val="19"/>
+              </w:rPr>
+              <w:t xml:space="preserve">R$ 100</w:t>
             </w:r>
           </w:p>
         </w:tc>
@@ -2431,7 +3193,7 @@
                 <w:sz w:val="24"/>
                 <w:szCs w:val="24"/>
               </w:rPr>
-              <w:t xml:space="preserve">Valor final estimado: </w:t>
+              <w:t xml:space="preserve">Custo final da plataforma: </w:t>
             </w:r>
             <w:r>
               <w:rPr>
@@ -2441,7 +3203,7 @@
                 <w:sz w:val="24"/>
                 <w:szCs w:val="24"/>
               </w:rPr>
-              <w:t xml:space="preserve">cerca de R$ 80 a R$ 200 por mês</w:t>
+              <w:t xml:space="preserve">R$ 200 por mês</w:t>
             </w:r>
           </w:p>
           <w:p>
@@ -2454,7 +3216,7 @@
                 <w:sz w:val="21"/>
                 <w:szCs w:val="21"/>
               </w:rPr>
-              <w:t xml:space="preserve">(Hospedagem + WhatsApp automático, convertendo o intervalo do Railway pela cotação de referência de US$ 1 = R$ 5,08). Esse valor não inclui consumo de processamento acima do incluído no plano da Railway, nem eventuais variações cambiais ou reajustes dos fornecedores.</w:t>
+              <w:t xml:space="preserve">(Hospedagem + WhatsApp automático, cada um pago uma única vez, mesmo servindo várias ferramentas ao mesmo tempo. Valores de referência: hospedagem a partir do plano Pro da Railway, ~US$ 20/mês, convertido pela cotação de US$ 1 = R$ 5,08; WhatsApp automático dentro da faixa de R$ 55 a R$ 99/mês pesquisada — ambos arredondados para R$ 100 para facilitar a leitura da tabela. Esse valor não inclui consumo de processamento acima do incluído no plano da Railway, nem eventuais variações cambiais ou reajustes dos fornecedores.)</w:t>
             </w:r>
           </w:p>
         </w:tc>

</xml_diff>

<commit_message>
Documenta cobrança por número no WhatsApp automático (Z-API)
Deixa explícito que o Z-API cobra por número conectado, não por
aplicação: hoje Gestão de Laboratório e Gerador de Contratos dividem
um único número (R$ 100/mês), mas se cada aplicação passar a usar um
número próprio, essa cobrança dobra (nova seção 4.3, com o cenário
alternativo de R$ 300/mês no total da plataforma).
</commit_message>
<xml_diff>
--- a/docs/Ferramentas-Painel-ABO-Goias.docx
+++ b/docs/Ferramentas-Painel-ABO-Goias.docx
@@ -474,7 +474,7 @@
           <w:sz w:val="21"/>
           <w:szCs w:val="21"/>
         </w:rPr>
-        <w:t xml:space="preserve"> — R$ 100/mês. Usado para cobrar automaticamente, uma vez por dia, os laboratórios parceiros com pedidos atrasados.</w:t>
+        <w:t xml:space="preserve"> — R$ 100/mês. Usado para cobrar automaticamente, uma vez por dia, os laboratórios parceiros com pedidos atrasados. Hoje usa o mesmo número (e a mesma assinatura) do Gerador de Contratos — a cobrança é por número conectado, não por aplicação (ver seção 4.3).</w:t>
       </w:r>
     </w:p>
     <w:p>
@@ -694,7 +694,7 @@
           <w:sz w:val="21"/>
           <w:szCs w:val="21"/>
         </w:rPr>
-        <w:t xml:space="preserve"> — R$ 100/mês. Usado para enviar automaticamente o contrato assinado ao paciente.</w:t>
+        <w:t xml:space="preserve"> — R$ 100/mês. Usado para enviar automaticamente o contrato assinado ao paciente. Hoje usa o mesmo número (e a mesma assinatura) da Gestão de Laboratório — a cobrança é por número conectado, não por aplicação (ver seção 4.3).</w:t>
       </w:r>
     </w:p>
     <w:p>
@@ -2545,7 +2545,7 @@
           <w:sz w:val="21"/>
           <w:szCs w:val="21"/>
         </w:rPr>
-        <w:t xml:space="preserve">Cada linha soma o custo de todas as funções pagas daquela aplicação — o detalhamento de cada item está na seção 2, junto da ferramenta correspondente:</w:t>
+        <w:t xml:space="preserve">Cada linha soma o custo de todas as funções pagas daquela aplicação, no cenário de hoje — o detalhamento de cada item está na seção 2, junto da ferramenta correspondente:</w:t>
       </w:r>
     </w:p>
     <w:tbl>
@@ -2967,7 +2967,7 @@
           <w:sz w:val="21"/>
           <w:szCs w:val="21"/>
         </w:rPr>
-        <w:t xml:space="preserve">Importante: a hospedagem é uma única assinatura, compartilhada por todas as ferramentas — por isso ela se repete nas cinco linhas acima, mas é paga uma única vez, não cinco. Da mesma forma, o WhatsApp automático (Z-API) é uma única assinatura, usada tanto pela Gestão de Laboratório quanto pelo Gerador de Contratos — também paga uma única vez. Por isso, somar a coluna "Custo mensal" diretamente resultaria em um valor bem maior do que o gasto real da plataforma, calculado a seguir.</w:t>
+        <w:t xml:space="preserve">Importante: a hospedagem é uma única assinatura, compartilhada por todas as ferramentas — por isso ela se repete nas cinco linhas acima, mas é paga uma única vez, não cinco. Já o WhatsApp automático (Z-API) hoje também é uma única assinatura (um único número), usada tanto pela Gestão de Laboratório quanto pelo Gerador de Contratos — mas, diferente da hospedagem, esse compartilhamento é uma opção, não uma característica do serviço: a seção 4.3 explica como a cobrança muda se cada aplicação passar a usar seu próprio número. Por isso, somar a coluna "Custo mensal" diretamente resultaria em um valor bem maior do que o gasto real da plataforma, calculado a seguir.</w:t>
       </w:r>
     </w:p>
     <w:p>
@@ -2995,7 +2995,7 @@
           <w:sz w:val="21"/>
           <w:szCs w:val="21"/>
         </w:rPr>
-        <w:t xml:space="preserve">Contando cada assinatura uma única vez — independentemente de quantas ferramentas dependem dela —, o gasto real do Painel é:</w:t>
+        <w:t xml:space="preserve">Contando cada assinatura uma única vez — independentemente de quantas ferramentas dependem dela —, o gasto real do Painel hoje é:</w:t>
       </w:r>
     </w:p>
     <w:tbl>
@@ -3126,7 +3126,7 @@
                 <w:sz w:val="19"/>
                 <w:szCs w:val="19"/>
               </w:rPr>
-              <w:t xml:space="preserve">WhatsApp automático (Z-API) — usado pela Gestão de Laboratório e pelo Gerador de Contratos</w:t>
+              <w:t xml:space="preserve">WhatsApp automático (Z-API) — 1 número, usado pela Gestão de Laboratório e pelo Gerador de Contratos</w:t>
             </w:r>
           </w:p>
         </w:tc>
@@ -3216,12 +3216,293 @@
                 <w:sz w:val="21"/>
                 <w:szCs w:val="21"/>
               </w:rPr>
-              <w:t xml:space="preserve">(Hospedagem + WhatsApp automático, cada um pago uma única vez, mesmo servindo várias ferramentas ao mesmo tempo. Valores de referência: hospedagem a partir do plano Pro da Railway, ~US$ 20/mês, convertido pela cotação de US$ 1 = R$ 5,08; WhatsApp automático dentro da faixa de R$ 55 a R$ 99/mês pesquisada — ambos arredondados para R$ 100 para facilitar a leitura da tabela. Esse valor não inclui consumo de processamento acima do incluído no plano da Railway, nem eventuais variações cambiais ou reajustes dos fornecedores.)</w:t>
+              <w:t xml:space="preserve">(Hospedagem + um único número de WhatsApp automático, compartilhado hoje entre a Gestão de Laboratório e o Gerador de Contratos — ver seção 4.3 caso um dia seja necessário separar os números. Valores de referência: hospedagem a partir do plano Pro da Railway, ~US$ 20/mês, convertido pela cotação de US$ 1 = R$ 5,08; WhatsApp automático dentro da faixa de R$ 55 a R$ 99/mês pesquisada — ambos arredondados para R$ 100 para facilitar a leitura da tabela. Esse valor não inclui consumo de processamento acima do incluído no plano da Railway, nem eventuais variações cambiais ou reajustes dos fornecedores.)</w:t>
             </w:r>
           </w:p>
         </w:tc>
       </w:tr>
     </w:tbl>
+    <w:p>
+      <w:pPr>
+        <w:spacing w:after="260"/>
+      </w:pPr>
+    </w:p>
+    <w:p>
+      <w:pPr>
+        <w:pStyle w:val="Heading2"/>
+        <w:spacing w:after="120" w:before="260"/>
+      </w:pPr>
+      <w:r>
+        <w:rPr>
+          <w:b/>
+          <w:bCs/>
+          <w:color w:val="0B2A57"/>
+          <w:sz w:val="25"/>
+          <w:szCs w:val="25"/>
+        </w:rPr>
+        <w:t xml:space="preserve">4.3. Se for necessário um número de WhatsApp por aplicação</w:t>
+      </w:r>
+    </w:p>
+    <w:p>
+      <w:pPr>
+        <w:spacing w:after="160" w:line="300"/>
+      </w:pPr>
+      <w:r>
+        <w:rPr>
+          <w:sz w:val="21"/>
+          <w:szCs w:val="21"/>
+        </w:rPr>
+        <w:t xml:space="preserve">O Z-API cobra por número de WhatsApp conectado à assinatura — não por mensagem enviada, nem por quantidade de aplicações que utilizam esse número. Hoje a Gestão de Laboratório (cobrança de laboratórios atrasados) e o Gerador de Contratos (envio do contrato assinado) dividem o mesmo número e a mesma assinatura — por isso o custo de R$ 100/mês aparece uma única vez na seção 4.2.</w:t>
+      </w:r>
+    </w:p>
+    <w:p>
+      <w:pPr>
+        <w:spacing w:after="160" w:line="300"/>
+      </w:pPr>
+      <w:r>
+        <w:rPr>
+          <w:sz w:val="21"/>
+          <w:szCs w:val="21"/>
+        </w:rPr>
+        <w:t xml:space="preserve">Se um dia for necessário um número próprio para cada aplicação — por exemplo, para separar o WhatsApp usado com laboratórios parceiros do usado com pacientes —, o Z-API passa a cobrar uma assinatura individual para cada número conectado. Nesse cenário, o item "WhatsApp automático" dobra, e o custo final da plataforma passa a ser:</w:t>
+      </w:r>
+    </w:p>
+    <w:tbl>
+      <w:tblPr>
+        <w:tblW w:type="dxa" w:w="9600"/>
+        <w:tblBorders>
+          <w:top w:val="single" w:color="D9E2EC" w:sz="4"/>
+          <w:left w:val="single" w:color="D9E2EC" w:sz="4"/>
+          <w:bottom w:val="single" w:color="D9E2EC" w:sz="4"/>
+          <w:right w:val="single" w:color="D9E2EC" w:sz="4"/>
+          <w:insideH w:val="single" w:color="D9E2EC" w:sz="4"/>
+          <w:insideV w:val="single" w:color="D9E2EC" w:sz="4"/>
+        </w:tblBorders>
+      </w:tblPr>
+      <w:tblGrid>
+        <w:gridCol w:w="4200"/>
+        <w:gridCol w:w="2700"/>
+        <w:gridCol w:w="2700"/>
+      </w:tblGrid>
+      <w:tr>
+        <w:trPr>
+          <w:tblHeader/>
+        </w:trPr>
+        <w:tc>
+          <w:tcPr>
+            <w:tcW w:type="dxa" w:w="4200"/>
+            <w:shd w:fill="0B2A57" w:val="clear"/>
+            <w:tcMar>
+              <w:top w:type="dxa" w:w="80"/>
+              <w:left w:type="dxa" w:w="100"/>
+              <w:bottom w:type="dxa" w:w="80"/>
+              <w:right w:type="dxa" w:w="100"/>
+            </w:tcMar>
+          </w:tcPr>
+          <w:p>
+            <w:r>
+              <w:rPr>
+                <w:b/>
+                <w:bCs/>
+                <w:color w:val="FFFFFF"/>
+                <w:sz w:val="19"/>
+                <w:szCs w:val="19"/>
+              </w:rPr>
+              <w:t xml:space="preserve">Cenário</w:t>
+            </w:r>
+          </w:p>
+        </w:tc>
+        <w:tc>
+          <w:tcPr>
+            <w:tcW w:type="dxa" w:w="2700"/>
+            <w:shd w:fill="0B2A57" w:val="clear"/>
+            <w:tcMar>
+              <w:top w:type="dxa" w:w="80"/>
+              <w:left w:type="dxa" w:w="100"/>
+              <w:bottom w:type="dxa" w:w="80"/>
+              <w:right w:type="dxa" w:w="100"/>
+            </w:tcMar>
+          </w:tcPr>
+          <w:p>
+            <w:r>
+              <w:rPr>
+                <w:b/>
+                <w:bCs/>
+                <w:color w:val="FFFFFF"/>
+                <w:sz w:val="19"/>
+                <w:szCs w:val="19"/>
+              </w:rPr>
+              <w:t xml:space="preserve">Itens</w:t>
+            </w:r>
+          </w:p>
+        </w:tc>
+        <w:tc>
+          <w:tcPr>
+            <w:tcW w:type="dxa" w:w="2700"/>
+            <w:shd w:fill="0B2A57" w:val="clear"/>
+            <w:tcMar>
+              <w:top w:type="dxa" w:w="80"/>
+              <w:left w:type="dxa" w:w="100"/>
+              <w:bottom w:type="dxa" w:w="80"/>
+              <w:right w:type="dxa" w:w="100"/>
+            </w:tcMar>
+          </w:tcPr>
+          <w:p>
+            <w:r>
+              <w:rPr>
+                <w:b/>
+                <w:bCs/>
+                <w:color w:val="FFFFFF"/>
+                <w:sz w:val="19"/>
+                <w:szCs w:val="19"/>
+              </w:rPr>
+              <w:t xml:space="preserve">Custo mensal</w:t>
+            </w:r>
+          </w:p>
+        </w:tc>
+      </w:tr>
+      <w:tr>
+        <w:tc>
+          <w:tcPr>
+            <w:tcW w:type="dxa" w:w="4200"/>
+            <w:tcMar>
+              <w:top w:type="dxa" w:w="80"/>
+              <w:left w:type="dxa" w:w="100"/>
+              <w:bottom w:type="dxa" w:w="80"/>
+              <w:right w:type="dxa" w:w="100"/>
+            </w:tcMar>
+          </w:tcPr>
+          <w:p>
+            <w:r>
+              <w:rPr>
+                <w:sz w:val="19"/>
+                <w:szCs w:val="19"/>
+              </w:rPr>
+              <w:t xml:space="preserve">Número único (atual)</w:t>
+            </w:r>
+          </w:p>
+        </w:tc>
+        <w:tc>
+          <w:tcPr>
+            <w:tcW w:type="dxa" w:w="2700"/>
+            <w:tcMar>
+              <w:top w:type="dxa" w:w="80"/>
+              <w:left w:type="dxa" w:w="100"/>
+              <w:bottom w:type="dxa" w:w="80"/>
+              <w:right w:type="dxa" w:w="100"/>
+            </w:tcMar>
+          </w:tcPr>
+          <w:p>
+            <w:r>
+              <w:rPr>
+                <w:sz w:val="19"/>
+                <w:szCs w:val="19"/>
+              </w:rPr>
+              <w:t xml:space="preserve">Hospedagem + 1 número de WhatsApp</w:t>
+            </w:r>
+          </w:p>
+        </w:tc>
+        <w:tc>
+          <w:tcPr>
+            <w:tcW w:type="dxa" w:w="2700"/>
+            <w:tcMar>
+              <w:top w:type="dxa" w:w="80"/>
+              <w:left w:type="dxa" w:w="100"/>
+              <w:bottom w:type="dxa" w:w="80"/>
+              <w:right w:type="dxa" w:w="100"/>
+            </w:tcMar>
+          </w:tcPr>
+          <w:p>
+            <w:r>
+              <w:rPr>
+                <w:sz w:val="19"/>
+                <w:szCs w:val="19"/>
+              </w:rPr>
+              <w:t xml:space="preserve">R$ 200</w:t>
+            </w:r>
+          </w:p>
+        </w:tc>
+      </w:tr>
+      <w:tr>
+        <w:tc>
+          <w:tcPr>
+            <w:tcW w:type="dxa" w:w="4200"/>
+            <w:tcMar>
+              <w:top w:type="dxa" w:w="80"/>
+              <w:left w:type="dxa" w:w="100"/>
+              <w:bottom w:type="dxa" w:w="80"/>
+              <w:right w:type="dxa" w:w="100"/>
+            </w:tcMar>
+          </w:tcPr>
+          <w:p>
+            <w:r>
+              <w:rPr>
+                <w:sz w:val="19"/>
+                <w:szCs w:val="19"/>
+              </w:rPr>
+              <w:t xml:space="preserve">Um número por aplicação</w:t>
+            </w:r>
+          </w:p>
+        </w:tc>
+        <w:tc>
+          <w:tcPr>
+            <w:tcW w:type="dxa" w:w="2700"/>
+            <w:tcMar>
+              <w:top w:type="dxa" w:w="80"/>
+              <w:left w:type="dxa" w:w="100"/>
+              <w:bottom w:type="dxa" w:w="80"/>
+              <w:right w:type="dxa" w:w="100"/>
+            </w:tcMar>
+          </w:tcPr>
+          <w:p>
+            <w:r>
+              <w:rPr>
+                <w:sz w:val="19"/>
+                <w:szCs w:val="19"/>
+              </w:rPr>
+              <w:t xml:space="preserve">Hospedagem + 2 números de WhatsApp</w:t>
+            </w:r>
+          </w:p>
+        </w:tc>
+        <w:tc>
+          <w:tcPr>
+            <w:tcW w:type="dxa" w:w="2700"/>
+            <w:tcMar>
+              <w:top w:type="dxa" w:w="80"/>
+              <w:left w:type="dxa" w:w="100"/>
+              <w:bottom w:type="dxa" w:w="80"/>
+              <w:right w:type="dxa" w:w="100"/>
+            </w:tcMar>
+          </w:tcPr>
+          <w:p>
+            <w:r>
+              <w:rPr>
+                <w:sz w:val="19"/>
+                <w:szCs w:val="19"/>
+              </w:rPr>
+              <w:t xml:space="preserve">R$ 300</w:t>
+            </w:r>
+          </w:p>
+        </w:tc>
+      </w:tr>
+    </w:tbl>
+    <w:p>
+      <w:pPr>
+        <w:spacing w:after="160"/>
+      </w:pPr>
+    </w:p>
+    <w:p>
+      <w:pPr>
+        <w:spacing w:after="160" w:line="300"/>
+      </w:pPr>
+      <w:r>
+        <w:rPr>
+          <w:sz w:val="21"/>
+          <w:szCs w:val="21"/>
+        </w:rPr>
+        <w:t xml:space="preserve">Ou seja: separar os números soma mais R$ 100/mês ao custo da plataforma — o valor de uma segunda assinatura Z-API —, sem alterar o custo de hospedagem.</w:t>
+      </w:r>
+    </w:p>
     <w:p>
       <w:r>
         <w:br w:type="page"/>

</xml_diff>

<commit_message>
Adiciona cenário de hospedagem em Intranet existente e reforça custo fixo dos contratos
Nova seção 4.4 explica que, se as ferramentas forem migradas para uma
Intranet já hospedada, o custo de hospedagem deixa de existir e o
custo final da plataforma passa a depender só do WhatsApp (Z-API).
Também deixa explícito, na seção do Gerador de Contratos, que o custo
é fixo por mês e não varia com a quantidade de contratos gerados ou
assinados.
</commit_message>
<xml_diff>
--- a/docs/Ferramentas-Painel-ABO-Goias.docx
+++ b/docs/Ferramentas-Painel-ABO-Goias.docx
@@ -710,6 +710,18 @@
           <w:szCs w:val="21"/>
         </w:rPr>
         <w:t xml:space="preserve">Total: R$ 200/mês. O envio por e-mail (alternativa ao WhatsApp) e a assinatura digital e o carimbo de tempo não têm custo adicional hoje.</w:t>
+      </w:r>
+    </w:p>
+    <w:p>
+      <w:pPr>
+        <w:spacing w:after="160" w:line="300"/>
+      </w:pPr>
+      <w:r>
+        <w:rPr>
+          <w:sz w:val="21"/>
+          <w:szCs w:val="21"/>
+        </w:rPr>
+        <w:t xml:space="preserve">Esse custo é fixo, não por documento: gerar e assinar mais contratos no mês — um só ou várias centenas — não aumenta a fatura da hospedagem nem a do WhatsApp. Diferente da maioria das plataformas de assinatura do mercado (seção 3.4), que cobram por envelope ou por documento, aqui a assinatura digital em si (geração do PDF, hash, carimbo de tempo) não tem nenhum custo associado ao volume de contratos gerados.</w:t>
       </w:r>
     </w:p>
     <w:p>
@@ -3501,6 +3513,344 @@
           <w:szCs w:val="21"/>
         </w:rPr>
         <w:t xml:space="preserve">Ou seja: separar os números soma mais R$ 100/mês ao custo da plataforma — o valor de uma segunda assinatura Z-API —, sem alterar o custo de hospedagem.</w:t>
+      </w:r>
+    </w:p>
+    <w:p>
+      <w:pPr>
+        <w:pStyle w:val="Heading2"/>
+        <w:spacing w:after="120" w:before="260"/>
+      </w:pPr>
+      <w:r>
+        <w:rPr>
+          <w:b/>
+          <w:bCs/>
+          <w:color w:val="0B2A57"/>
+          <w:sz w:val="25"/>
+          <w:szCs w:val="25"/>
+        </w:rPr>
+        <w:t xml:space="preserve">4.4. Se as ferramentas forem hospedadas em outra Intranet já existente</w:t>
+      </w:r>
+    </w:p>
+    <w:p>
+      <w:pPr>
+        <w:spacing w:after="160" w:line="300"/>
+      </w:pPr>
+      <w:r>
+        <w:rPr>
+          <w:sz w:val="21"/>
+          <w:szCs w:val="21"/>
+        </w:rPr>
+        <w:t xml:space="preserve">Todo o custo de hospedagem apresentado acima (R$ 100/mês) existe porque hoje o Painel roda em um servidor próprio, dedicado (Railway). Caso essas mesmas funcionalidades sejam repassadas para rodar dentro de outra Intranet que a ABO Goiás já mantém e já paga por outro motivo — ou seja, sem a necessidade de contratar um servidor exclusivo para o Painel —, esse item deixa de ser um custo gerado por esta plataforma: a estrutura já existe e já está sendo paga independentemente dela.</w:t>
+      </w:r>
+    </w:p>
+    <w:p>
+      <w:pPr>
+        <w:spacing w:after="160" w:line="300"/>
+      </w:pPr>
+      <w:r>
+        <w:rPr>
+          <w:sz w:val="21"/>
+          <w:szCs w:val="21"/>
+        </w:rPr>
+        <w:t xml:space="preserve">Nesse cenário, o único custo que permanece é o WhatsApp automático (Z-API), por ser um serviço externo contratado à parte — independente de onde o sistema esteja hospedado, ele continua sendo necessário para o envio automático de mensagens (cobrança de laboratórios atrasados e envio de contratos assinados) e continua gerando a mesma cobrança já detalhada nas seções 4.2 e 4.3:</w:t>
+      </w:r>
+    </w:p>
+    <w:tbl>
+      <w:tblPr>
+        <w:tblW w:type="dxa" w:w="9600"/>
+        <w:tblBorders>
+          <w:top w:val="single" w:color="D9E2EC" w:sz="4"/>
+          <w:left w:val="single" w:color="D9E2EC" w:sz="4"/>
+          <w:bottom w:val="single" w:color="D9E2EC" w:sz="4"/>
+          <w:right w:val="single" w:color="D9E2EC" w:sz="4"/>
+          <w:insideH w:val="single" w:color="D9E2EC" w:sz="4"/>
+          <w:insideV w:val="single" w:color="D9E2EC" w:sz="4"/>
+        </w:tblBorders>
+      </w:tblPr>
+      <w:tblGrid>
+        <w:gridCol w:w="4600"/>
+        <w:gridCol w:w="2700"/>
+        <w:gridCol w:w="2300"/>
+      </w:tblGrid>
+      <w:tr>
+        <w:trPr>
+          <w:tblHeader/>
+        </w:trPr>
+        <w:tc>
+          <w:tcPr>
+            <w:tcW w:type="dxa" w:w="4600"/>
+            <w:shd w:fill="0B2A57" w:val="clear"/>
+            <w:tcMar>
+              <w:top w:type="dxa" w:w="80"/>
+              <w:left w:type="dxa" w:w="100"/>
+              <w:bottom w:type="dxa" w:w="80"/>
+              <w:right w:type="dxa" w:w="100"/>
+            </w:tcMar>
+          </w:tcPr>
+          <w:p>
+            <w:r>
+              <w:rPr>
+                <w:b/>
+                <w:bCs/>
+                <w:color w:val="FFFFFF"/>
+                <w:sz w:val="19"/>
+                <w:szCs w:val="19"/>
+              </w:rPr>
+              <w:t xml:space="preserve">Cenário de hospedagem</w:t>
+            </w:r>
+          </w:p>
+        </w:tc>
+        <w:tc>
+          <w:tcPr>
+            <w:tcW w:type="dxa" w:w="2700"/>
+            <w:shd w:fill="0B2A57" w:val="clear"/>
+            <w:tcMar>
+              <w:top w:type="dxa" w:w="80"/>
+              <w:left w:type="dxa" w:w="100"/>
+              <w:bottom w:type="dxa" w:w="80"/>
+              <w:right w:type="dxa" w:w="100"/>
+            </w:tcMar>
+          </w:tcPr>
+          <w:p>
+            <w:r>
+              <w:rPr>
+                <w:b/>
+                <w:bCs/>
+                <w:color w:val="FFFFFF"/>
+                <w:sz w:val="19"/>
+                <w:szCs w:val="19"/>
+              </w:rPr>
+              <w:t xml:space="preserve">Itens pagos</w:t>
+            </w:r>
+          </w:p>
+        </w:tc>
+        <w:tc>
+          <w:tcPr>
+            <w:tcW w:type="dxa" w:w="2300"/>
+            <w:shd w:fill="0B2A57" w:val="clear"/>
+            <w:tcMar>
+              <w:top w:type="dxa" w:w="80"/>
+              <w:left w:type="dxa" w:w="100"/>
+              <w:bottom w:type="dxa" w:w="80"/>
+              <w:right w:type="dxa" w:w="100"/>
+            </w:tcMar>
+          </w:tcPr>
+          <w:p>
+            <w:r>
+              <w:rPr>
+                <w:b/>
+                <w:bCs/>
+                <w:color w:val="FFFFFF"/>
+                <w:sz w:val="19"/>
+                <w:szCs w:val="19"/>
+              </w:rPr>
+              <w:t xml:space="preserve">Custo mensal</w:t>
+            </w:r>
+          </w:p>
+        </w:tc>
+      </w:tr>
+      <w:tr>
+        <w:tc>
+          <w:tcPr>
+            <w:tcW w:type="dxa" w:w="4600"/>
+            <w:tcMar>
+              <w:top w:type="dxa" w:w="80"/>
+              <w:left w:type="dxa" w:w="100"/>
+              <w:bottom w:type="dxa" w:w="80"/>
+              <w:right w:type="dxa" w:w="100"/>
+            </w:tcMar>
+          </w:tcPr>
+          <w:p>
+            <w:r>
+              <w:rPr>
+                <w:sz w:val="19"/>
+                <w:szCs w:val="19"/>
+              </w:rPr>
+              <w:t xml:space="preserve">Servidor próprio (atual)</w:t>
+            </w:r>
+          </w:p>
+        </w:tc>
+        <w:tc>
+          <w:tcPr>
+            <w:tcW w:type="dxa" w:w="2700"/>
+            <w:tcMar>
+              <w:top w:type="dxa" w:w="80"/>
+              <w:left w:type="dxa" w:w="100"/>
+              <w:bottom w:type="dxa" w:w="80"/>
+              <w:right w:type="dxa" w:w="100"/>
+            </w:tcMar>
+          </w:tcPr>
+          <w:p>
+            <w:r>
+              <w:rPr>
+                <w:sz w:val="19"/>
+                <w:szCs w:val="19"/>
+              </w:rPr>
+              <w:t xml:space="preserve">Hospedagem + WhatsApp</w:t>
+            </w:r>
+          </w:p>
+        </w:tc>
+        <w:tc>
+          <w:tcPr>
+            <w:tcW w:type="dxa" w:w="2300"/>
+            <w:tcMar>
+              <w:top w:type="dxa" w:w="80"/>
+              <w:left w:type="dxa" w:w="100"/>
+              <w:bottom w:type="dxa" w:w="80"/>
+              <w:right w:type="dxa" w:w="100"/>
+            </w:tcMar>
+          </w:tcPr>
+          <w:p>
+            <w:r>
+              <w:rPr>
+                <w:sz w:val="19"/>
+                <w:szCs w:val="19"/>
+              </w:rPr>
+              <w:t xml:space="preserve">R$ 200</w:t>
+            </w:r>
+          </w:p>
+        </w:tc>
+      </w:tr>
+      <w:tr>
+        <w:tc>
+          <w:tcPr>
+            <w:tcW w:type="dxa" w:w="4600"/>
+            <w:tcMar>
+              <w:top w:type="dxa" w:w="80"/>
+              <w:left w:type="dxa" w:w="100"/>
+              <w:bottom w:type="dxa" w:w="80"/>
+              <w:right w:type="dxa" w:w="100"/>
+            </w:tcMar>
+          </w:tcPr>
+          <w:p>
+            <w:r>
+              <w:rPr>
+                <w:sz w:val="19"/>
+                <w:szCs w:val="19"/>
+              </w:rPr>
+              <w:t xml:space="preserve">Intranet já existente, número único de WhatsApp</w:t>
+            </w:r>
+          </w:p>
+        </w:tc>
+        <w:tc>
+          <w:tcPr>
+            <w:tcW w:type="dxa" w:w="2700"/>
+            <w:tcMar>
+              <w:top w:type="dxa" w:w="80"/>
+              <w:left w:type="dxa" w:w="100"/>
+              <w:bottom w:type="dxa" w:w="80"/>
+              <w:right w:type="dxa" w:w="100"/>
+            </w:tcMar>
+          </w:tcPr>
+          <w:p>
+            <w:r>
+              <w:rPr>
+                <w:sz w:val="19"/>
+                <w:szCs w:val="19"/>
+              </w:rPr>
+              <w:t xml:space="preserve">Apenas WhatsApp</w:t>
+            </w:r>
+          </w:p>
+        </w:tc>
+        <w:tc>
+          <w:tcPr>
+            <w:tcW w:type="dxa" w:w="2300"/>
+            <w:tcMar>
+              <w:top w:type="dxa" w:w="80"/>
+              <w:left w:type="dxa" w:w="100"/>
+              <w:bottom w:type="dxa" w:w="80"/>
+              <w:right w:type="dxa" w:w="100"/>
+            </w:tcMar>
+          </w:tcPr>
+          <w:p>
+            <w:r>
+              <w:rPr>
+                <w:sz w:val="19"/>
+                <w:szCs w:val="19"/>
+              </w:rPr>
+              <w:t xml:space="preserve">R$ 100</w:t>
+            </w:r>
+          </w:p>
+        </w:tc>
+      </w:tr>
+      <w:tr>
+        <w:tc>
+          <w:tcPr>
+            <w:tcW w:type="dxa" w:w="4600"/>
+            <w:tcMar>
+              <w:top w:type="dxa" w:w="80"/>
+              <w:left w:type="dxa" w:w="100"/>
+              <w:bottom w:type="dxa" w:w="80"/>
+              <w:right w:type="dxa" w:w="100"/>
+            </w:tcMar>
+          </w:tcPr>
+          <w:p>
+            <w:r>
+              <w:rPr>
+                <w:sz w:val="19"/>
+                <w:szCs w:val="19"/>
+              </w:rPr>
+              <w:t xml:space="preserve">Intranet já existente, um número por aplicação</w:t>
+            </w:r>
+          </w:p>
+        </w:tc>
+        <w:tc>
+          <w:tcPr>
+            <w:tcW w:type="dxa" w:w="2700"/>
+            <w:tcMar>
+              <w:top w:type="dxa" w:w="80"/>
+              <w:left w:type="dxa" w:w="100"/>
+              <w:bottom w:type="dxa" w:w="80"/>
+              <w:right w:type="dxa" w:w="100"/>
+            </w:tcMar>
+          </w:tcPr>
+          <w:p>
+            <w:r>
+              <w:rPr>
+                <w:sz w:val="19"/>
+                <w:szCs w:val="19"/>
+              </w:rPr>
+              <w:t xml:space="preserve">Apenas WhatsApp (2 números)</w:t>
+            </w:r>
+          </w:p>
+        </w:tc>
+        <w:tc>
+          <w:tcPr>
+            <w:tcW w:type="dxa" w:w="2300"/>
+            <w:tcMar>
+              <w:top w:type="dxa" w:w="80"/>
+              <w:left w:type="dxa" w:w="100"/>
+              <w:bottom w:type="dxa" w:w="80"/>
+              <w:right w:type="dxa" w:w="100"/>
+            </w:tcMar>
+          </w:tcPr>
+          <w:p>
+            <w:r>
+              <w:rPr>
+                <w:sz w:val="19"/>
+                <w:szCs w:val="19"/>
+              </w:rPr>
+              <w:t xml:space="preserve">R$ 200</w:t>
+            </w:r>
+          </w:p>
+        </w:tc>
+      </w:tr>
+    </w:tbl>
+    <w:p>
+      <w:pPr>
+        <w:spacing w:after="160"/>
+      </w:pPr>
+    </w:p>
+    <w:p>
+      <w:pPr>
+        <w:spacing w:after="160" w:line="300"/>
+      </w:pPr>
+      <w:r>
+        <w:rPr>
+          <w:sz w:val="21"/>
+          <w:szCs w:val="21"/>
+        </w:rPr>
+        <w:t xml:space="preserve">Ou seja: migrar a hospedagem para uma Intranet já existente elimina o item "Hospedagem" do custo da plataforma — o custo final passaria a depender somente do WhatsApp automático, com valor de R$ 100 ou R$ 200/mês conforme o número de WhatsApp seja único ou separado por aplicação (seção 4.3). Nenhuma outra ferramenta do Painel teria custo remanescente nesse cenário.</w:t>
       </w:r>
     </w:p>
     <w:p>

</xml_diff>

<commit_message>
Incorpora ferramentas externas ao documento de ferramentas e resume custo final
Adiciona as seções de Gestão de Usuários, Fechamento do CAP e Cálculo
da Coordenação (desenvolvidas fora deste repositório) com seu próprio
custo mensal, deixa explícito no início do documento quais ferramentas
têm código-fonte aqui e quais não têm, atualiza a tabela de custo por
aplicação e as menções ao compartilhamento do número de WhatsApp para
refletir as 3 aplicações que hoje o usam. Reestrutura a seção de custo
final (4.2-4.4 viraram 4.2-4.3) numa comparação direta e objetiva:
custo atual da plataforma vs. custo na Intranet existente.
</commit_message>
<xml_diff>
--- a/docs/Ferramentas-Painel-ABO-Goias.docx
+++ b/docs/Ferramentas-Painel-ABO-Goias.docx
@@ -93,7 +93,7 @@
           <w:sz w:val="21"/>
           <w:szCs w:val="21"/>
         </w:rPr>
-        <w:t xml:space="preserve">Data: 22 de julho de 2026</w:t>
+        <w:t xml:space="preserve">Data: 24 de julho de 2026</w:t>
       </w:r>
     </w:p>
     <w:p>
@@ -142,6 +142,18 @@
           <w:szCs w:val="21"/>
         </w:rPr>
         <w:t xml:space="preserve">Todas as ferramentas descritas neste documento foram desenvolvidas internamente (sob medida para a rotina da clínica), o que significa que não há mensalidade de licença para o sistema em si — o Painel roda em um servidor próprio e só recorre a serviços externos pagos em pontos pontuais e claramente identificados (seção 4).</w:t>
+      </w:r>
+    </w:p>
+    <w:p>
+      <w:pPr>
+        <w:spacing w:after="160" w:line="300"/>
+      </w:pPr>
+      <w:r>
+        <w:rPr>
+          <w:sz w:val="21"/>
+          <w:szCs w:val="21"/>
+        </w:rPr>
+        <w:t xml:space="preserve">Nem toda ferramenta listada abaixo tem o código-fonte neste repositório: Portal, Gestão de CME, Gestão de Laboratório, Gerador de Identificadores de Bancada e Gerador de Contratos são mantidos aqui; Gestão de Usuários, Fechamento do CAP e Cálculo da Coordenação foram desenvolvidos à parte, fora deste repositório. Estão descritos neste documento para consolidar, num só lugar, o panorama completo de funcionalidade e custo de todas as automações já em uso na ABO Goiás.</w:t>
       </w:r>
     </w:p>
     <w:p>
@@ -285,7 +297,7 @@
           <w:sz w:val="25"/>
           <w:szCs w:val="25"/>
         </w:rPr>
-        <w:t xml:space="preserve">2.2. Gestão de CME (Central de Materiais e Esterilização)</w:t>
+        <w:t xml:space="preserve">2.2. Gestão de CME (Controle de Material em Esterilização)</w:t>
       </w:r>
     </w:p>
     <w:p>
@@ -382,7 +394,7 @@
           <w:sz w:val="25"/>
           <w:szCs w:val="25"/>
         </w:rPr>
-        <w:t xml:space="preserve">2.3. Gestão de Laboratório</w:t>
+        <w:t xml:space="preserve">2.3. Gestão de Laboratório (Controle de Material em Laboratório)</w:t>
       </w:r>
     </w:p>
     <w:p>
@@ -474,7 +486,7 @@
           <w:sz w:val="21"/>
           <w:szCs w:val="21"/>
         </w:rPr>
-        <w:t xml:space="preserve"> — R$ 100/mês. Usado para cobrar automaticamente, uma vez por dia, os laboratórios parceiros com pedidos atrasados. Hoje usa o mesmo número (e a mesma assinatura) do Gerador de Contratos — a cobrança é por número conectado, não por aplicação (ver seção 4.3).</w:t>
+        <w:t xml:space="preserve"> — R$ 100/mês. Usado para cobrar automaticamente, uma vez por dia, os laboratórios parceiros com pedidos atrasados. Hoje usa o mesmo número (e a mesma assinatura) do Gerador de Contratos e do Fechamento do CAP — a cobrança é por número conectado, não por aplicação (ver seção 4.3).</w:t>
       </w:r>
     </w:p>
     <w:p>
@@ -602,31 +614,31 @@
           <w:sz w:val="25"/>
           <w:szCs w:val="25"/>
         </w:rPr>
-        <w:t xml:space="preserve">2.5. Gerador de Contratos e Termos de Consentimento</w:t>
-      </w:r>
-    </w:p>
-    <w:p>
-      <w:pPr>
-        <w:spacing w:after="160" w:line="300"/>
-      </w:pPr>
-      <w:r>
-        <w:rPr>
-          <w:sz w:val="21"/>
-          <w:szCs w:val="21"/>
-        </w:rPr>
-        <w:t xml:space="preserve">O que é: gera contratos e termos de consentimento odontológico personalizados para cada paciente e conduz a assinatura digital do documento, sem precisar de papel nem de outro programa.</w:t>
-      </w:r>
-    </w:p>
-    <w:p>
-      <w:pPr>
-        <w:spacing w:after="160" w:line="300"/>
-      </w:pPr>
-      <w:r>
-        <w:rPr>
-          <w:sz w:val="21"/>
-          <w:szCs w:val="21"/>
-        </w:rPr>
-        <w:t xml:space="preserve">Contexto de uso: usado pelos colaboradores da recepção/clínica no momento do atendimento. O sistema monta o documento com os dados do paciente e do procedimento, e o paciente assina na hora — pelo próprio celular, lendo um QR Code, ou num totem dedicado da clínica —, com o arquivo assinado sendo enviado automaticamente ao Dental Office e por WhatsApp. Por ser a ferramenta mais recente e a que envolve validade jurídica, ela é detalhada em profundidade na próxima seção.</w:t>
+        <w:t xml:space="preserve">2.5. Gestão de Usuários</w:t>
+      </w:r>
+    </w:p>
+    <w:p>
+      <w:pPr>
+        <w:spacing w:after="160" w:line="300"/>
+      </w:pPr>
+      <w:r>
+        <w:rPr>
+          <w:sz w:val="21"/>
+          <w:szCs w:val="21"/>
+        </w:rPr>
+        <w:t xml:space="preserve">O que é: automação auxiliar para descadastrar ou recadastrar o acesso de um aluno no Dental Office (sistema de acesso de alunos), com base em critérios vindos do Eduq — férias, cancelamento de matrícula, finalização de turma ou inadimplência. Substitui o processo manual de checar o Eduq e o Dental Office em abas separadas.</w:t>
+      </w:r>
+    </w:p>
+    <w:p>
+      <w:pPr>
+        <w:spacing w:after="160" w:line="300"/>
+      </w:pPr>
+      <w:r>
+        <w:rPr>
+          <w:sz w:val="21"/>
+          <w:szCs w:val="21"/>
+        </w:rPr>
+        <w:t xml:space="preserve">Contexto de uso: um colaborador da ABO usa a ferramenta para cadastrar ou descadastrar em lote o acesso de alunos no Dental Office, a partir dos mesmos critérios (férias, cancelamento de matrícula, finalização de turma ou inadimplência no Eduq), sem precisar checar os dois sistemas manualmente.</w:t>
       </w:r>
     </w:p>
     <w:p>
@@ -673,6 +685,77 @@
     </w:p>
     <w:p>
       <w:pPr>
+        <w:spacing w:after="160" w:line="300"/>
+      </w:pPr>
+      <w:r>
+        <w:rPr>
+          <w:b/>
+          <w:bCs/>
+          <w:color w:val="0B2A57"/>
+          <w:sz w:val="21"/>
+          <w:szCs w:val="21"/>
+        </w:rPr>
+        <w:t xml:space="preserve">Total: R$ 100/mês.</w:t>
+      </w:r>
+    </w:p>
+    <w:p>
+      <w:pPr>
+        <w:pStyle w:val="Heading2"/>
+        <w:spacing w:after="120" w:before="260"/>
+      </w:pPr>
+      <w:r>
+        <w:rPr>
+          <w:b/>
+          <w:bCs/>
+          <w:color w:val="0B2A57"/>
+          <w:sz w:val="25"/>
+          <w:szCs w:val="25"/>
+        </w:rPr>
+        <w:t xml:space="preserve">2.6. Fechamento do CAP</w:t>
+      </w:r>
+    </w:p>
+    <w:p>
+      <w:pPr>
+        <w:spacing w:after="160" w:line="300"/>
+      </w:pPr>
+      <w:r>
+        <w:rPr>
+          <w:sz w:val="21"/>
+          <w:szCs w:val="21"/>
+        </w:rPr>
+        <w:t xml:space="preserve">O que é: processo de fechamento do caixa do Dental Office.</w:t>
+      </w:r>
+    </w:p>
+    <w:p>
+      <w:pPr>
+        <w:spacing w:after="160" w:line="300"/>
+      </w:pPr>
+      <w:r>
+        <w:rPr>
+          <w:sz w:val="21"/>
+          <w:szCs w:val="21"/>
+        </w:rPr>
+        <w:t xml:space="preserve">Contexto de uso: o colaborador recebe, por WhatsApp, um relatório com o fechamento do caixa feito no Dental Office.</w:t>
+      </w:r>
+    </w:p>
+    <w:p>
+      <w:pPr>
+        <w:pStyle w:val="Heading3"/>
+        <w:spacing w:after="100" w:before="200"/>
+      </w:pPr>
+      <w:r>
+        <w:rPr>
+          <w:b/>
+          <w:bCs/>
+          <w:color w:val="1D6EEE"/>
+          <w:sz w:val="22"/>
+          <w:szCs w:val="22"/>
+        </w:rPr>
+        <w:t xml:space="preserve">Custo mensal para funcionar</w:t>
+      </w:r>
+    </w:p>
+    <w:p>
+      <w:pPr>
         <w:pStyle w:val="ListParagraph"/>
         <w:numPr>
           <w:ilvl w:val="0"/>
@@ -694,7 +777,227 @@
           <w:sz w:val="21"/>
           <w:szCs w:val="21"/>
         </w:rPr>
-        <w:t xml:space="preserve"> — R$ 100/mês. Usado para enviar automaticamente o contrato assinado ao paciente. Hoje usa o mesmo número (e a mesma assinatura) da Gestão de Laboratório — a cobrança é por número conectado, não por aplicação (ver seção 4.3).</w:t>
+        <w:t xml:space="preserve"> — R$ 100/mês. Usado para encaminhar o relatório de fechamento ao WhatsApp do colaborador. Hoje usa o mesmo número (e a mesma assinatura) do Gerador de Contratos e da Gestão de Laboratório — a cobrança é por número conectado, não por aplicação (ver seção 4.3).</w:t>
+      </w:r>
+    </w:p>
+    <w:p>
+      <w:pPr>
+        <w:spacing w:after="160" w:line="300"/>
+      </w:pPr>
+      <w:r>
+        <w:rPr>
+          <w:b/>
+          <w:bCs/>
+          <w:color w:val="0B2A57"/>
+          <w:sz w:val="21"/>
+          <w:szCs w:val="21"/>
+        </w:rPr>
+        <w:t xml:space="preserve">Total: R$ 100/mês.</w:t>
+      </w:r>
+    </w:p>
+    <w:p>
+      <w:pPr>
+        <w:pStyle w:val="Heading2"/>
+        <w:spacing w:after="120" w:before="260"/>
+      </w:pPr>
+      <w:r>
+        <w:rPr>
+          <w:b/>
+          <w:bCs/>
+          <w:color w:val="0B2A57"/>
+          <w:sz w:val="25"/>
+          <w:szCs w:val="25"/>
+        </w:rPr>
+        <w:t xml:space="preserve">2.7. Cálculo da Coordenação</w:t>
+      </w:r>
+    </w:p>
+    <w:p>
+      <w:pPr>
+        <w:spacing w:after="160" w:line="300"/>
+      </w:pPr>
+      <w:r>
+        <w:rPr>
+          <w:sz w:val="21"/>
+          <w:szCs w:val="21"/>
+        </w:rPr>
+        <w:t xml:space="preserve">O que é: cálculo do relatório de fechamento e do valor a receber por cada coordenador.</w:t>
+      </w:r>
+    </w:p>
+    <w:p>
+      <w:pPr>
+        <w:spacing w:after="160" w:line="300"/>
+      </w:pPr>
+      <w:r>
+        <w:rPr>
+          <w:sz w:val="21"/>
+          <w:szCs w:val="21"/>
+        </w:rPr>
+        <w:t xml:space="preserve">Contexto de uso: usado pela coordenação para consultar o fechamento e o valor a receber apurado para cada coordenador.</w:t>
+      </w:r>
+    </w:p>
+    <w:p>
+      <w:pPr>
+        <w:pStyle w:val="Heading3"/>
+        <w:spacing w:after="100" w:before="200"/>
+      </w:pPr>
+      <w:r>
+        <w:rPr>
+          <w:b/>
+          <w:bCs/>
+          <w:color w:val="1D6EEE"/>
+          <w:sz w:val="22"/>
+          <w:szCs w:val="22"/>
+        </w:rPr>
+        <w:t xml:space="preserve">Custo mensal para funcionar</w:t>
+      </w:r>
+    </w:p>
+    <w:p>
+      <w:pPr>
+        <w:pStyle w:val="ListParagraph"/>
+        <w:numPr>
+          <w:ilvl w:val="0"/>
+          <w:numId w:val="2"/>
+        </w:numPr>
+        <w:spacing w:after="80" w:line="290"/>
+      </w:pPr>
+      <w:r>
+        <w:rPr>
+          <w:b/>
+          <w:bCs/>
+          <w:sz w:val="21"/>
+          <w:szCs w:val="21"/>
+        </w:rPr>
+        <w:t xml:space="preserve">Hospedagem (Railway)</w:t>
+      </w:r>
+      <w:r>
+        <w:rPr>
+          <w:sz w:val="21"/>
+          <w:szCs w:val="21"/>
+        </w:rPr>
+        <w:t xml:space="preserve"> — R$ 100/mês (mesma assinatura compartilhada por todo o Painel).</w:t>
+      </w:r>
+    </w:p>
+    <w:p>
+      <w:pPr>
+        <w:spacing w:after="160" w:line="300"/>
+      </w:pPr>
+      <w:r>
+        <w:rPr>
+          <w:b/>
+          <w:bCs/>
+          <w:color w:val="0B2A57"/>
+          <w:sz w:val="21"/>
+          <w:szCs w:val="21"/>
+        </w:rPr>
+        <w:t xml:space="preserve">Total: R$ 100/mês.</w:t>
+      </w:r>
+    </w:p>
+    <w:p>
+      <w:pPr>
+        <w:pStyle w:val="Heading2"/>
+        <w:spacing w:after="120" w:before="260"/>
+      </w:pPr>
+      <w:r>
+        <w:rPr>
+          <w:b/>
+          <w:bCs/>
+          <w:color w:val="0B2A57"/>
+          <w:sz w:val="25"/>
+          <w:szCs w:val="25"/>
+        </w:rPr>
+        <w:t xml:space="preserve">2.8. Gerador de Contratos e Termos de Consentimento</w:t>
+      </w:r>
+    </w:p>
+    <w:p>
+      <w:pPr>
+        <w:spacing w:after="160" w:line="300"/>
+      </w:pPr>
+      <w:r>
+        <w:rPr>
+          <w:sz w:val="21"/>
+          <w:szCs w:val="21"/>
+        </w:rPr>
+        <w:t xml:space="preserve">O que é: gera contratos e termos de consentimento odontológico personalizados para cada paciente e conduz a assinatura digital do documento, sem precisar de papel nem de outro programa.</w:t>
+      </w:r>
+    </w:p>
+    <w:p>
+      <w:pPr>
+        <w:spacing w:after="160" w:line="300"/>
+      </w:pPr>
+      <w:r>
+        <w:rPr>
+          <w:sz w:val="21"/>
+          <w:szCs w:val="21"/>
+        </w:rPr>
+        <w:t xml:space="preserve">Contexto de uso: usado pelos colaboradores da recepção/clínica no momento do atendimento. O sistema monta o documento com os dados do paciente e do procedimento, e o paciente assina na hora — pelo próprio celular, lendo um QR Code, ou num totem dedicado da clínica —, com o arquivo assinado sendo enviado automaticamente ao Dental Office e por WhatsApp. Por ser a ferramenta mais recente e a que envolve validade jurídica, ela é detalhada em profundidade na próxima seção.</w:t>
+      </w:r>
+    </w:p>
+    <w:p>
+      <w:pPr>
+        <w:pStyle w:val="Heading3"/>
+        <w:spacing w:after="100" w:before="200"/>
+      </w:pPr>
+      <w:r>
+        <w:rPr>
+          <w:b/>
+          <w:bCs/>
+          <w:color w:val="1D6EEE"/>
+          <w:sz w:val="22"/>
+          <w:szCs w:val="22"/>
+        </w:rPr>
+        <w:t xml:space="preserve">Custo mensal para funcionar</w:t>
+      </w:r>
+    </w:p>
+    <w:p>
+      <w:pPr>
+        <w:pStyle w:val="ListParagraph"/>
+        <w:numPr>
+          <w:ilvl w:val="0"/>
+          <w:numId w:val="2"/>
+        </w:numPr>
+        <w:spacing w:after="80" w:line="290"/>
+      </w:pPr>
+      <w:r>
+        <w:rPr>
+          <w:b/>
+          <w:bCs/>
+          <w:sz w:val="21"/>
+          <w:szCs w:val="21"/>
+        </w:rPr>
+        <w:t xml:space="preserve">Hospedagem (Railway)</w:t>
+      </w:r>
+      <w:r>
+        <w:rPr>
+          <w:sz w:val="21"/>
+          <w:szCs w:val="21"/>
+        </w:rPr>
+        <w:t xml:space="preserve"> — R$ 100/mês (mesma assinatura compartilhada por todo o Painel).</w:t>
+      </w:r>
+    </w:p>
+    <w:p>
+      <w:pPr>
+        <w:pStyle w:val="ListParagraph"/>
+        <w:numPr>
+          <w:ilvl w:val="0"/>
+          <w:numId w:val="2"/>
+        </w:numPr>
+        <w:spacing w:after="80" w:line="290"/>
+      </w:pPr>
+      <w:r>
+        <w:rPr>
+          <w:b/>
+          <w:bCs/>
+          <w:sz w:val="21"/>
+          <w:szCs w:val="21"/>
+        </w:rPr>
+        <w:t xml:space="preserve">WhatsApp automático (Z-API)</w:t>
+      </w:r>
+      <w:r>
+        <w:rPr>
+          <w:sz w:val="21"/>
+          <w:szCs w:val="21"/>
+        </w:rPr>
+        <w:t xml:space="preserve"> — R$ 100/mês. Usado para enviar automaticamente o contrato assinado ao paciente. Hoje usa o mesmo número (e a mesma assinatura) da Gestão de Laboratório e do Fechamento do CAP — a cobrança é por número conectado, não por aplicação (ver seção 4.3).</w:t>
       </w:r>
     </w:p>
     <w:p>
@@ -2919,6 +3222,192 @@
                 <w:sz w:val="19"/>
                 <w:szCs w:val="19"/>
               </w:rPr>
+              <w:t xml:space="preserve">Gestão de Usuários</w:t>
+            </w:r>
+          </w:p>
+        </w:tc>
+        <w:tc>
+          <w:tcPr>
+            <w:tcW w:type="dxa" w:w="2600"/>
+            <w:tcMar>
+              <w:top w:type="dxa" w:w="80"/>
+              <w:left w:type="dxa" w:w="100"/>
+              <w:bottom w:type="dxa" w:w="80"/>
+              <w:right w:type="dxa" w:w="100"/>
+            </w:tcMar>
+          </w:tcPr>
+          <w:p>
+            <w:r>
+              <w:rPr>
+                <w:sz w:val="19"/>
+                <w:szCs w:val="19"/>
+              </w:rPr>
+              <w:t xml:space="preserve">Hospedagem</w:t>
+            </w:r>
+          </w:p>
+        </w:tc>
+        <w:tc>
+          <w:tcPr>
+            <w:tcW w:type="dxa" w:w="2400"/>
+            <w:tcMar>
+              <w:top w:type="dxa" w:w="80"/>
+              <w:left w:type="dxa" w:w="100"/>
+              <w:bottom w:type="dxa" w:w="80"/>
+              <w:right w:type="dxa" w:w="100"/>
+            </w:tcMar>
+          </w:tcPr>
+          <w:p>
+            <w:r>
+              <w:rPr>
+                <w:sz w:val="19"/>
+                <w:szCs w:val="19"/>
+              </w:rPr>
+              <w:t xml:space="preserve">R$ 100</w:t>
+            </w:r>
+          </w:p>
+        </w:tc>
+      </w:tr>
+      <w:tr>
+        <w:tc>
+          <w:tcPr>
+            <w:tcW w:type="dxa" w:w="4400"/>
+            <w:tcMar>
+              <w:top w:type="dxa" w:w="80"/>
+              <w:left w:type="dxa" w:w="100"/>
+              <w:bottom w:type="dxa" w:w="80"/>
+              <w:right w:type="dxa" w:w="100"/>
+            </w:tcMar>
+          </w:tcPr>
+          <w:p>
+            <w:r>
+              <w:rPr>
+                <w:sz w:val="19"/>
+                <w:szCs w:val="19"/>
+              </w:rPr>
+              <w:t xml:space="preserve">Fechamento do CAP</w:t>
+            </w:r>
+          </w:p>
+        </w:tc>
+        <w:tc>
+          <w:tcPr>
+            <w:tcW w:type="dxa" w:w="2600"/>
+            <w:tcMar>
+              <w:top w:type="dxa" w:w="80"/>
+              <w:left w:type="dxa" w:w="100"/>
+              <w:bottom w:type="dxa" w:w="80"/>
+              <w:right w:type="dxa" w:w="100"/>
+            </w:tcMar>
+          </w:tcPr>
+          <w:p>
+            <w:r>
+              <w:rPr>
+                <w:sz w:val="19"/>
+                <w:szCs w:val="19"/>
+              </w:rPr>
+              <w:t xml:space="preserve">WhatsApp</w:t>
+            </w:r>
+          </w:p>
+        </w:tc>
+        <w:tc>
+          <w:tcPr>
+            <w:tcW w:type="dxa" w:w="2400"/>
+            <w:tcMar>
+              <w:top w:type="dxa" w:w="80"/>
+              <w:left w:type="dxa" w:w="100"/>
+              <w:bottom w:type="dxa" w:w="80"/>
+              <w:right w:type="dxa" w:w="100"/>
+            </w:tcMar>
+          </w:tcPr>
+          <w:p>
+            <w:r>
+              <w:rPr>
+                <w:sz w:val="19"/>
+                <w:szCs w:val="19"/>
+              </w:rPr>
+              <w:t xml:space="preserve">R$ 100</w:t>
+            </w:r>
+          </w:p>
+        </w:tc>
+      </w:tr>
+      <w:tr>
+        <w:tc>
+          <w:tcPr>
+            <w:tcW w:type="dxa" w:w="4400"/>
+            <w:tcMar>
+              <w:top w:type="dxa" w:w="80"/>
+              <w:left w:type="dxa" w:w="100"/>
+              <w:bottom w:type="dxa" w:w="80"/>
+              <w:right w:type="dxa" w:w="100"/>
+            </w:tcMar>
+          </w:tcPr>
+          <w:p>
+            <w:r>
+              <w:rPr>
+                <w:sz w:val="19"/>
+                <w:szCs w:val="19"/>
+              </w:rPr>
+              <w:t xml:space="preserve">Cálculo da Coordenação</w:t>
+            </w:r>
+          </w:p>
+        </w:tc>
+        <w:tc>
+          <w:tcPr>
+            <w:tcW w:type="dxa" w:w="2600"/>
+            <w:tcMar>
+              <w:top w:type="dxa" w:w="80"/>
+              <w:left w:type="dxa" w:w="100"/>
+              <w:bottom w:type="dxa" w:w="80"/>
+              <w:right w:type="dxa" w:w="100"/>
+            </w:tcMar>
+          </w:tcPr>
+          <w:p>
+            <w:r>
+              <w:rPr>
+                <w:sz w:val="19"/>
+                <w:szCs w:val="19"/>
+              </w:rPr>
+              <w:t xml:space="preserve">Hospedagem</w:t>
+            </w:r>
+          </w:p>
+        </w:tc>
+        <w:tc>
+          <w:tcPr>
+            <w:tcW w:type="dxa" w:w="2400"/>
+            <w:tcMar>
+              <w:top w:type="dxa" w:w="80"/>
+              <w:left w:type="dxa" w:w="100"/>
+              <w:bottom w:type="dxa" w:w="80"/>
+              <w:right w:type="dxa" w:w="100"/>
+            </w:tcMar>
+          </w:tcPr>
+          <w:p>
+            <w:r>
+              <w:rPr>
+                <w:sz w:val="19"/>
+                <w:szCs w:val="19"/>
+              </w:rPr>
+              <w:t xml:space="preserve">R$ 100</w:t>
+            </w:r>
+          </w:p>
+        </w:tc>
+      </w:tr>
+      <w:tr>
+        <w:tc>
+          <w:tcPr>
+            <w:tcW w:type="dxa" w:w="4400"/>
+            <w:tcMar>
+              <w:top w:type="dxa" w:w="80"/>
+              <w:left w:type="dxa" w:w="100"/>
+              <w:bottom w:type="dxa" w:w="80"/>
+              <w:right w:type="dxa" w:w="100"/>
+            </w:tcMar>
+          </w:tcPr>
+          <w:p>
+            <w:r>
+              <w:rPr>
+                <w:sz w:val="19"/>
+                <w:szCs w:val="19"/>
+              </w:rPr>
               <w:t xml:space="preserve">Gerador de Contratos</w:t>
             </w:r>
           </w:p>
@@ -2979,7 +3468,7 @@
           <w:sz w:val="21"/>
           <w:szCs w:val="21"/>
         </w:rPr>
-        <w:t xml:space="preserve">Importante: a hospedagem é uma única assinatura, compartilhada por todas as ferramentas — por isso ela se repete nas cinco linhas acima, mas é paga uma única vez, não cinco. Já o WhatsApp automático (Z-API) hoje também é uma única assinatura (um único número), usada tanto pela Gestão de Laboratório quanto pelo Gerador de Contratos — mas, diferente da hospedagem, esse compartilhamento é uma opção, não uma característica do serviço: a seção 4.3 explica como a cobrança muda se cada aplicação passar a usar seu próprio número. Por isso, somar a coluna "Custo mensal" diretamente resultaria em um valor bem maior do que o gasto real da plataforma, calculado a seguir.</w:t>
+        <w:t xml:space="preserve">Importante: a hospedagem é uma única assinatura, compartilhada por todas as ferramentas — por isso ela se repete em várias linhas acima, mas é paga uma única vez, não uma vez por linha. Já o WhatsApp automático (Z-API) hoje também é uma única assinatura (um único número), usada pela Gestão de Laboratório, pelo Gerador de Contratos e pelo Fechamento do CAP — mas, diferente da hospedagem, esse compartilhamento é uma opção, não uma característica do serviço: a seção 4.3 explica como a cobrança muda se cada aplicação passar a usar seu próprio número. Por isso, somar a coluna "Custo mensal" diretamente resultaria em um valor bem maior do que o gasto real da plataforma, calculado a seguir.</w:t>
       </w:r>
     </w:p>
     <w:p>
@@ -3007,7 +3496,7 @@
           <w:sz w:val="21"/>
           <w:szCs w:val="21"/>
         </w:rPr>
-        <w:t xml:space="preserve">Contando cada assinatura uma única vez — independentemente de quantas ferramentas dependem dela —, o gasto real do Painel hoje é:</w:t>
+        <w:t xml:space="preserve">Comparação direta para decisão: manter o servidor próprio de hoje, ou migrar a hospedagem para a Intranet já existente da ABO Goiás. O valor final também depende de quantos números de WhatsApp (Z-API) a plataforma usa — ver 4.3.</w:t>
       </w:r>
     </w:p>
     <w:tbl>
@@ -3023,8 +3512,8 @@
         </w:tblBorders>
       </w:tblPr>
       <w:tblGrid>
-        <w:gridCol w:w="5800"/>
-        <w:gridCol w:w="3600"/>
+        <w:gridCol w:w="6200"/>
+        <w:gridCol w:w="3200"/>
       </w:tblGrid>
       <w:tr>
         <w:trPr>
@@ -3032,7 +3521,7 @@
         </w:trPr>
         <w:tc>
           <w:tcPr>
-            <w:tcW w:type="dxa" w:w="5800"/>
+            <w:tcW w:type="dxa" w:w="6200"/>
             <w:shd w:fill="0B2A57" w:val="clear"/>
             <w:tcMar>
               <w:top w:type="dxa" w:w="80"/>
@@ -3050,13 +3539,13 @@
                 <w:sz w:val="19"/>
                 <w:szCs w:val="19"/>
               </w:rPr>
-              <w:t xml:space="preserve">Item (assinatura única)</w:t>
-            </w:r>
-          </w:p>
-        </w:tc>
-        <w:tc>
-          <w:tcPr>
-            <w:tcW w:type="dxa" w:w="3600"/>
+              <w:t xml:space="preserve">Cenário</w:t>
+            </w:r>
+          </w:p>
+        </w:tc>
+        <w:tc>
+          <w:tcPr>
+            <w:tcW w:type="dxa" w:w="3200"/>
             <w:shd w:fill="0B2A57" w:val="clear"/>
             <w:tcMar>
               <w:top w:type="dxa" w:w="80"/>
@@ -3082,41 +3571,41 @@
       <w:tr>
         <w:tc>
           <w:tcPr>
-            <w:tcW w:type="dxa" w:w="5800"/>
-            <w:tcMar>
-              <w:top w:type="dxa" w:w="80"/>
-              <w:left w:type="dxa" w:w="100"/>
-              <w:bottom w:type="dxa" w:w="80"/>
-              <w:right w:type="dxa" w:w="100"/>
-            </w:tcMar>
-          </w:tcPr>
-          <w:p>
-            <w:r>
-              <w:rPr>
-                <w:sz w:val="19"/>
-                <w:szCs w:val="19"/>
-              </w:rPr>
-              <w:t xml:space="preserve">Hospedagem (Railway) — usada por todas as ferramentas</w:t>
-            </w:r>
-          </w:p>
-        </w:tc>
-        <w:tc>
-          <w:tcPr>
-            <w:tcW w:type="dxa" w:w="3600"/>
-            <w:tcMar>
-              <w:top w:type="dxa" w:w="80"/>
-              <w:left w:type="dxa" w:w="100"/>
-              <w:bottom w:type="dxa" w:w="80"/>
-              <w:right w:type="dxa" w:w="100"/>
-            </w:tcMar>
-          </w:tcPr>
-          <w:p>
-            <w:r>
-              <w:rPr>
-                <w:sz w:val="19"/>
-                <w:szCs w:val="19"/>
-              </w:rPr>
-              <w:t xml:space="preserve">R$ 100</w:t>
+            <w:tcW w:type="dxa" w:w="6200"/>
+            <w:tcMar>
+              <w:top w:type="dxa" w:w="80"/>
+              <w:left w:type="dxa" w:w="100"/>
+              <w:bottom w:type="dxa" w:w="80"/>
+              <w:right w:type="dxa" w:w="100"/>
+            </w:tcMar>
+          </w:tcPr>
+          <w:p>
+            <w:r>
+              <w:rPr>
+                <w:sz w:val="19"/>
+                <w:szCs w:val="19"/>
+              </w:rPr>
+              <w:t xml:space="preserve">Hoje — servidor próprio (Railway) + WhatsApp, número único</w:t>
+            </w:r>
+          </w:p>
+        </w:tc>
+        <w:tc>
+          <w:tcPr>
+            <w:tcW w:type="dxa" w:w="3200"/>
+            <w:tcMar>
+              <w:top w:type="dxa" w:w="80"/>
+              <w:left w:type="dxa" w:w="100"/>
+              <w:bottom w:type="dxa" w:w="80"/>
+              <w:right w:type="dxa" w:w="100"/>
+            </w:tcMar>
+          </w:tcPr>
+          <w:p>
+            <w:r>
+              <w:rPr>
+                <w:sz w:val="19"/>
+                <w:szCs w:val="19"/>
+              </w:rPr>
+              <w:t xml:space="preserve">R$ 200</w:t>
             </w:r>
           </w:p>
         </w:tc>
@@ -3124,27 +3613,27 @@
       <w:tr>
         <w:tc>
           <w:tcPr>
-            <w:tcW w:type="dxa" w:w="5800"/>
-            <w:tcMar>
-              <w:top w:type="dxa" w:w="80"/>
-              <w:left w:type="dxa" w:w="100"/>
-              <w:bottom w:type="dxa" w:w="80"/>
-              <w:right w:type="dxa" w:w="100"/>
-            </w:tcMar>
-          </w:tcPr>
-          <w:p>
-            <w:r>
-              <w:rPr>
-                <w:sz w:val="19"/>
-                <w:szCs w:val="19"/>
-              </w:rPr>
-              <w:t xml:space="preserve">WhatsApp automático (Z-API) — 1 número, usado pela Gestão de Laboratório e pelo Gerador de Contratos</w:t>
-            </w:r>
-          </w:p>
-        </w:tc>
-        <w:tc>
-          <w:tcPr>
-            <w:tcW w:type="dxa" w:w="3600"/>
+            <w:tcW w:type="dxa" w:w="6200"/>
+            <w:tcMar>
+              <w:top w:type="dxa" w:w="80"/>
+              <w:left w:type="dxa" w:w="100"/>
+              <w:bottom w:type="dxa" w:w="80"/>
+              <w:right w:type="dxa" w:w="100"/>
+            </w:tcMar>
+          </w:tcPr>
+          <w:p>
+            <w:r>
+              <w:rPr>
+                <w:sz w:val="19"/>
+                <w:szCs w:val="19"/>
+              </w:rPr>
+              <w:t xml:space="preserve">Intranet existente + WhatsApp, número único</w:t>
+            </w:r>
+          </w:p>
+        </w:tc>
+        <w:tc>
+          <w:tcPr>
+            <w:tcW w:type="dxa" w:w="3200"/>
             <w:tcMar>
               <w:top w:type="dxa" w:w="80"/>
               <w:left w:type="dxa" w:w="100"/>
@@ -3159,6 +3648,48 @@
                 <w:szCs w:val="19"/>
               </w:rPr>
               <w:t xml:space="preserve">R$ 100</w:t>
+            </w:r>
+          </w:p>
+        </w:tc>
+      </w:tr>
+      <w:tr>
+        <w:tc>
+          <w:tcPr>
+            <w:tcW w:type="dxa" w:w="6200"/>
+            <w:tcMar>
+              <w:top w:type="dxa" w:w="80"/>
+              <w:left w:type="dxa" w:w="100"/>
+              <w:bottom w:type="dxa" w:w="80"/>
+              <w:right w:type="dxa" w:w="100"/>
+            </w:tcMar>
+          </w:tcPr>
+          <w:p>
+            <w:r>
+              <w:rPr>
+                <w:sz w:val="19"/>
+                <w:szCs w:val="19"/>
+              </w:rPr>
+              <w:t xml:space="preserve">Intranet existente + WhatsApp, um número por aplicação (3 números)</w:t>
+            </w:r>
+          </w:p>
+        </w:tc>
+        <w:tc>
+          <w:tcPr>
+            <w:tcW w:type="dxa" w:w="3200"/>
+            <w:tcMar>
+              <w:top w:type="dxa" w:w="80"/>
+              <w:left w:type="dxa" w:w="100"/>
+              <w:bottom w:type="dxa" w:w="80"/>
+              <w:right w:type="dxa" w:w="100"/>
+            </w:tcMar>
+          </w:tcPr>
+          <w:p>
+            <w:r>
+              <w:rPr>
+                <w:sz w:val="19"/>
+                <w:szCs w:val="19"/>
+              </w:rPr>
+              <w:t xml:space="preserve">R$ 300</w:t>
             </w:r>
           </w:p>
         </w:tc>
@@ -3205,7 +3736,7 @@
                 <w:sz w:val="24"/>
                 <w:szCs w:val="24"/>
               </w:rPr>
-              <w:t xml:space="preserve">Custo final da plataforma: </w:t>
+              <w:t xml:space="preserve">Custo hoje: </w:t>
             </w:r>
             <w:r>
               <w:rPr>
@@ -3215,7 +3746,53 @@
                 <w:sz w:val="24"/>
                 <w:szCs w:val="24"/>
               </w:rPr>
-              <w:t xml:space="preserve">R$ 200 por mês</w:t>
+              <w:t xml:space="preserve">R$ 200/mês</w:t>
+            </w:r>
+            <w:r>
+              <w:rPr>
+                <w:b/>
+                <w:bCs/>
+                <w:color w:val="0B2A57"/>
+                <w:sz w:val="24"/>
+                <w:szCs w:val="24"/>
+              </w:rPr>
+              <w:t xml:space="preserve">   ·   Na Intranet existente: </w:t>
+            </w:r>
+            <w:r>
+              <w:rPr>
+                <w:b/>
+                <w:bCs/>
+                <w:color w:val="1D6EEE"/>
+                <w:sz w:val="24"/>
+                <w:szCs w:val="24"/>
+              </w:rPr>
+              <w:t xml:space="preserve">R$ 100/mês</w:t>
+            </w:r>
+            <w:r>
+              <w:rPr>
+                <w:color w:val="0B2A57"/>
+                <w:sz w:val="21"/>
+                <w:szCs w:val="21"/>
+              </w:rPr>
+              <w:t xml:space="preserve"> (número único) ou </w:t>
+            </w:r>
+            <w:r>
+              <w:rPr>
+                <w:b/>
+                <w:bCs/>
+                <w:color w:val="1D6EEE"/>
+                <w:sz w:val="24"/>
+                <w:szCs w:val="24"/>
+              </w:rPr>
+              <w:t xml:space="preserve">R$ 300/mês</w:t>
+            </w:r>
+            <w:r>
+              <w:rPr>
+                <w:color w:val="0B2A57"/>
+                <w:sz w:val="21"/>
+                <w:szCs w:val="21"/>
+              </w:rPr>
+              <w:t xml:space="preserve"> (um número por aplicação)</w:t>
             </w:r>
           </w:p>
           <w:p>
@@ -3228,7 +3805,7 @@
                 <w:sz w:val="21"/>
                 <w:szCs w:val="21"/>
               </w:rPr>
-              <w:t xml:space="preserve">(Hospedagem + um único número de WhatsApp automático, compartilhado hoje entre a Gestão de Laboratório e o Gerador de Contratos — ver seção 4.3 caso um dia seja necessário separar os números. Valores de referência: hospedagem a partir do plano Pro da Railway, ~US$ 20/mês, convertido pela cotação de US$ 1 = R$ 5,08; WhatsApp automático dentro da faixa de R$ 55 a R$ 99/mês pesquisada — ambos arredondados para R$ 100 para facilitar a leitura da tabela. Esse valor não inclui consumo de processamento acima do incluído no plano da Railway, nem eventuais variações cambiais ou reajustes dos fornecedores.)</w:t>
+              <w:t xml:space="preserve">Migrar para a Intranet existente elimina o custo de hospedagem (R$ 100/mês); o WhatsApp automático continua necessário de qualquer forma. Valores de referência: hospedagem a partir do plano Pro da Railway (~US$ 20/mês, cotação de US$ 1 = R$ 5,08); WhatsApp dentro da faixa de R$ 55 a R$ 99/mês pesquisada — ambos arredondados para R$ 100 para simplificar a leitura. Pesquisa de julho de 2026, sujeita a reajuste dos fornecedores.</w:t>
             </w:r>
           </w:p>
         </w:tc>
@@ -3252,605 +3829,19 @@
           <w:sz w:val="25"/>
           <w:szCs w:val="25"/>
         </w:rPr>
-        <w:t xml:space="preserve">4.3. Se for necessário um número de WhatsApp por aplicação</w:t>
-      </w:r>
-    </w:p>
-    <w:p>
-      <w:pPr>
-        <w:spacing w:after="160" w:line="300"/>
-      </w:pPr>
-      <w:r>
-        <w:rPr>
-          <w:sz w:val="21"/>
-          <w:szCs w:val="21"/>
-        </w:rPr>
-        <w:t xml:space="preserve">O Z-API cobra por número de WhatsApp conectado à assinatura — não por mensagem enviada, nem por quantidade de aplicações que utilizam esse número. Hoje a Gestão de Laboratório (cobrança de laboratórios atrasados) e o Gerador de Contratos (envio do contrato assinado) dividem o mesmo número e a mesma assinatura — por isso o custo de R$ 100/mês aparece uma única vez na seção 4.2.</w:t>
-      </w:r>
-    </w:p>
-    <w:p>
-      <w:pPr>
-        <w:spacing w:after="160" w:line="300"/>
-      </w:pPr>
-      <w:r>
-        <w:rPr>
-          <w:sz w:val="21"/>
-          <w:szCs w:val="21"/>
-        </w:rPr>
-        <w:t xml:space="preserve">Se um dia for necessário um número próprio para cada aplicação — por exemplo, para separar o WhatsApp usado com laboratórios parceiros do usado com pacientes —, o Z-API passa a cobrar uma assinatura individual para cada número conectado. Nesse cenário, o item "WhatsApp automático" dobra, e o custo final da plataforma passa a ser:</w:t>
-      </w:r>
-    </w:p>
-    <w:tbl>
-      <w:tblPr>
-        <w:tblW w:type="dxa" w:w="9600"/>
-        <w:tblBorders>
-          <w:top w:val="single" w:color="D9E2EC" w:sz="4"/>
-          <w:left w:val="single" w:color="D9E2EC" w:sz="4"/>
-          <w:bottom w:val="single" w:color="D9E2EC" w:sz="4"/>
-          <w:right w:val="single" w:color="D9E2EC" w:sz="4"/>
-          <w:insideH w:val="single" w:color="D9E2EC" w:sz="4"/>
-          <w:insideV w:val="single" w:color="D9E2EC" w:sz="4"/>
-        </w:tblBorders>
-      </w:tblPr>
-      <w:tblGrid>
-        <w:gridCol w:w="4200"/>
-        <w:gridCol w:w="2700"/>
-        <w:gridCol w:w="2700"/>
-      </w:tblGrid>
-      <w:tr>
-        <w:trPr>
-          <w:tblHeader/>
-        </w:trPr>
-        <w:tc>
-          <w:tcPr>
-            <w:tcW w:type="dxa" w:w="4200"/>
-            <w:shd w:fill="0B2A57" w:val="clear"/>
-            <w:tcMar>
-              <w:top w:type="dxa" w:w="80"/>
-              <w:left w:type="dxa" w:w="100"/>
-              <w:bottom w:type="dxa" w:w="80"/>
-              <w:right w:type="dxa" w:w="100"/>
-            </w:tcMar>
-          </w:tcPr>
-          <w:p>
-            <w:r>
-              <w:rPr>
-                <w:b/>
-                <w:bCs/>
-                <w:color w:val="FFFFFF"/>
-                <w:sz w:val="19"/>
-                <w:szCs w:val="19"/>
-              </w:rPr>
-              <w:t xml:space="preserve">Cenário</w:t>
-            </w:r>
-          </w:p>
-        </w:tc>
-        <w:tc>
-          <w:tcPr>
-            <w:tcW w:type="dxa" w:w="2700"/>
-            <w:shd w:fill="0B2A57" w:val="clear"/>
-            <w:tcMar>
-              <w:top w:type="dxa" w:w="80"/>
-              <w:left w:type="dxa" w:w="100"/>
-              <w:bottom w:type="dxa" w:w="80"/>
-              <w:right w:type="dxa" w:w="100"/>
-            </w:tcMar>
-          </w:tcPr>
-          <w:p>
-            <w:r>
-              <w:rPr>
-                <w:b/>
-                <w:bCs/>
-                <w:color w:val="FFFFFF"/>
-                <w:sz w:val="19"/>
-                <w:szCs w:val="19"/>
-              </w:rPr>
-              <w:t xml:space="preserve">Itens</w:t>
-            </w:r>
-          </w:p>
-        </w:tc>
-        <w:tc>
-          <w:tcPr>
-            <w:tcW w:type="dxa" w:w="2700"/>
-            <w:shd w:fill="0B2A57" w:val="clear"/>
-            <w:tcMar>
-              <w:top w:type="dxa" w:w="80"/>
-              <w:left w:type="dxa" w:w="100"/>
-              <w:bottom w:type="dxa" w:w="80"/>
-              <w:right w:type="dxa" w:w="100"/>
-            </w:tcMar>
-          </w:tcPr>
-          <w:p>
-            <w:r>
-              <w:rPr>
-                <w:b/>
-                <w:bCs/>
-                <w:color w:val="FFFFFF"/>
-                <w:sz w:val="19"/>
-                <w:szCs w:val="19"/>
-              </w:rPr>
-              <w:t xml:space="preserve">Custo mensal</w:t>
-            </w:r>
-          </w:p>
-        </w:tc>
-      </w:tr>
-      <w:tr>
-        <w:tc>
-          <w:tcPr>
-            <w:tcW w:type="dxa" w:w="4200"/>
-            <w:tcMar>
-              <w:top w:type="dxa" w:w="80"/>
-              <w:left w:type="dxa" w:w="100"/>
-              <w:bottom w:type="dxa" w:w="80"/>
-              <w:right w:type="dxa" w:w="100"/>
-            </w:tcMar>
-          </w:tcPr>
-          <w:p>
-            <w:r>
-              <w:rPr>
-                <w:sz w:val="19"/>
-                <w:szCs w:val="19"/>
-              </w:rPr>
-              <w:t xml:space="preserve">Número único (atual)</w:t>
-            </w:r>
-          </w:p>
-        </w:tc>
-        <w:tc>
-          <w:tcPr>
-            <w:tcW w:type="dxa" w:w="2700"/>
-            <w:tcMar>
-              <w:top w:type="dxa" w:w="80"/>
-              <w:left w:type="dxa" w:w="100"/>
-              <w:bottom w:type="dxa" w:w="80"/>
-              <w:right w:type="dxa" w:w="100"/>
-            </w:tcMar>
-          </w:tcPr>
-          <w:p>
-            <w:r>
-              <w:rPr>
-                <w:sz w:val="19"/>
-                <w:szCs w:val="19"/>
-              </w:rPr>
-              <w:t xml:space="preserve">Hospedagem + 1 número de WhatsApp</w:t>
-            </w:r>
-          </w:p>
-        </w:tc>
-        <w:tc>
-          <w:tcPr>
-            <w:tcW w:type="dxa" w:w="2700"/>
-            <w:tcMar>
-              <w:top w:type="dxa" w:w="80"/>
-              <w:left w:type="dxa" w:w="100"/>
-              <w:bottom w:type="dxa" w:w="80"/>
-              <w:right w:type="dxa" w:w="100"/>
-            </w:tcMar>
-          </w:tcPr>
-          <w:p>
-            <w:r>
-              <w:rPr>
-                <w:sz w:val="19"/>
-                <w:szCs w:val="19"/>
-              </w:rPr>
-              <w:t xml:space="preserve">R$ 200</w:t>
-            </w:r>
-          </w:p>
-        </w:tc>
-      </w:tr>
-      <w:tr>
-        <w:tc>
-          <w:tcPr>
-            <w:tcW w:type="dxa" w:w="4200"/>
-            <w:tcMar>
-              <w:top w:type="dxa" w:w="80"/>
-              <w:left w:type="dxa" w:w="100"/>
-              <w:bottom w:type="dxa" w:w="80"/>
-              <w:right w:type="dxa" w:w="100"/>
-            </w:tcMar>
-          </w:tcPr>
-          <w:p>
-            <w:r>
-              <w:rPr>
-                <w:sz w:val="19"/>
-                <w:szCs w:val="19"/>
-              </w:rPr>
-              <w:t xml:space="preserve">Um número por aplicação</w:t>
-            </w:r>
-          </w:p>
-        </w:tc>
-        <w:tc>
-          <w:tcPr>
-            <w:tcW w:type="dxa" w:w="2700"/>
-            <w:tcMar>
-              <w:top w:type="dxa" w:w="80"/>
-              <w:left w:type="dxa" w:w="100"/>
-              <w:bottom w:type="dxa" w:w="80"/>
-              <w:right w:type="dxa" w:w="100"/>
-            </w:tcMar>
-          </w:tcPr>
-          <w:p>
-            <w:r>
-              <w:rPr>
-                <w:sz w:val="19"/>
-                <w:szCs w:val="19"/>
-              </w:rPr>
-              <w:t xml:space="preserve">Hospedagem + 2 números de WhatsApp</w:t>
-            </w:r>
-          </w:p>
-        </w:tc>
-        <w:tc>
-          <w:tcPr>
-            <w:tcW w:type="dxa" w:w="2700"/>
-            <w:tcMar>
-              <w:top w:type="dxa" w:w="80"/>
-              <w:left w:type="dxa" w:w="100"/>
-              <w:bottom w:type="dxa" w:w="80"/>
-              <w:right w:type="dxa" w:w="100"/>
-            </w:tcMar>
-          </w:tcPr>
-          <w:p>
-            <w:r>
-              <w:rPr>
-                <w:sz w:val="19"/>
-                <w:szCs w:val="19"/>
-              </w:rPr>
-              <w:t xml:space="preserve">R$ 300</w:t>
-            </w:r>
-          </w:p>
-        </w:tc>
-      </w:tr>
-    </w:tbl>
-    <w:p>
-      <w:pPr>
-        <w:spacing w:after="160"/>
-      </w:pPr>
-    </w:p>
-    <w:p>
-      <w:pPr>
-        <w:spacing w:after="160" w:line="300"/>
-      </w:pPr>
-      <w:r>
-        <w:rPr>
-          <w:sz w:val="21"/>
-          <w:szCs w:val="21"/>
-        </w:rPr>
-        <w:t xml:space="preserve">Ou seja: separar os números soma mais R$ 100/mês ao custo da plataforma — o valor de uma segunda assinatura Z-API —, sem alterar o custo de hospedagem.</w:t>
-      </w:r>
-    </w:p>
-    <w:p>
-      <w:pPr>
-        <w:pStyle w:val="Heading2"/>
-        <w:spacing w:after="120" w:before="260"/>
-      </w:pPr>
-      <w:r>
-        <w:rPr>
-          <w:b/>
-          <w:bCs/>
-          <w:color w:val="0B2A57"/>
-          <w:sz w:val="25"/>
-          <w:szCs w:val="25"/>
-        </w:rPr>
-        <w:t xml:space="preserve">4.4. Se as ferramentas forem hospedadas em outra Intranet já existente</w:t>
-      </w:r>
-    </w:p>
-    <w:p>
-      <w:pPr>
-        <w:spacing w:after="160" w:line="300"/>
-      </w:pPr>
-      <w:r>
-        <w:rPr>
-          <w:sz w:val="21"/>
-          <w:szCs w:val="21"/>
-        </w:rPr>
-        <w:t xml:space="preserve">Todo o custo de hospedagem apresentado acima (R$ 100/mês) existe porque hoje o Painel roda em um servidor próprio, dedicado (Railway). Caso essas mesmas funcionalidades sejam repassadas para rodar dentro de outra Intranet que a ABO Goiás já mantém e já paga por outro motivo — ou seja, sem a necessidade de contratar um servidor exclusivo para o Painel —, esse item deixa de ser um custo gerado por esta plataforma: a estrutura já existe e já está sendo paga independentemente dela.</w:t>
-      </w:r>
-    </w:p>
-    <w:p>
-      <w:pPr>
-        <w:spacing w:after="160" w:line="300"/>
-      </w:pPr>
-      <w:r>
-        <w:rPr>
-          <w:sz w:val="21"/>
-          <w:szCs w:val="21"/>
-        </w:rPr>
-        <w:t xml:space="preserve">Nesse cenário, o único custo que permanece é o WhatsApp automático (Z-API), por ser um serviço externo contratado à parte — independente de onde o sistema esteja hospedado, ele continua sendo necessário para o envio automático de mensagens (cobrança de laboratórios atrasados e envio de contratos assinados) e continua gerando a mesma cobrança já detalhada nas seções 4.2 e 4.3:</w:t>
-      </w:r>
-    </w:p>
-    <w:tbl>
-      <w:tblPr>
-        <w:tblW w:type="dxa" w:w="9600"/>
-        <w:tblBorders>
-          <w:top w:val="single" w:color="D9E2EC" w:sz="4"/>
-          <w:left w:val="single" w:color="D9E2EC" w:sz="4"/>
-          <w:bottom w:val="single" w:color="D9E2EC" w:sz="4"/>
-          <w:right w:val="single" w:color="D9E2EC" w:sz="4"/>
-          <w:insideH w:val="single" w:color="D9E2EC" w:sz="4"/>
-          <w:insideV w:val="single" w:color="D9E2EC" w:sz="4"/>
-        </w:tblBorders>
-      </w:tblPr>
-      <w:tblGrid>
-        <w:gridCol w:w="4600"/>
-        <w:gridCol w:w="2700"/>
-        <w:gridCol w:w="2300"/>
-      </w:tblGrid>
-      <w:tr>
-        <w:trPr>
-          <w:tblHeader/>
-        </w:trPr>
-        <w:tc>
-          <w:tcPr>
-            <w:tcW w:type="dxa" w:w="4600"/>
-            <w:shd w:fill="0B2A57" w:val="clear"/>
-            <w:tcMar>
-              <w:top w:type="dxa" w:w="80"/>
-              <w:left w:type="dxa" w:w="100"/>
-              <w:bottom w:type="dxa" w:w="80"/>
-              <w:right w:type="dxa" w:w="100"/>
-            </w:tcMar>
-          </w:tcPr>
-          <w:p>
-            <w:r>
-              <w:rPr>
-                <w:b/>
-                <w:bCs/>
-                <w:color w:val="FFFFFF"/>
-                <w:sz w:val="19"/>
-                <w:szCs w:val="19"/>
-              </w:rPr>
-              <w:t xml:space="preserve">Cenário de hospedagem</w:t>
-            </w:r>
-          </w:p>
-        </w:tc>
-        <w:tc>
-          <w:tcPr>
-            <w:tcW w:type="dxa" w:w="2700"/>
-            <w:shd w:fill="0B2A57" w:val="clear"/>
-            <w:tcMar>
-              <w:top w:type="dxa" w:w="80"/>
-              <w:left w:type="dxa" w:w="100"/>
-              <w:bottom w:type="dxa" w:w="80"/>
-              <w:right w:type="dxa" w:w="100"/>
-            </w:tcMar>
-          </w:tcPr>
-          <w:p>
-            <w:r>
-              <w:rPr>
-                <w:b/>
-                <w:bCs/>
-                <w:color w:val="FFFFFF"/>
-                <w:sz w:val="19"/>
-                <w:szCs w:val="19"/>
-              </w:rPr>
-              <w:t xml:space="preserve">Itens pagos</w:t>
-            </w:r>
-          </w:p>
-        </w:tc>
-        <w:tc>
-          <w:tcPr>
-            <w:tcW w:type="dxa" w:w="2300"/>
-            <w:shd w:fill="0B2A57" w:val="clear"/>
-            <w:tcMar>
-              <w:top w:type="dxa" w:w="80"/>
-              <w:left w:type="dxa" w:w="100"/>
-              <w:bottom w:type="dxa" w:w="80"/>
-              <w:right w:type="dxa" w:w="100"/>
-            </w:tcMar>
-          </w:tcPr>
-          <w:p>
-            <w:r>
-              <w:rPr>
-                <w:b/>
-                <w:bCs/>
-                <w:color w:val="FFFFFF"/>
-                <w:sz w:val="19"/>
-                <w:szCs w:val="19"/>
-              </w:rPr>
-              <w:t xml:space="preserve">Custo mensal</w:t>
-            </w:r>
-          </w:p>
-        </w:tc>
-      </w:tr>
-      <w:tr>
-        <w:tc>
-          <w:tcPr>
-            <w:tcW w:type="dxa" w:w="4600"/>
-            <w:tcMar>
-              <w:top w:type="dxa" w:w="80"/>
-              <w:left w:type="dxa" w:w="100"/>
-              <w:bottom w:type="dxa" w:w="80"/>
-              <w:right w:type="dxa" w:w="100"/>
-            </w:tcMar>
-          </w:tcPr>
-          <w:p>
-            <w:r>
-              <w:rPr>
-                <w:sz w:val="19"/>
-                <w:szCs w:val="19"/>
-              </w:rPr>
-              <w:t xml:space="preserve">Servidor próprio (atual)</w:t>
-            </w:r>
-          </w:p>
-        </w:tc>
-        <w:tc>
-          <w:tcPr>
-            <w:tcW w:type="dxa" w:w="2700"/>
-            <w:tcMar>
-              <w:top w:type="dxa" w:w="80"/>
-              <w:left w:type="dxa" w:w="100"/>
-              <w:bottom w:type="dxa" w:w="80"/>
-              <w:right w:type="dxa" w:w="100"/>
-            </w:tcMar>
-          </w:tcPr>
-          <w:p>
-            <w:r>
-              <w:rPr>
-                <w:sz w:val="19"/>
-                <w:szCs w:val="19"/>
-              </w:rPr>
-              <w:t xml:space="preserve">Hospedagem + WhatsApp</w:t>
-            </w:r>
-          </w:p>
-        </w:tc>
-        <w:tc>
-          <w:tcPr>
-            <w:tcW w:type="dxa" w:w="2300"/>
-            <w:tcMar>
-              <w:top w:type="dxa" w:w="80"/>
-              <w:left w:type="dxa" w:w="100"/>
-              <w:bottom w:type="dxa" w:w="80"/>
-              <w:right w:type="dxa" w:w="100"/>
-            </w:tcMar>
-          </w:tcPr>
-          <w:p>
-            <w:r>
-              <w:rPr>
-                <w:sz w:val="19"/>
-                <w:szCs w:val="19"/>
-              </w:rPr>
-              <w:t xml:space="preserve">R$ 200</w:t>
-            </w:r>
-          </w:p>
-        </w:tc>
-      </w:tr>
-      <w:tr>
-        <w:tc>
-          <w:tcPr>
-            <w:tcW w:type="dxa" w:w="4600"/>
-            <w:tcMar>
-              <w:top w:type="dxa" w:w="80"/>
-              <w:left w:type="dxa" w:w="100"/>
-              <w:bottom w:type="dxa" w:w="80"/>
-              <w:right w:type="dxa" w:w="100"/>
-            </w:tcMar>
-          </w:tcPr>
-          <w:p>
-            <w:r>
-              <w:rPr>
-                <w:sz w:val="19"/>
-                <w:szCs w:val="19"/>
-              </w:rPr>
-              <w:t xml:space="preserve">Intranet já existente, número único de WhatsApp</w:t>
-            </w:r>
-          </w:p>
-        </w:tc>
-        <w:tc>
-          <w:tcPr>
-            <w:tcW w:type="dxa" w:w="2700"/>
-            <w:tcMar>
-              <w:top w:type="dxa" w:w="80"/>
-              <w:left w:type="dxa" w:w="100"/>
-              <w:bottom w:type="dxa" w:w="80"/>
-              <w:right w:type="dxa" w:w="100"/>
-            </w:tcMar>
-          </w:tcPr>
-          <w:p>
-            <w:r>
-              <w:rPr>
-                <w:sz w:val="19"/>
-                <w:szCs w:val="19"/>
-              </w:rPr>
-              <w:t xml:space="preserve">Apenas WhatsApp</w:t>
-            </w:r>
-          </w:p>
-        </w:tc>
-        <w:tc>
-          <w:tcPr>
-            <w:tcW w:type="dxa" w:w="2300"/>
-            <w:tcMar>
-              <w:top w:type="dxa" w:w="80"/>
-              <w:left w:type="dxa" w:w="100"/>
-              <w:bottom w:type="dxa" w:w="80"/>
-              <w:right w:type="dxa" w:w="100"/>
-            </w:tcMar>
-          </w:tcPr>
-          <w:p>
-            <w:r>
-              <w:rPr>
-                <w:sz w:val="19"/>
-                <w:szCs w:val="19"/>
-              </w:rPr>
-              <w:t xml:space="preserve">R$ 100</w:t>
-            </w:r>
-          </w:p>
-        </w:tc>
-      </w:tr>
-      <w:tr>
-        <w:tc>
-          <w:tcPr>
-            <w:tcW w:type="dxa" w:w="4600"/>
-            <w:tcMar>
-              <w:top w:type="dxa" w:w="80"/>
-              <w:left w:type="dxa" w:w="100"/>
-              <w:bottom w:type="dxa" w:w="80"/>
-              <w:right w:type="dxa" w:w="100"/>
-            </w:tcMar>
-          </w:tcPr>
-          <w:p>
-            <w:r>
-              <w:rPr>
-                <w:sz w:val="19"/>
-                <w:szCs w:val="19"/>
-              </w:rPr>
-              <w:t xml:space="preserve">Intranet já existente, um número por aplicação</w:t>
-            </w:r>
-          </w:p>
-        </w:tc>
-        <w:tc>
-          <w:tcPr>
-            <w:tcW w:type="dxa" w:w="2700"/>
-            <w:tcMar>
-              <w:top w:type="dxa" w:w="80"/>
-              <w:left w:type="dxa" w:w="100"/>
-              <w:bottom w:type="dxa" w:w="80"/>
-              <w:right w:type="dxa" w:w="100"/>
-            </w:tcMar>
-          </w:tcPr>
-          <w:p>
-            <w:r>
-              <w:rPr>
-                <w:sz w:val="19"/>
-                <w:szCs w:val="19"/>
-              </w:rPr>
-              <w:t xml:space="preserve">Apenas WhatsApp (2 números)</w:t>
-            </w:r>
-          </w:p>
-        </w:tc>
-        <w:tc>
-          <w:tcPr>
-            <w:tcW w:type="dxa" w:w="2300"/>
-            <w:tcMar>
-              <w:top w:type="dxa" w:w="80"/>
-              <w:left w:type="dxa" w:w="100"/>
-              <w:bottom w:type="dxa" w:w="80"/>
-              <w:right w:type="dxa" w:w="100"/>
-            </w:tcMar>
-          </w:tcPr>
-          <w:p>
-            <w:r>
-              <w:rPr>
-                <w:sz w:val="19"/>
-                <w:szCs w:val="19"/>
-              </w:rPr>
-              <w:t xml:space="preserve">R$ 200</w:t>
-            </w:r>
-          </w:p>
-        </w:tc>
-      </w:tr>
-    </w:tbl>
-    <w:p>
-      <w:pPr>
-        <w:spacing w:after="160"/>
-      </w:pPr>
-    </w:p>
-    <w:p>
-      <w:pPr>
-        <w:spacing w:after="160" w:line="300"/>
-      </w:pPr>
-      <w:r>
-        <w:rPr>
-          <w:sz w:val="21"/>
-          <w:szCs w:val="21"/>
-        </w:rPr>
-        <w:t xml:space="preserve">Ou seja: migrar a hospedagem para uma Intranet já existente elimina o item "Hospedagem" do custo da plataforma — o custo final passaria a depender somente do WhatsApp automático, com valor de R$ 100 ou R$ 200/mês conforme o número de WhatsApp seja único ou separado por aplicação (seção 4.3). Nenhuma outra ferramenta do Painel teria custo remanescente nesse cenário.</w:t>
+        <w:t xml:space="preserve">4.3. Por que o WhatsApp é cobrado por número</w:t>
+      </w:r>
+    </w:p>
+    <w:p>
+      <w:pPr>
+        <w:spacing w:after="160" w:line="300"/>
+      </w:pPr>
+      <w:r>
+        <w:rPr>
+          <w:sz w:val="21"/>
+          <w:szCs w:val="21"/>
+        </w:rPr>
+        <w:t xml:space="preserve">O Z-API cobra por número de WhatsApp conectado à assinatura — não por mensagem enviada, nem por quantidade de aplicações que utilizam esse número. Hoje a Gestão de Laboratório, o Gerador de Contratos e o Fechamento do CAP dividem o mesmo número e a mesma assinatura (R$ 100/mês, contado uma única vez na tabela da seção 4.2). Se um dia for necessário um número próprio por aplicação, cada número adicional soma mais R$ 100/mês ao custo da plataforma, sem alterar o custo de hospedagem — é essa a diferença entre as linhas "número único" e "número por aplicação" da tabela em 4.2.</w:t>
       </w:r>
     </w:p>
     <w:p>

</xml_diff>

<commit_message>
Condensa textos de "O que é"/"Contexto de uso" e a seção de assinatura digital
Reduz a extensão de cada descrição de ferramenta na seção 2 e resume
a seção 3 (diagnóstico, validação por hash, tipos de assinatura,
comparação com o mercado, recomendação), mantendo todos os valores de
custo e as tabelas de referência intactos.
</commit_message>
<xml_diff>
--- a/docs/Ferramentas-Painel-ABO-Goias.docx
+++ b/docs/Ferramentas-Painel-ABO-Goias.docx
@@ -212,19 +212,19 @@
           <w:sz w:val="21"/>
           <w:szCs w:val="21"/>
         </w:rPr>
-        <w:t xml:space="preserve">O que é: a porta de entrada do sistema. É onde qualquer colaborador faz login e vê, em uma única tela, um resumo em números e o acesso às demais ferramentas.</w:t>
-      </w:r>
-    </w:p>
-    <w:p>
-      <w:pPr>
-        <w:spacing w:after="160" w:line="300"/>
-      </w:pPr>
-      <w:r>
-        <w:rPr>
-          <w:sz w:val="21"/>
-          <w:szCs w:val="21"/>
-        </w:rPr>
-        <w:t xml:space="preserve">Contexto de uso: usado por todos os colaboradores, todos os dias, como primeira tela ao entrar no sistema. É também onde um novo colaborador solicita acesso — pedido que é aprovado ou recusado por um administrador antes de a conta ser liberada.</w:t>
+        <w:t xml:space="preserve">O que é: porta de entrada do sistema — login único e acesso às demais ferramentas.</w:t>
+      </w:r>
+    </w:p>
+    <w:p>
+      <w:pPr>
+        <w:spacing w:after="160" w:line="300"/>
+      </w:pPr>
+      <w:r>
+        <w:rPr>
+          <w:sz w:val="21"/>
+          <w:szCs w:val="21"/>
+        </w:rPr>
+        <w:t xml:space="preserve">Contexto de uso: primeira tela de todo colaborador, todos os dias; também onde se solicita acesso, aprovado por um administrador.</w:t>
       </w:r>
     </w:p>
     <w:p>
@@ -309,19 +309,19 @@
           <w:sz w:val="21"/>
           <w:szCs w:val="21"/>
         </w:rPr>
-        <w:t xml:space="preserve">O que é: controla o ciclo de vida dos pacotes de instrumentais odontológicos que os alunos de pós-graduação entregam para esterilização — da entrada até a devolução — além do empréstimo avulso de kits de materiais e do cadastro de turmas e alunos (sincronizado automaticamente do sistema acadêmico Eduq).</w:t>
-      </w:r>
-    </w:p>
-    <w:p>
-      <w:pPr>
-        <w:spacing w:after="160" w:line="300"/>
-      </w:pPr>
-      <w:r>
-        <w:rPr>
-          <w:sz w:val="21"/>
-          <w:szCs w:val="21"/>
-        </w:rPr>
-        <w:t xml:space="preserve">Contexto de uso: usado pela equipe da CME e pelos alunos de pós-graduação. O aluno entrega um pacote de instrumentais para esterilizar; a equipe registra a entrada, acompanha o processo e registra a retirada quando o aluno busca o material de volta. O mesmo aluno também pode retirar kits de material emprestado, que precisam ser devolvidos depois.</w:t>
+        <w:t xml:space="preserve">O que é: controla a esterilização de instrumentais odontológicos entregues pelos alunos — da entrada à devolução — e o empréstimo de kits de materiais.</w:t>
+      </w:r>
+    </w:p>
+    <w:p>
+      <w:pPr>
+        <w:spacing w:after="160" w:line="300"/>
+      </w:pPr>
+      <w:r>
+        <w:rPr>
+          <w:sz w:val="21"/>
+          <w:szCs w:val="21"/>
+        </w:rPr>
+        <w:t xml:space="preserve">Contexto de uso: a equipe da CME registra a entrada e a saída dos pacotes de cada aluno e controla os kits emprestados, que depois são devolvidos.</w:t>
       </w:r>
     </w:p>
     <w:p>
@@ -406,19 +406,19 @@
           <w:sz w:val="21"/>
           <w:szCs w:val="21"/>
         </w:rPr>
-        <w:t xml:space="preserve">O que é: controla os pedidos de material odontológico (próteses, aparelhos etc.) enviados a laboratórios parceiros externos — do registro do pedido até a entrega da peça pronta e o fechamento financeiro com o paciente e o laboratório.</w:t>
-      </w:r>
-    </w:p>
-    <w:p>
-      <w:pPr>
-        <w:spacing w:after="160" w:line="300"/>
-      </w:pPr>
-      <w:r>
-        <w:rPr>
-          <w:sz w:val="21"/>
-          <w:szCs w:val="21"/>
-        </w:rPr>
-        <w:t xml:space="preserve">Contexto de uso: usado pelos coordenadores dos laboratórios da clínica-escola. Um aluno faz a moldagem do paciente; o coordenador registra o pedido ao laboratório parceiro, acompanha o prazo de entrega e, quando a peça chega, controla o faturamento — quem já pagou, o paciente e/ou o laboratório.</w:t>
+        <w:t xml:space="preserve">O que é: controla os pedidos de material odontológico enviados a laboratórios parceiros, do registro à entrega e ao faturamento.</w:t>
+      </w:r>
+    </w:p>
+    <w:p>
+      <w:pPr>
+        <w:spacing w:after="160" w:line="300"/>
+      </w:pPr>
+      <w:r>
+        <w:rPr>
+          <w:sz w:val="21"/>
+          <w:szCs w:val="21"/>
+        </w:rPr>
+        <w:t xml:space="preserve">Contexto de uso: o coordenador registra o pedido a partir da moldagem do paciente, acompanha o prazo de entrega e controla quem já pagou — paciente e/ou laboratório.</w:t>
       </w:r>
     </w:p>
     <w:p>
@@ -486,7 +486,7 @@
           <w:sz w:val="21"/>
           <w:szCs w:val="21"/>
         </w:rPr>
-        <w:t xml:space="preserve"> — R$ 100/mês. Usado para cobrar automaticamente, uma vez por dia, os laboratórios parceiros com pedidos atrasados. Hoje usa o mesmo número (e a mesma assinatura) do Gerador de Contratos e do Fechamento do CAP — a cobrança é por número conectado, não por aplicação (ver seção 4.3).</w:t>
+        <w:t xml:space="preserve"> — R$ 100/mês. Cobra automaticamente, uma vez por dia, os laboratórios parceiros com pedidos atrasados. Hoje usa o mesmo número do Gerador de Contratos e do Fechamento do CAP — a cobrança é por número conectado, não por aplicação (ver seção 4.3).</w:t>
       </w:r>
     </w:p>
     <w:p>
@@ -529,19 +529,19 @@
           <w:sz w:val="21"/>
           <w:szCs w:val="21"/>
         </w:rPr>
-        <w:t xml:space="preserve">O que é: gera, em poucos cliques, um arquivo de apresentação (PowerPoint) pronto para impressão com os identificadores (crachás) de bancada de uma turma inteira de alunos — nome, matrícula e demais dados, no modelo visual escolhido.</w:t>
-      </w:r>
-    </w:p>
-    <w:p>
-      <w:pPr>
-        <w:spacing w:after="160" w:line="300"/>
-      </w:pPr>
-      <w:r>
-        <w:rPr>
-          <w:sz w:val="21"/>
-          <w:szCs w:val="21"/>
-        </w:rPr>
-        <w:t xml:space="preserve">Contexto de uso: usado pela coordenação acadêmica no início de cada período letivo, ou quando entra um aluno novo. Basta escolher a turma — os dados dos alunos vêm automaticamente do sistema acadêmico Eduq — e o modelo de identificador entre os disponíveis, e o arquivo já sai pronto para impressão.</w:t>
+        <w:t xml:space="preserve">O que é: gera um arquivo de apresentação (PowerPoint) com os identificadores (crachás) de bancada de uma turma inteira.</w:t>
+      </w:r>
+    </w:p>
+    <w:p>
+      <w:pPr>
+        <w:spacing w:after="160" w:line="300"/>
+      </w:pPr>
+      <w:r>
+        <w:rPr>
+          <w:sz w:val="21"/>
+          <w:szCs w:val="21"/>
+        </w:rPr>
+        <w:t xml:space="preserve">Contexto de uso: usado pela coordenação acadêmica no início do período letivo ou quando entra um aluno novo — basta escolher turma e modelo.</w:t>
       </w:r>
     </w:p>
     <w:p>
@@ -626,19 +626,19 @@
           <w:sz w:val="21"/>
           <w:szCs w:val="21"/>
         </w:rPr>
-        <w:t xml:space="preserve">O que é: automação auxiliar para descadastrar ou recadastrar o acesso de um aluno no Dental Office (sistema de acesso de alunos), com base em critérios vindos do Eduq — férias, cancelamento de matrícula, finalização de turma ou inadimplência. Substitui o processo manual de checar o Eduq e o Dental Office em abas separadas.</w:t>
-      </w:r>
-    </w:p>
-    <w:p>
-      <w:pPr>
-        <w:spacing w:after="160" w:line="300"/>
-      </w:pPr>
-      <w:r>
-        <w:rPr>
-          <w:sz w:val="21"/>
-          <w:szCs w:val="21"/>
-        </w:rPr>
-        <w:t xml:space="preserve">Contexto de uso: um colaborador da ABO usa a ferramenta para cadastrar ou descadastrar em lote o acesso de alunos no Dental Office, a partir dos mesmos critérios (férias, cancelamento de matrícula, finalização de turma ou inadimplência no Eduq), sem precisar checar os dois sistemas manualmente.</w:t>
+        <w:t xml:space="preserve">O que é: automação que descadastra ou recadastra o acesso de um aluno no Dental Office, com base em critérios do Eduq (férias, cancelamento de matrícula, finalização de turma ou inadimplência).</w:t>
+      </w:r>
+    </w:p>
+    <w:p>
+      <w:pPr>
+        <w:spacing w:after="160" w:line="300"/>
+      </w:pPr>
+      <w:r>
+        <w:rPr>
+          <w:sz w:val="21"/>
+          <w:szCs w:val="21"/>
+        </w:rPr>
+        <w:t xml:space="preserve">Contexto de uso: o colaborador da ABO atualiza o acesso de alunos em lote, sem checar Eduq e Dental Office manualmente em abas separadas.</w:t>
       </w:r>
     </w:p>
     <w:p>
@@ -735,7 +735,7 @@
           <w:sz w:val="21"/>
           <w:szCs w:val="21"/>
         </w:rPr>
-        <w:t xml:space="preserve">Contexto de uso: o colaborador recebe, por WhatsApp, um relatório com o fechamento do caixa feito no Dental Office.</w:t>
+        <w:t xml:space="preserve">Contexto de uso: o colaborador recebe o relatório de fechamento por WhatsApp.</w:t>
       </w:r>
     </w:p>
     <w:p>
@@ -777,7 +777,7 @@
           <w:sz w:val="21"/>
           <w:szCs w:val="21"/>
         </w:rPr>
-        <w:t xml:space="preserve"> — R$ 100/mês. Usado para encaminhar o relatório de fechamento ao WhatsApp do colaborador. Hoje usa o mesmo número (e a mesma assinatura) do Gerador de Contratos e da Gestão de Laboratório — a cobrança é por número conectado, não por aplicação (ver seção 4.3).</w:t>
+        <w:t xml:space="preserve"> — R$ 100/mês. Encaminha o relatório de fechamento ao WhatsApp do colaborador. Hoje usa o mesmo número do Gerador de Contratos e da Gestão de Laboratório — a cobrança é por número conectado, não por aplicação (ver seção 4.3).</w:t>
       </w:r>
     </w:p>
     <w:p>
@@ -832,7 +832,7 @@
           <w:sz w:val="21"/>
           <w:szCs w:val="21"/>
         </w:rPr>
-        <w:t xml:space="preserve">Contexto de uso: usado pela coordenação para consultar o fechamento e o valor a receber apurado para cada coordenador.</w:t>
+        <w:t xml:space="preserve">Contexto de uso: usado pela coordenação para consultar o fechamento e o valor a receber apurado.</w:t>
       </w:r>
     </w:p>
     <w:p>
@@ -917,19 +917,19 @@
           <w:sz w:val="21"/>
           <w:szCs w:val="21"/>
         </w:rPr>
-        <w:t xml:space="preserve">O que é: gera contratos e termos de consentimento odontológico personalizados para cada paciente e conduz a assinatura digital do documento, sem precisar de papel nem de outro programa.</w:t>
-      </w:r>
-    </w:p>
-    <w:p>
-      <w:pPr>
-        <w:spacing w:after="160" w:line="300"/>
-      </w:pPr>
-      <w:r>
-        <w:rPr>
-          <w:sz w:val="21"/>
-          <w:szCs w:val="21"/>
-        </w:rPr>
-        <w:t xml:space="preserve">Contexto de uso: usado pelos colaboradores da recepção/clínica no momento do atendimento. O sistema monta o documento com os dados do paciente e do procedimento, e o paciente assina na hora — pelo próprio celular, lendo um QR Code, ou num totem dedicado da clínica —, com o arquivo assinado sendo enviado automaticamente ao Dental Office e por WhatsApp. Por ser a ferramenta mais recente e a que envolve validade jurídica, ela é detalhada em profundidade na próxima seção.</w:t>
+        <w:t xml:space="preserve">O que é: gera contratos e termos de consentimento personalizados e conduz a assinatura digital do documento, sem papel.</w:t>
+      </w:r>
+    </w:p>
+    <w:p>
+      <w:pPr>
+        <w:spacing w:after="160" w:line="300"/>
+      </w:pPr>
+      <w:r>
+        <w:rPr>
+          <w:sz w:val="21"/>
+          <w:szCs w:val="21"/>
+        </w:rPr>
+        <w:t xml:space="preserve">Contexto de uso: na recepção/clínica, o sistema monta o documento e o paciente assina na hora — pelo celular, QR Code ou totem —, com envio automático ao Dental Office e por WhatsApp. Detalhada na próxima seção.</w:t>
       </w:r>
     </w:p>
     <w:p>
@@ -1088,7 +1088,7 @@
           <w:sz w:val="21"/>
           <w:szCs w:val="21"/>
         </w:rPr>
-        <w:t xml:space="preserve">A assinatura está implementada no próprio Gerador de Contratos, sem depender de nenhuma plataforma externa. O fluxo combina identificação do paciente, assinatura manuscrita digitalizada e uma trilha de evidências técnica, em cinco etapas:</w:t>
+        <w:t xml:space="preserve">A assinatura está implementada no próprio Gerador de Contratos, sem depender de plataforma externa, em cinco etapas:</w:t>
       </w:r>
     </w:p>
     <w:p>
@@ -1114,7 +1114,7 @@
           <w:sz w:val="21"/>
           <w:szCs w:val="21"/>
         </w:rPr>
-        <w:t xml:space="preserve"> — o link de assinatura é gerado com uma chave assinada pelo servidor; nenhum segredo fica gravado no banco, a validade tem prazo e o link só pode ser usado uma vez.</w:t>
+        <w:t xml:space="preserve"> — link assinado pelo servidor, com prazo de validade e uso único.</w:t>
       </w:r>
     </w:p>
     <w:p>
@@ -1140,7 +1140,7 @@
           <w:sz w:val="21"/>
           <w:szCs w:val="21"/>
         </w:rPr>
-        <w:t xml:space="preserve"> — antes de liberar a assinatura, o paciente (ou responsável, se for menor de idade) confirma um dado pessoal, com limite de tentativas, além de uma confirmação presencial opcional feita por um colaborador.</w:t>
+        <w:t xml:space="preserve"> — o paciente (ou responsável, se menor) confirma um dado pessoal antes de assinar, com limite de tentativas.</w:t>
       </w:r>
     </w:p>
     <w:p>
@@ -1166,7 +1166,7 @@
           <w:sz w:val="21"/>
           <w:szCs w:val="21"/>
         </w:rPr>
-        <w:t xml:space="preserve"> — o paciente desenha a própria assinatura na tela; a imagem é validada e aplicada sobre a linha de assinatura do PDF.</w:t>
+        <w:t xml:space="preserve"> — o paciente desenha a assinatura na tela, aplicada sobre o PDF.</w:t>
       </w:r>
     </w:p>
     <w:p>
@@ -1185,14 +1185,14 @@
           <w:sz w:val="21"/>
           <w:szCs w:val="21"/>
         </w:rPr>
-        <w:t xml:space="preserve">Carimbo de auditoria e trilha de eventos</w:t>
-      </w:r>
-      <w:r>
-        <w:rPr>
-          <w:sz w:val="21"/>
-          <w:szCs w:val="21"/>
-        </w:rPr>
-        <w:t xml:space="preserve"> — data, hora e IP ficam registrados no rodapé do PDF e num histórico completo (abertura do link, confirmação de identidade, horários).</w:t>
+        <w:t xml:space="preserve">Carimbo de auditoria</w:t>
+      </w:r>
+      <w:r>
+        <w:rPr>
+          <w:sz w:val="21"/>
+          <w:szCs w:val="21"/>
+        </w:rPr>
+        <w:t xml:space="preserve"> — data, hora e IP registrados no PDF e num histórico de eventos.</w:t>
       </w:r>
     </w:p>
     <w:p>
@@ -1218,7 +1218,7 @@
           <w:sz w:val="21"/>
           <w:szCs w:val="21"/>
         </w:rPr>
-        <w:t xml:space="preserve"> — o sistema calcula uma “impressão digital” do PDF assinado (explicada a seguir) e, quando configurado, também obtém de uma autoridade externa um comprovante independente de data e hora do documento.</w:t>
+        <w:t xml:space="preserve"> — hash do PDF assinado e, quando configurado, carimbo de uma autoridade externa (explicado a seguir).</w:t>
       </w:r>
     </w:p>
     <w:p>
@@ -1246,35 +1246,7 @@
           <w:sz w:val="21"/>
           <w:szCs w:val="21"/>
         </w:rPr>
-        <w:t xml:space="preserve">Esta parte explica, sem termos técnicos, o mecanismo que permite ao sistema provar que um documento é autêntico e que não foi alterado depois de assinado — sem depender de nenhum software de terceiros. Esse mecanismo se chama hash.</w:t>
-      </w:r>
-    </w:p>
-    <w:p>
-      <w:pPr>
-        <w:pStyle w:val="Heading3"/>
-        <w:spacing w:after="100" w:before="200"/>
-      </w:pPr>
-      <w:r>
-        <w:rPr>
-          <w:b/>
-          <w:bCs/>
-          <w:color w:val="1D6EEE"/>
-          <w:sz w:val="22"/>
-          <w:szCs w:val="22"/>
-        </w:rPr>
-        <w:t xml:space="preserve">O que é um hash — a impressão digital do arquivo</w:t>
-      </w:r>
-    </w:p>
-    <w:p>
-      <w:pPr>
-        <w:spacing w:after="160" w:line="300"/>
-      </w:pPr>
-      <w:r>
-        <w:rPr>
-          <w:sz w:val="21"/>
-          <w:szCs w:val="21"/>
-        </w:rPr>
-        <w:t xml:space="preserve">Pense no hash como a impressão digital do arquivo: um código curto, calculado a partir de todo o conteúdo do documento. Ele tem uma propriedade essencial: mudar qualquer coisa no documento — uma vírgula, um valor, um pixel da assinatura — gera um código completamente diferente. Duas frases quase idênticas, mudando só um número, já produzem impressões digitais sem nenhuma semelhança entre si:</w:t>
+        <w:t xml:space="preserve">O sistema prova que um documento é autêntico e não foi alterado usando um hash: um código curto calculado a partir de todo o conteúdo do arquivo. Mudar qualquer detalhe — mesmo um caractere — gera um hash completamente diferente:</w:t>
       </w:r>
     </w:p>
     <w:tbl>
@@ -1438,18 +1410,6 @@
     </w:p>
     <w:p>
       <w:pPr>
-        <w:spacing w:after="160" w:line="300"/>
-      </w:pPr>
-      <w:r>
-        <w:rPr>
-          <w:sz w:val="21"/>
-          <w:szCs w:val="21"/>
-        </w:rPr>
-        <w:t xml:space="preserve">Apenas um caractere mudou (5 → 9), e o resultado não tem nenhuma semelhança com o anterior — por isso qualquer adulteração, por menor que seja, é detectada.</w:t>
-      </w:r>
-    </w:p>
-    <w:p>
-      <w:pPr>
         <w:pStyle w:val="Heading3"/>
         <w:spacing w:after="100" w:before="200"/>
       </w:pPr>
@@ -1478,7 +1438,7 @@
           <w:sz w:val="21"/>
           <w:szCs w:val="21"/>
         </w:rPr>
-        <w:t xml:space="preserve">No momento da assinatura, o sistema calcula a impressão digital do PDF assinado e a guarda em seu registro.</w:t>
+        <w:t xml:space="preserve">Na assinatura, o sistema calcula o hash do PDF assinado e o guarda.</w:t>
       </w:r>
     </w:p>
     <w:p>
@@ -1495,7 +1455,7 @@
           <w:sz w:val="21"/>
           <w:szCs w:val="21"/>
         </w:rPr>
-        <w:t xml:space="preserve">Na hora de validar, qualquer pessoa envia o PDF numa página pública de validação, e o sistema recalcula a impressão digital do arquivo recebido.</w:t>
+        <w:t xml:space="preserve">Para validar, qualquer pessoa envia o PDF numa página pública, e o sistema recalcula o hash do arquivo recebido.</w:t>
       </w:r>
     </w:p>
     <w:p>
@@ -1512,19 +1472,19 @@
           <w:sz w:val="21"/>
           <w:szCs w:val="21"/>
         </w:rPr>
-        <w:t xml:space="preserve">O sistema compara as duas impressões digitais: se forem iguais, o documento é autêntico e íntegro; se forem diferentes, o arquivo foi alterado ou não foi emitido por esta plataforma.</w:t>
-      </w:r>
-    </w:p>
-    <w:p>
-      <w:pPr>
-        <w:spacing w:after="160" w:line="300"/>
-      </w:pPr>
-      <w:r>
-        <w:rPr>
-          <w:sz w:val="21"/>
-          <w:szCs w:val="21"/>
-        </w:rPr>
-        <w:t xml:space="preserve">Como reforço adicional, o sistema pode anexar um carimbo de tempo (RFC 3161): um atestado de data e hora emitido por uma autoridade externa e independente, provando não só que o documento não mudou, mas também desde quando ele existe.</w:t>
+        <w:t xml:space="preserve">Se os dois hashes forem iguais, o documento é autêntico; se diferentes, foi alterado ou não veio desta plataforma.</w:t>
+      </w:r>
+    </w:p>
+    <w:p>
+      <w:pPr>
+        <w:spacing w:after="160" w:line="300"/>
+      </w:pPr>
+      <w:r>
+        <w:rPr>
+          <w:sz w:val="21"/>
+          <w:szCs w:val="21"/>
+        </w:rPr>
+        <w:t xml:space="preserve">Como reforço, o sistema pode anexar um carimbo de tempo (RFC 3161) — um atestado de data e hora de uma autoridade externa independente.</w:t>
       </w:r>
     </w:p>
     <w:p>
@@ -1552,7 +1512,7 @@
           <w:sz w:val="21"/>
           <w:szCs w:val="21"/>
         </w:rPr>
-        <w:t xml:space="preserve">A legislação brasileira (Lei nº 14.063/2020) define três níveis de assinatura eletrônica, em ordem crescente de força de prova:</w:t>
+        <w:t xml:space="preserve">A Lei nº 14.063/2020 define três níveis, em ordem crescente de força de prova:</w:t>
       </w:r>
     </w:p>
     <w:tbl>
@@ -1866,31 +1826,7 @@
           <w:sz w:val="21"/>
           <w:szCs w:val="21"/>
         </w:rPr>
-        <w:t xml:space="preserve">O sistema atual é uma Assinatura Eletrônica Simples, com trilha de evidências reforçada. Ele cumpre o requisito da assinatura simples e vai além da média do mercado em integridade — impressão digital do documento, carimbo de tempo de terceiro e trilha de auditoria detalhada.</w:t>
-      </w:r>
-    </w:p>
-    <w:p>
-      <w:pPr>
-        <w:spacing w:after="160" w:line="300"/>
-      </w:pPr>
-      <w:r>
-        <w:rPr>
-          <w:sz w:val="21"/>
-          <w:szCs w:val="21"/>
-        </w:rPr>
-        <w:t xml:space="preserve">Para se tornar formalmente “avançada”, faltaria vincular a autoria a um fator sob controle exclusivo do paciente (certificado próprio, biometria facial com prova de vida ou identidade gov.br) — hoje a confirmação de identidade usa um dado pessoal, um controle relativamente mais simples.</w:t>
-      </w:r>
-    </w:p>
-    <w:p>
-      <w:pPr>
-        <w:spacing w:after="160" w:line="300"/>
-      </w:pPr>
-      <w:r>
-        <w:rPr>
-          <w:sz w:val="21"/>
-          <w:szCs w:val="21"/>
-        </w:rPr>
-        <w:t xml:space="preserve">Isso não é um problema para o uso atual: para termos de consentimento e contratos odontológicos entre a clínica e o paciente, a assinatura simples já tem validade jurídica — e a implementação em uso é, inclusive, mais robusta que muitas soluções “simples” disponíveis no mercado.</w:t>
+        <w:t xml:space="preserve">O sistema é uma Assinatura Eletrônica Simples, com trilha de evidências acima da média do mercado (hash do documento, carimbo de tempo, auditoria detalhada). Para virar “avançada”, faltaria vincular a autoria a um fator exclusivo do paciente (certificado próprio, biometria, gov.br). Isso não é um problema hoje: para termos de consentimento e contratos odontológicos, a assinatura simples já tem validade jurídica plena.</w:t>
       </w:r>
     </w:p>
     <w:p>
@@ -1918,7 +1854,7 @@
           <w:sz w:val="21"/>
           <w:szCs w:val="21"/>
         </w:rPr>
-        <w:t xml:space="preserve">Existem diversas plataformas brasileiras especializadas em assinatura eletrônica. O quadro abaixo resume sete das principais do mercado (preços de referência coletados em julho de 2026):</w:t>
+        <w:t xml:space="preserve">Sete das principais plataformas brasileiras de assinatura eletrônica (preços de referência, julho de 2026):</w:t>
       </w:r>
     </w:p>
     <w:tbl>
@@ -2640,31 +2576,31 @@
           <w:sz w:val="21"/>
           <w:szCs w:val="21"/>
         </w:rPr>
-        <w:t xml:space="preserve">Adotar uma dessas plataformas traria benefícios reais: a responsabilidade jurídica passaria a ser sustentada por um especialista testado em juízo, com relatórios de assinatura padronizados; a identidade forte (biometria facial, validação de CPF, gov.br) viria pronta, sem desenvolvimento próprio; existiria um caminho pronto para a assinatura qualificada ICP-Brasil, se algum dia for exigida; e a manutenção técnica (carimbo de tempo, criptografia, conformidade) passaria a ser responsabilidade do fornecedor.</w:t>
-      </w:r>
-    </w:p>
-    <w:p>
-      <w:pPr>
-        <w:spacing w:after="160" w:line="300"/>
-      </w:pPr>
-      <w:r>
-        <w:rPr>
-          <w:sz w:val="21"/>
-          <w:szCs w:val="21"/>
-        </w:rPr>
-        <w:t xml:space="preserve">Esses benefícios, porém, vêm com contrapartidas que hoje não se justificam: passaria a existir uma mensalidade ou um custo por documento onde hoje o custo marginal é praticamente zero; o fluxo de assinatura, os links e o armazenamento passariam a depender de um fornecedor externo (com custo de migração se um dia for preciso trocar); dados sensíveis de pacientes passariam a trafegar por um terceiro, exigindo um novo contrato de tratamento de dados sob a LGPD; seria necessário refazer a integração já existente (QR Code, totem, WhatsApp, envio ao Dental Office) para a API do fornecedor; e a clínica perderia o controle total que tem hoje sobre a experiência de assinatura (tela própria, confirmação presencial, tratamento de menores de idade).</w:t>
-      </w:r>
-    </w:p>
-    <w:p>
-      <w:pPr>
-        <w:spacing w:after="160" w:line="300"/>
-      </w:pPr>
-      <w:r>
-        <w:rPr>
-          <w:sz w:val="21"/>
-          <w:szCs w:val="21"/>
-        </w:rPr>
-        <w:t xml:space="preserve">Como a assinatura eletrônica simples já é juridicamente válida para termos de consentimento e contratos odontológicos, e a implementação atual já é mais robusta que a média do mercado (impressão digital do documento + carimbo de tempo + trilha de auditoria + confirmação de identidade e presencial), não há hoje uma necessidade real que justifique assumir o custo recorrente e a dependência de uma plataforma externa — por isso a solução própria foi mantida.</w:t>
+        <w:t xml:space="preserve">Benefícios de adotar uma plataforma externa: responsabilidade jurídica com especialista testado em juízo; identidade forte (biometria, gov.br) pronta; caminho aberto para assinatura qualificada ICP-Brasil; manutenção técnica a cargo do fornecedor.</w:t>
+      </w:r>
+    </w:p>
+    <w:p>
+      <w:pPr>
+        <w:spacing w:after="160" w:line="300"/>
+      </w:pPr>
+      <w:r>
+        <w:rPr>
+          <w:sz w:val="21"/>
+          <w:szCs w:val="21"/>
+        </w:rPr>
+        <w:t xml:space="preserve">Contrapartidas: mensalidade ou custo por documento onde hoje o custo marginal é zero; dependência de um fornecedor externo (com custo de migração); dados sensíveis de pacientes trafegando por terceiro (novo contrato LGPD); retrabalho de integração (QR Code, totem, WhatsApp, Dental Office); perda de controle sobre a experiência de assinatura.</w:t>
+      </w:r>
+    </w:p>
+    <w:p>
+      <w:pPr>
+        <w:spacing w:after="160" w:line="300"/>
+      </w:pPr>
+      <w:r>
+        <w:rPr>
+          <w:sz w:val="21"/>
+          <w:szCs w:val="21"/>
+        </w:rPr>
+        <w:t xml:space="preserve">Como a assinatura simples já é juridicamente válida para este uso, e a implementação atual já é mais robusta que a média do mercado, não há hoje necessidade real que justifique o custo e a dependência de uma plataforma externa — por isso a solução própria foi mantida.</w:t>
       </w:r>
     </w:p>
     <w:p>
@@ -2692,7 +2628,7 @@
           <w:sz w:val="21"/>
           <w:szCs w:val="21"/>
         </w:rPr>
-        <w:t xml:space="preserve">Caso surja uma necessidade real — por exemplo, a exigência de assinatura qualificada ICP-Brasil para algum tipo de documento —, o modelo recomendado é o de integração via API (pague-por-uso), que se encaixa no fluxo já existente: o Painel continua orquestrando o atendimento, e a plataforma escolhida entra só para assinar/carimbar o documento. Dentro desse cenário:</w:t>
+        <w:t xml:space="preserve">Se surgir necessidade real (ex.: assinatura qualificada ICP-Brasil), o modelo recomendado é integração via API (pague-por-uso), mantendo o Painel no controle do atendimento:</w:t>
       </w:r>
     </w:p>
     <w:p>
@@ -2718,7 +2654,7 @@
           <w:sz w:val="21"/>
           <w:szCs w:val="21"/>
         </w:rPr>
-        <w:t xml:space="preserve"> — primeira opção a testar: melhor custo por documento via API, ambiente de testes gratuito, com biometria e certificado ICP-Brasil disponíveis quando necessário.</w:t>
+        <w:t xml:space="preserve"> — primeira opção: melhor custo por documento via API, testes gratuitos, biometria e ICP-Brasil disponíveis.</w:t>
       </w:r>
     </w:p>
     <w:p>
@@ -2744,7 +2680,7 @@
           <w:sz w:val="21"/>
           <w:szCs w:val="21"/>
         </w:rPr>
-        <w:t xml:space="preserve"> — alternativa se a preferência for preço fixo com documentos ilimitados e uma API mais rica.</w:t>
+        <w:t xml:space="preserve"> — se a preferência for preço fixo com documentos ilimitados.</w:t>
       </w:r>
     </w:p>
     <w:p>
@@ -2770,7 +2706,7 @@
           <w:sz w:val="21"/>
           <w:szCs w:val="21"/>
         </w:rPr>
-        <w:t xml:space="preserve"> — alternativa se o foco for o menor custo possível e o envio prioritário pelo WhatsApp.</w:t>
+        <w:t xml:space="preserve"> — se o foco for o menor custo e o envio prioritário pelo WhatsApp.</w:t>
       </w:r>
     </w:p>
     <w:p>
@@ -2796,7 +2732,7 @@
           <w:sz w:val="21"/>
           <w:szCs w:val="21"/>
         </w:rPr>
-        <w:t xml:space="preserve"> — apenas se for necessária assinatura qualificada ICP-Brasil em escala corporativa, ou integração com um ERP TOTVS já em uso.</w:t>
+        <w:t xml:space="preserve"> — só se exigir ICP-Brasil corporativa ou integração com ERP TOTVS já em uso.</w:t>
       </w:r>
     </w:p>
     <w:p>

</xml_diff>

<commit_message>
Remove comparação com plataformas do mercado e recomendação de qual adotar
Como a ABO Goiás não utiliza nenhuma dessas plataformas, retira a
tabela de comparação (3.4) e a seção de recomendação (3.6). A seção
"Por que a solução atual não usa uma plataforma de terceiros" é
mantida e renumerada para 3.4, com a argumentação de benefícios e
contrapartidas preservada.
</commit_message>
<xml_diff>
--- a/docs/Ferramentas-Painel-ABO-Goias.docx
+++ b/docs/Ferramentas-Painel-ABO-Goias.docx
@@ -1024,7 +1024,7 @@
           <w:sz w:val="21"/>
           <w:szCs w:val="21"/>
         </w:rPr>
-        <w:t xml:space="preserve">Esse custo é fixo, não por documento: gerar e assinar mais contratos no mês — um só ou várias centenas — não aumenta a fatura da hospedagem nem a do WhatsApp. Diferente da maioria das plataformas de assinatura do mercado (seção 3.4), que cobram por envelope ou por documento, aqui a assinatura digital em si (geração do PDF, hash, carimbo de tempo) não tem nenhum custo associado ao volume de contratos gerados.</w:t>
+        <w:t xml:space="preserve">Esse custo é fixo, não por documento: gerar e assinar mais contratos no mês — um só ou várias centenas — não aumenta a fatura da hospedagem nem a do WhatsApp. Diferente da maioria das plataformas de assinatura do mercado, que cobram por envelope ou por documento, aqui a assinatura digital em si (geração do PDF, hash, carimbo de tempo) não tem nenhum custo associado ao volume de contratos gerados.</w:t>
       </w:r>
     </w:p>
     <w:p>
@@ -1842,729 +1842,7 @@
           <w:sz w:val="25"/>
           <w:szCs w:val="25"/>
         </w:rPr>
-        <w:t xml:space="preserve">3.4. Comparação com plataformas do mercado</w:t>
-      </w:r>
-    </w:p>
-    <w:p>
-      <w:pPr>
-        <w:spacing w:after="160" w:line="300"/>
-      </w:pPr>
-      <w:r>
-        <w:rPr>
-          <w:sz w:val="21"/>
-          <w:szCs w:val="21"/>
-        </w:rPr>
-        <w:t xml:space="preserve">Sete das principais plataformas brasileiras de assinatura eletrônica (preços de referência, julho de 2026):</w:t>
-      </w:r>
-    </w:p>
-    <w:tbl>
-      <w:tblPr>
-        <w:tblW w:type="dxa" w:w="9400"/>
-        <w:tblBorders>
-          <w:top w:val="single" w:color="D9E2EC" w:sz="4"/>
-          <w:left w:val="single" w:color="D9E2EC" w:sz="4"/>
-          <w:bottom w:val="single" w:color="D9E2EC" w:sz="4"/>
-          <w:right w:val="single" w:color="D9E2EC" w:sz="4"/>
-          <w:insideH w:val="single" w:color="D9E2EC" w:sz="4"/>
-          <w:insideV w:val="single" w:color="D9E2EC" w:sz="4"/>
-        </w:tblBorders>
-      </w:tblPr>
-      <w:tblGrid>
-        <w:gridCol w:w="2200"/>
-        <w:gridCol w:w="2100"/>
-        <w:gridCol w:w="2200"/>
-        <w:gridCol w:w="2900"/>
-      </w:tblGrid>
-      <w:tr>
-        <w:trPr>
-          <w:tblHeader/>
-        </w:trPr>
-        <w:tc>
-          <w:tcPr>
-            <w:tcW w:type="dxa" w:w="2200"/>
-            <w:shd w:fill="0B2A57" w:val="clear"/>
-            <w:tcMar>
-              <w:top w:type="dxa" w:w="80"/>
-              <w:left w:type="dxa" w:w="100"/>
-              <w:bottom w:type="dxa" w:w="80"/>
-              <w:right w:type="dxa" w:w="100"/>
-            </w:tcMar>
-          </w:tcPr>
-          <w:p>
-            <w:r>
-              <w:rPr>
-                <w:b/>
-                <w:bCs/>
-                <w:color w:val="FFFFFF"/>
-                <w:sz w:val="19"/>
-                <w:szCs w:val="19"/>
-              </w:rPr>
-              <w:t xml:space="preserve">Plataforma</w:t>
-            </w:r>
-          </w:p>
-        </w:tc>
-        <w:tc>
-          <w:tcPr>
-            <w:tcW w:type="dxa" w:w="2100"/>
-            <w:shd w:fill="0B2A57" w:val="clear"/>
-            <w:tcMar>
-              <w:top w:type="dxa" w:w="80"/>
-              <w:left w:type="dxa" w:w="100"/>
-              <w:bottom w:type="dxa" w:w="80"/>
-              <w:right w:type="dxa" w:w="100"/>
-            </w:tcMar>
-          </w:tcPr>
-          <w:p>
-            <w:r>
-              <w:rPr>
-                <w:b/>
-                <w:bCs/>
-                <w:color w:val="FFFFFF"/>
-                <w:sz w:val="19"/>
-                <w:szCs w:val="19"/>
-              </w:rPr>
-              <w:t xml:space="preserve">Entrada (R$/mês)</w:t>
-            </w:r>
-          </w:p>
-        </w:tc>
-        <w:tc>
-          <w:tcPr>
-            <w:tcW w:type="dxa" w:w="2200"/>
-            <w:shd w:fill="0B2A57" w:val="clear"/>
-            <w:tcMar>
-              <w:top w:type="dxa" w:w="80"/>
-              <w:left w:type="dxa" w:w="100"/>
-              <w:bottom w:type="dxa" w:w="80"/>
-              <w:right w:type="dxa" w:w="100"/>
-            </w:tcMar>
-          </w:tcPr>
-          <w:p>
-            <w:r>
-              <w:rPr>
-                <w:b/>
-                <w:bCs/>
-                <w:color w:val="FFFFFF"/>
-                <w:sz w:val="19"/>
-                <w:szCs w:val="19"/>
-              </w:rPr>
-              <w:t xml:space="preserve">Modelo</w:t>
-            </w:r>
-          </w:p>
-        </w:tc>
-        <w:tc>
-          <w:tcPr>
-            <w:tcW w:type="dxa" w:w="2900"/>
-            <w:shd w:fill="0B2A57" w:val="clear"/>
-            <w:tcMar>
-              <w:top w:type="dxa" w:w="80"/>
-              <w:left w:type="dxa" w:w="100"/>
-              <w:bottom w:type="dxa" w:w="80"/>
-              <w:right w:type="dxa" w:w="100"/>
-            </w:tcMar>
-          </w:tcPr>
-          <w:p>
-            <w:r>
-              <w:rPr>
-                <w:b/>
-                <w:bCs/>
-                <w:color w:val="FFFFFF"/>
-                <w:sz w:val="19"/>
-                <w:szCs w:val="19"/>
-              </w:rPr>
-              <w:t xml:space="preserve">Destaque</w:t>
-            </w:r>
-          </w:p>
-        </w:tc>
-      </w:tr>
-      <w:tr>
-        <w:tc>
-          <w:tcPr>
-            <w:tcW w:type="dxa" w:w="2200"/>
-            <w:tcMar>
-              <w:top w:type="dxa" w:w="80"/>
-              <w:left w:type="dxa" w:w="100"/>
-              <w:bottom w:type="dxa" w:w="80"/>
-              <w:right w:type="dxa" w:w="100"/>
-            </w:tcMar>
-          </w:tcPr>
-          <w:p>
-            <w:r>
-              <w:rPr>
-                <w:sz w:val="19"/>
-                <w:szCs w:val="19"/>
-              </w:rPr>
-              <w:t xml:space="preserve">Autentique</w:t>
-            </w:r>
-          </w:p>
-        </w:tc>
-        <w:tc>
-          <w:tcPr>
-            <w:tcW w:type="dxa" w:w="2100"/>
-            <w:tcMar>
-              <w:top w:type="dxa" w:w="80"/>
-              <w:left w:type="dxa" w:w="100"/>
-              <w:bottom w:type="dxa" w:w="80"/>
-              <w:right w:type="dxa" w:w="100"/>
-            </w:tcMar>
-          </w:tcPr>
-          <w:p>
-            <w:r>
-              <w:rPr>
-                <w:sz w:val="19"/>
-                <w:szCs w:val="19"/>
-              </w:rPr>
-              <w:t xml:space="preserve">Grátis / 99 · API por doc.</w:t>
-            </w:r>
-          </w:p>
-        </w:tc>
-        <w:tc>
-          <w:tcPr>
-            <w:tcW w:type="dxa" w:w="2200"/>
-            <w:tcMar>
-              <w:top w:type="dxa" w:w="80"/>
-              <w:left w:type="dxa" w:w="100"/>
-              <w:bottom w:type="dxa" w:w="80"/>
-              <w:right w:type="dxa" w:w="100"/>
-            </w:tcMar>
-          </w:tcPr>
-          <w:p>
-            <w:r>
-              <w:rPr>
-                <w:sz w:val="19"/>
-                <w:szCs w:val="19"/>
-              </w:rPr>
-              <w:t xml:space="preserve">Assinatura ou pague-por-uso</w:t>
-            </w:r>
-          </w:p>
-        </w:tc>
-        <w:tc>
-          <w:tcPr>
-            <w:tcW w:type="dxa" w:w="2900"/>
-            <w:tcMar>
-              <w:top w:type="dxa" w:w="80"/>
-              <w:left w:type="dxa" w:w="100"/>
-              <w:bottom w:type="dxa" w:w="80"/>
-              <w:right w:type="dxa" w:w="100"/>
-            </w:tcMar>
-          </w:tcPr>
-          <w:p>
-            <w:r>
-              <w:rPr>
-                <w:sz w:val="19"/>
-                <w:szCs w:val="19"/>
-              </w:rPr>
-              <w:t xml:space="preserve">Melhor para embutir via API</w:t>
-            </w:r>
-          </w:p>
-        </w:tc>
-      </w:tr>
-      <w:tr>
-        <w:tc>
-          <w:tcPr>
-            <w:tcW w:type="dxa" w:w="2200"/>
-            <w:tcMar>
-              <w:top w:type="dxa" w:w="80"/>
-              <w:left w:type="dxa" w:w="100"/>
-              <w:bottom w:type="dxa" w:w="80"/>
-              <w:right w:type="dxa" w:w="100"/>
-            </w:tcMar>
-          </w:tcPr>
-          <w:p>
-            <w:r>
-              <w:rPr>
-                <w:sz w:val="19"/>
-                <w:szCs w:val="19"/>
-              </w:rPr>
-              <w:t xml:space="preserve">ZapSign</w:t>
-            </w:r>
-          </w:p>
-        </w:tc>
-        <w:tc>
-          <w:tcPr>
-            <w:tcW w:type="dxa" w:w="2100"/>
-            <w:tcMar>
-              <w:top w:type="dxa" w:w="80"/>
-              <w:left w:type="dxa" w:w="100"/>
-              <w:bottom w:type="dxa" w:w="80"/>
-              <w:right w:type="dxa" w:w="100"/>
-            </w:tcMar>
-          </w:tcPr>
-          <w:p>
-            <w:r>
-              <w:rPr>
-                <w:sz w:val="19"/>
-                <w:szCs w:val="19"/>
-              </w:rPr>
-              <w:t xml:space="preserve">Grátis / 29,90</w:t>
-            </w:r>
-          </w:p>
-        </w:tc>
-        <w:tc>
-          <w:tcPr>
-            <w:tcW w:type="dxa" w:w="2200"/>
-            <w:tcMar>
-              <w:top w:type="dxa" w:w="80"/>
-              <w:left w:type="dxa" w:w="100"/>
-              <w:bottom w:type="dxa" w:w="80"/>
-              <w:right w:type="dxa" w:w="100"/>
-            </w:tcMar>
-          </w:tcPr>
-          <w:p>
-            <w:r>
-              <w:rPr>
-                <w:sz w:val="19"/>
-                <w:szCs w:val="19"/>
-              </w:rPr>
-              <w:t xml:space="preserve">Assinatura + créditos</w:t>
-            </w:r>
-          </w:p>
-        </w:tc>
-        <w:tc>
-          <w:tcPr>
-            <w:tcW w:type="dxa" w:w="2900"/>
-            <w:tcMar>
-              <w:top w:type="dxa" w:w="80"/>
-              <w:left w:type="dxa" w:w="100"/>
-              <w:bottom w:type="dxa" w:w="80"/>
-              <w:right w:type="dxa" w:w="100"/>
-            </w:tcMar>
-          </w:tcPr>
-          <w:p>
-            <w:r>
-              <w:rPr>
-                <w:sz w:val="19"/>
-                <w:szCs w:val="19"/>
-              </w:rPr>
-              <w:t xml:space="preserve">Custo-benefício, WhatsApp</w:t>
-            </w:r>
-          </w:p>
-        </w:tc>
-      </w:tr>
-      <w:tr>
-        <w:tc>
-          <w:tcPr>
-            <w:tcW w:type="dxa" w:w="2200"/>
-            <w:tcMar>
-              <w:top w:type="dxa" w:w="80"/>
-              <w:left w:type="dxa" w:w="100"/>
-              <w:bottom w:type="dxa" w:w="80"/>
-              <w:right w:type="dxa" w:w="100"/>
-            </w:tcMar>
-          </w:tcPr>
-          <w:p>
-            <w:r>
-              <w:rPr>
-                <w:sz w:val="19"/>
-                <w:szCs w:val="19"/>
-              </w:rPr>
-              <w:t xml:space="preserve">ClickSign</w:t>
-            </w:r>
-          </w:p>
-        </w:tc>
-        <w:tc>
-          <w:tcPr>
-            <w:tcW w:type="dxa" w:w="2100"/>
-            <w:tcMar>
-              <w:top w:type="dxa" w:w="80"/>
-              <w:left w:type="dxa" w:w="100"/>
-              <w:bottom w:type="dxa" w:w="80"/>
-              <w:right w:type="dxa" w:w="100"/>
-            </w:tcMar>
-          </w:tcPr>
-          <w:p>
-            <w:r>
-              <w:rPr>
-                <w:sz w:val="19"/>
-                <w:szCs w:val="19"/>
-              </w:rPr>
-              <w:t xml:space="preserve">39</w:t>
-            </w:r>
-          </w:p>
-        </w:tc>
-        <w:tc>
-          <w:tcPr>
-            <w:tcW w:type="dxa" w:w="2200"/>
-            <w:tcMar>
-              <w:top w:type="dxa" w:w="80"/>
-              <w:left w:type="dxa" w:w="100"/>
-              <w:bottom w:type="dxa" w:w="80"/>
-              <w:right w:type="dxa" w:w="100"/>
-            </w:tcMar>
-          </w:tcPr>
-          <w:p>
-            <w:r>
-              <w:rPr>
-                <w:sz w:val="19"/>
-                <w:szCs w:val="19"/>
-              </w:rPr>
-              <w:t xml:space="preserve">Assinatura</w:t>
-            </w:r>
-          </w:p>
-        </w:tc>
-        <w:tc>
-          <w:tcPr>
-            <w:tcW w:type="dxa" w:w="2900"/>
-            <w:tcMar>
-              <w:top w:type="dxa" w:w="80"/>
-              <w:left w:type="dxa" w:w="100"/>
-              <w:bottom w:type="dxa" w:w="80"/>
-              <w:right w:type="dxa" w:w="100"/>
-            </w:tcMar>
-          </w:tcPr>
-          <w:p>
-            <w:r>
-              <w:rPr>
-                <w:sz w:val="19"/>
-                <w:szCs w:val="19"/>
-              </w:rPr>
-              <w:t xml:space="preserve">Certificações ISO, foco corporativo</w:t>
-            </w:r>
-          </w:p>
-        </w:tc>
-      </w:tr>
-      <w:tr>
-        <w:tc>
-          <w:tcPr>
-            <w:tcW w:type="dxa" w:w="2200"/>
-            <w:tcMar>
-              <w:top w:type="dxa" w:w="80"/>
-              <w:left w:type="dxa" w:w="100"/>
-              <w:bottom w:type="dxa" w:w="80"/>
-              <w:right w:type="dxa" w:w="100"/>
-            </w:tcMar>
-          </w:tcPr>
-          <w:p>
-            <w:r>
-              <w:rPr>
-                <w:sz w:val="19"/>
-                <w:szCs w:val="19"/>
-              </w:rPr>
-              <w:t xml:space="preserve">Assinadoc</w:t>
-            </w:r>
-          </w:p>
-        </w:tc>
-        <w:tc>
-          <w:tcPr>
-            <w:tcW w:type="dxa" w:w="2100"/>
-            <w:tcMar>
-              <w:top w:type="dxa" w:w="80"/>
-              <w:left w:type="dxa" w:w="100"/>
-              <w:bottom w:type="dxa" w:w="80"/>
-              <w:right w:type="dxa" w:w="100"/>
-            </w:tcMar>
-          </w:tcPr>
-          <w:p>
-            <w:r>
-              <w:rPr>
-                <w:sz w:val="19"/>
-                <w:szCs w:val="19"/>
-              </w:rPr>
-              <w:t xml:space="preserve">35</w:t>
-            </w:r>
-          </w:p>
-        </w:tc>
-        <w:tc>
-          <w:tcPr>
-            <w:tcW w:type="dxa" w:w="2200"/>
-            <w:tcMar>
-              <w:top w:type="dxa" w:w="80"/>
-              <w:left w:type="dxa" w:w="100"/>
-              <w:bottom w:type="dxa" w:w="80"/>
-              <w:right w:type="dxa" w:w="100"/>
-            </w:tcMar>
-          </w:tcPr>
-          <w:p>
-            <w:r>
-              <w:rPr>
-                <w:sz w:val="19"/>
-                <w:szCs w:val="19"/>
-              </w:rPr>
-              <w:t xml:space="preserve">Ilimitado, preço fixo</w:t>
-            </w:r>
-          </w:p>
-        </w:tc>
-        <w:tc>
-          <w:tcPr>
-            <w:tcW w:type="dxa" w:w="2900"/>
-            <w:tcMar>
-              <w:top w:type="dxa" w:w="80"/>
-              <w:left w:type="dxa" w:w="100"/>
-              <w:bottom w:type="dxa" w:w="80"/>
-              <w:right w:type="dxa" w:w="100"/>
-            </w:tcMar>
-          </w:tcPr>
-          <w:p>
-            <w:r>
-              <w:rPr>
-                <w:sz w:val="19"/>
-                <w:szCs w:val="19"/>
-              </w:rPr>
-              <w:t xml:space="preserve">API rica, 30+ endpoints</w:t>
-            </w:r>
-          </w:p>
-        </w:tc>
-      </w:tr>
-      <w:tr>
-        <w:tc>
-          <w:tcPr>
-            <w:tcW w:type="dxa" w:w="2200"/>
-            <w:tcMar>
-              <w:top w:type="dxa" w:w="80"/>
-              <w:left w:type="dxa" w:w="100"/>
-              <w:bottom w:type="dxa" w:w="80"/>
-              <w:right w:type="dxa" w:w="100"/>
-            </w:tcMar>
-          </w:tcPr>
-          <w:p>
-            <w:r>
-              <w:rPr>
-                <w:sz w:val="19"/>
-                <w:szCs w:val="19"/>
-              </w:rPr>
-              <w:t xml:space="preserve">SuperSign</w:t>
-            </w:r>
-          </w:p>
-        </w:tc>
-        <w:tc>
-          <w:tcPr>
-            <w:tcW w:type="dxa" w:w="2100"/>
-            <w:tcMar>
-              <w:top w:type="dxa" w:w="80"/>
-              <w:left w:type="dxa" w:w="100"/>
-              <w:bottom w:type="dxa" w:w="80"/>
-              <w:right w:type="dxa" w:w="100"/>
-            </w:tcMar>
-          </w:tcPr>
-          <w:p>
-            <w:r>
-              <w:rPr>
-                <w:sz w:val="19"/>
-                <w:szCs w:val="19"/>
-              </w:rPr>
-              <w:t xml:space="preserve">Grátis / 38,90</w:t>
-            </w:r>
-          </w:p>
-        </w:tc>
-        <w:tc>
-          <w:tcPr>
-            <w:tcW w:type="dxa" w:w="2200"/>
-            <w:tcMar>
-              <w:top w:type="dxa" w:w="80"/>
-              <w:left w:type="dxa" w:w="100"/>
-              <w:bottom w:type="dxa" w:w="80"/>
-              <w:right w:type="dxa" w:w="100"/>
-            </w:tcMar>
-          </w:tcPr>
-          <w:p>
-            <w:r>
-              <w:rPr>
-                <w:sz w:val="19"/>
-                <w:szCs w:val="19"/>
-              </w:rPr>
-              <w:t xml:space="preserve">Assinatura ou pré-pago</w:t>
-            </w:r>
-          </w:p>
-        </w:tc>
-        <w:tc>
-          <w:tcPr>
-            <w:tcW w:type="dxa" w:w="2900"/>
-            <w:tcMar>
-              <w:top w:type="dxa" w:w="80"/>
-              <w:left w:type="dxa" w:w="100"/>
-              <w:bottom w:type="dxa" w:w="80"/>
-              <w:right w:type="dxa" w:w="100"/>
-            </w:tcMar>
-          </w:tcPr>
-          <w:p>
-            <w:r>
-              <w:rPr>
-                <w:sz w:val="19"/>
-                <w:szCs w:val="19"/>
-              </w:rPr>
-              <w:t xml:space="preserve">Selfie + documento, flexível</w:t>
-            </w:r>
-          </w:p>
-        </w:tc>
-      </w:tr>
-      <w:tr>
-        <w:tc>
-          <w:tcPr>
-            <w:tcW w:type="dxa" w:w="2200"/>
-            <w:tcMar>
-              <w:top w:type="dxa" w:w="80"/>
-              <w:left w:type="dxa" w:w="100"/>
-              <w:bottom w:type="dxa" w:w="80"/>
-              <w:right w:type="dxa" w:w="100"/>
-            </w:tcMar>
-          </w:tcPr>
-          <w:p>
-            <w:r>
-              <w:rPr>
-                <w:sz w:val="19"/>
-                <w:szCs w:val="19"/>
-              </w:rPr>
-              <w:t xml:space="preserve">ContraktorSign</w:t>
-            </w:r>
-          </w:p>
-        </w:tc>
-        <w:tc>
-          <w:tcPr>
-            <w:tcW w:type="dxa" w:w="2100"/>
-            <w:tcMar>
-              <w:top w:type="dxa" w:w="80"/>
-              <w:left w:type="dxa" w:w="100"/>
-              <w:bottom w:type="dxa" w:w="80"/>
-              <w:right w:type="dxa" w:w="100"/>
-            </w:tcMar>
-          </w:tcPr>
-          <w:p>
-            <w:r>
-              <w:rPr>
-                <w:sz w:val="19"/>
-                <w:szCs w:val="19"/>
-              </w:rPr>
-              <w:t xml:space="preserve">Grátis / 19,90</w:t>
-            </w:r>
-          </w:p>
-        </w:tc>
-        <w:tc>
-          <w:tcPr>
-            <w:tcW w:type="dxa" w:w="2200"/>
-            <w:tcMar>
-              <w:top w:type="dxa" w:w="80"/>
-              <w:left w:type="dxa" w:w="100"/>
-              <w:bottom w:type="dxa" w:w="80"/>
-              <w:right w:type="dxa" w:w="100"/>
-            </w:tcMar>
-          </w:tcPr>
-          <w:p>
-            <w:r>
-              <w:rPr>
-                <w:sz w:val="19"/>
-                <w:szCs w:val="19"/>
-              </w:rPr>
-              <w:t xml:space="preserve">Assinatura</w:t>
-            </w:r>
-          </w:p>
-        </w:tc>
-        <w:tc>
-          <w:tcPr>
-            <w:tcW w:type="dxa" w:w="2900"/>
-            <w:tcMar>
-              <w:top w:type="dxa" w:w="80"/>
-              <w:left w:type="dxa" w:w="100"/>
-              <w:bottom w:type="dxa" w:w="80"/>
-              <w:right w:type="dxa" w:w="100"/>
-            </w:tcMar>
-          </w:tcPr>
-          <w:p>
-            <w:r>
-              <w:rPr>
-                <w:sz w:val="19"/>
-                <w:szCs w:val="19"/>
-              </w:rPr>
-              <w:t xml:space="preserve">Gestão do ciclo de vida do contrato</w:t>
-            </w:r>
-          </w:p>
-        </w:tc>
-      </w:tr>
-      <w:tr>
-        <w:tc>
-          <w:tcPr>
-            <w:tcW w:type="dxa" w:w="2200"/>
-            <w:tcMar>
-              <w:top w:type="dxa" w:w="80"/>
-              <w:left w:type="dxa" w:w="100"/>
-              <w:bottom w:type="dxa" w:w="80"/>
-              <w:right w:type="dxa" w:w="100"/>
-            </w:tcMar>
-          </w:tcPr>
-          <w:p>
-            <w:r>
-              <w:rPr>
-                <w:sz w:val="19"/>
-                <w:szCs w:val="19"/>
-              </w:rPr>
-              <w:t xml:space="preserve">TOTVS</w:t>
-            </w:r>
-          </w:p>
-        </w:tc>
-        <w:tc>
-          <w:tcPr>
-            <w:tcW w:type="dxa" w:w="2100"/>
-            <w:tcMar>
-              <w:top w:type="dxa" w:w="80"/>
-              <w:left w:type="dxa" w:w="100"/>
-              <w:bottom w:type="dxa" w:w="80"/>
-              <w:right w:type="dxa" w:w="100"/>
-            </w:tcMar>
-          </w:tcPr>
-          <w:p>
-            <w:r>
-              <w:rPr>
-                <w:sz w:val="19"/>
-                <w:szCs w:val="19"/>
-              </w:rPr>
-              <w:t xml:space="preserve">78,84</w:t>
-            </w:r>
-          </w:p>
-        </w:tc>
-        <w:tc>
-          <w:tcPr>
-            <w:tcW w:type="dxa" w:w="2200"/>
-            <w:tcMar>
-              <w:top w:type="dxa" w:w="80"/>
-              <w:left w:type="dxa" w:w="100"/>
-              <w:bottom w:type="dxa" w:w="80"/>
-              <w:right w:type="dxa" w:w="100"/>
-            </w:tcMar>
-          </w:tcPr>
-          <w:p>
-            <w:r>
-              <w:rPr>
-                <w:sz w:val="19"/>
-                <w:szCs w:val="19"/>
-              </w:rPr>
-              <w:t xml:space="preserve">Por pacote de envelopes</w:t>
-            </w:r>
-          </w:p>
-        </w:tc>
-        <w:tc>
-          <w:tcPr>
-            <w:tcW w:type="dxa" w:w="2900"/>
-            <w:tcMar>
-              <w:top w:type="dxa" w:w="80"/>
-              <w:left w:type="dxa" w:w="100"/>
-              <w:bottom w:type="dxa" w:w="80"/>
-              <w:right w:type="dxa" w:w="100"/>
-            </w:tcMar>
-          </w:tcPr>
-          <w:p>
-            <w:r>
-              <w:rPr>
-                <w:sz w:val="19"/>
-                <w:szCs w:val="19"/>
-              </w:rPr>
-              <w:t xml:space="preserve">ICP-Brasil qualificada + ERP TOTVS</w:t>
-            </w:r>
-          </w:p>
-        </w:tc>
-      </w:tr>
-    </w:tbl>
-    <w:p>
-      <w:pPr>
-        <w:pStyle w:val="Heading2"/>
-        <w:spacing w:after="120" w:before="260"/>
-      </w:pPr>
-      <w:r>
-        <w:rPr>
-          <w:b/>
-          <w:bCs/>
-          <w:color w:val="0B2A57"/>
-          <w:sz w:val="25"/>
-          <w:szCs w:val="25"/>
-        </w:rPr>
-        <w:t xml:space="preserve">3.5. Por que a solução atual não usa uma dessas plataformas</w:t>
+        <w:t xml:space="preserve">3.4. Por que a solução atual não usa uma plataforma de terceiros</w:t>
       </w:r>
     </w:p>
     <w:p>
@@ -2601,138 +1879,6 @@
           <w:szCs w:val="21"/>
         </w:rPr>
         <w:t xml:space="preserve">Como a assinatura simples já é juridicamente válida para este uso, e a implementação atual já é mais robusta que a média do mercado, não há hoje necessidade real que justifique o custo e a dependência de uma plataforma externa — por isso a solução própria foi mantida.</w:t>
-      </w:r>
-    </w:p>
-    <w:p>
-      <w:pPr>
-        <w:pStyle w:val="Heading2"/>
-        <w:spacing w:after="120" w:before="260"/>
-      </w:pPr>
-      <w:r>
-        <w:rPr>
-          <w:b/>
-          <w:bCs/>
-          <w:color w:val="0B2A57"/>
-          <w:sz w:val="25"/>
-          <w:szCs w:val="25"/>
-        </w:rPr>
-        <w:t xml:space="preserve">3.6. Recomendação: qual plataforma adotar, se um dia for necessário</w:t>
-      </w:r>
-    </w:p>
-    <w:p>
-      <w:pPr>
-        <w:spacing w:after="160" w:line="300"/>
-      </w:pPr>
-      <w:r>
-        <w:rPr>
-          <w:sz w:val="21"/>
-          <w:szCs w:val="21"/>
-        </w:rPr>
-        <w:t xml:space="preserve">Se surgir necessidade real (ex.: assinatura qualificada ICP-Brasil), o modelo recomendado é integração via API (pague-por-uso), mantendo o Painel no controle do atendimento:</w:t>
-      </w:r>
-    </w:p>
-    <w:p>
-      <w:pPr>
-        <w:pStyle w:val="ListParagraph"/>
-        <w:numPr>
-          <w:ilvl w:val="0"/>
-          <w:numId w:val="2"/>
-        </w:numPr>
-        <w:spacing w:after="80" w:line="290"/>
-      </w:pPr>
-      <w:r>
-        <w:rPr>
-          <w:b/>
-          <w:bCs/>
-          <w:sz w:val="21"/>
-          <w:szCs w:val="21"/>
-        </w:rPr>
-        <w:t xml:space="preserve">Autentique</w:t>
-      </w:r>
-      <w:r>
-        <w:rPr>
-          <w:sz w:val="21"/>
-          <w:szCs w:val="21"/>
-        </w:rPr>
-        <w:t xml:space="preserve"> — primeira opção: melhor custo por documento via API, testes gratuitos, biometria e ICP-Brasil disponíveis.</w:t>
-      </w:r>
-    </w:p>
-    <w:p>
-      <w:pPr>
-        <w:pStyle w:val="ListParagraph"/>
-        <w:numPr>
-          <w:ilvl w:val="0"/>
-          <w:numId w:val="2"/>
-        </w:numPr>
-        <w:spacing w:after="80" w:line="290"/>
-      </w:pPr>
-      <w:r>
-        <w:rPr>
-          <w:b/>
-          <w:bCs/>
-          <w:sz w:val="21"/>
-          <w:szCs w:val="21"/>
-        </w:rPr>
-        <w:t xml:space="preserve">Assinadoc</w:t>
-      </w:r>
-      <w:r>
-        <w:rPr>
-          <w:sz w:val="21"/>
-          <w:szCs w:val="21"/>
-        </w:rPr>
-        <w:t xml:space="preserve"> — se a preferência for preço fixo com documentos ilimitados.</w:t>
-      </w:r>
-    </w:p>
-    <w:p>
-      <w:pPr>
-        <w:pStyle w:val="ListParagraph"/>
-        <w:numPr>
-          <w:ilvl w:val="0"/>
-          <w:numId w:val="2"/>
-        </w:numPr>
-        <w:spacing w:after="80" w:line="290"/>
-      </w:pPr>
-      <w:r>
-        <w:rPr>
-          <w:b/>
-          <w:bCs/>
-          <w:sz w:val="21"/>
-          <w:szCs w:val="21"/>
-        </w:rPr>
-        <w:t xml:space="preserve">ZapSign</w:t>
-      </w:r>
-      <w:r>
-        <w:rPr>
-          <w:sz w:val="21"/>
-          <w:szCs w:val="21"/>
-        </w:rPr>
-        <w:t xml:space="preserve"> — se o foco for o menor custo e o envio prioritário pelo WhatsApp.</w:t>
-      </w:r>
-    </w:p>
-    <w:p>
-      <w:pPr>
-        <w:pStyle w:val="ListParagraph"/>
-        <w:numPr>
-          <w:ilvl w:val="0"/>
-          <w:numId w:val="2"/>
-        </w:numPr>
-        <w:spacing w:after="80" w:line="290"/>
-      </w:pPr>
-      <w:r>
-        <w:rPr>
-          <w:b/>
-          <w:bCs/>
-          <w:sz w:val="21"/>
-          <w:szCs w:val="21"/>
-        </w:rPr>
-        <w:t xml:space="preserve">TOTVS</w:t>
-      </w:r>
-      <w:r>
-        <w:rPr>
-          <w:sz w:val="21"/>
-          <w:szCs w:val="21"/>
-        </w:rPr>
-        <w:t xml:space="preserve"> — só se exigir ICP-Brasil corporativa ou integração com ERP TOTVS já em uso.</w:t>
       </w:r>
     </w:p>
     <w:p>

</xml_diff>